<commit_message>
feat: update project description for the phase 4
</commit_message>
<xml_diff>
--- a/4th_phase/Project-description-v1.0.docx
+++ b/4th_phase/Project-description-v1.0.docx
@@ -2052,14 +2052,7 @@
           <w:rFonts w:ascii="Calibri" w:hAnsi="Calibri" w:cs="Calibri"/>
           <w:lang w:val="el-GR"/>
         </w:rPr>
-        <w:t>ς</w:t>
-      </w:r>
-      <w:r>
-        <w:rPr>
-          <w:rFonts w:ascii="Calibri" w:hAnsi="Calibri" w:cs="Calibri"/>
-          <w:lang w:val="el-GR"/>
-        </w:rPr>
-        <w:t xml:space="preserve">. </w:t>
+        <w:t xml:space="preserve">ς. </w:t>
       </w:r>
       <w:r>
         <w:rPr>
@@ -2221,7 +2214,6 @@
         <w:rPr>
           <w:rFonts w:ascii="Calibri" w:hAnsi="Calibri" w:cs="Calibri"/>
           <w:noProof/>
-          <w:lang w:val="el-GR"/>
         </w:rPr>
         <w:t>1</w:t>
       </w:r>
@@ -2296,6 +2288,9 @@
         <w:jc w:val="center"/>
       </w:pPr>
       <w:r>
+        <w:rPr>
+          <w:noProof/>
+        </w:rPr>
         <w:lastRenderedPageBreak/>
         <w:drawing>
           <wp:inline distT="0" distB="0" distL="0" distR="0" wp14:anchorId="0D8AA7BB" wp14:editId="2D2BC0C0">
@@ -2406,7 +2401,6 @@
         <w:rPr>
           <w:rFonts w:ascii="Calibri" w:hAnsi="Calibri" w:cs="Calibri"/>
           <w:noProof/>
-          <w:lang w:val="el-GR"/>
         </w:rPr>
         <w:t>2</w:t>
       </w:r>
@@ -2757,7 +2751,7 @@
           <w:rFonts w:ascii="Calibri" w:hAnsi="Calibri" w:cs="Calibri"/>
           <w:lang w:val="el-GR"/>
         </w:rPr>
-        <w:t>Προγραμμαστιστής</w:t>
+        <w:t>Προγραμματιστής</w:t>
       </w:r>
       <w:r>
         <w:rPr>
@@ -2778,7 +2772,66 @@
           <w:rFonts w:ascii="Calibri" w:hAnsi="Calibri" w:cs="Calibri"/>
           <w:lang w:val="el-GR"/>
         </w:rPr>
-        <w:t>συμπληρώνει το όνομα του έργου και προαιρετικά μια σύντομη περιγραφή. Μετά τη δημιουργία, ο χρήστης μεταφέρεται στην οθόνη λεπτομερειών του έργου, όπου μπορεί να αρχίσει να προσθέτει περιεχόμενο.</w:t>
+        <w:t>συμπληρώνει το όνομα του έργου και προαιρετικά μια σύντομη περιγραφή. Μετά τη δημιουργία, ο χρήστης μεταφέρεται στην οθόνη λεπτομερειών του έργου</w:t>
+      </w:r>
+      <w:r>
+        <w:rPr>
+          <w:rFonts w:ascii="Calibri" w:hAnsi="Calibri" w:cs="Calibri"/>
+          <w:lang w:val="el-GR"/>
+        </w:rPr>
+        <w:t xml:space="preserve"> (</w:t>
+      </w:r>
+      <w:hyperlink w:anchor="_Project_Detail" w:history="1">
+        <w:r>
+          <w:rPr>
+            <w:rStyle w:val="Hyperlink"/>
+            <w:rFonts w:ascii="Calibri" w:hAnsi="Calibri" w:cs="Calibri"/>
+          </w:rPr>
+          <w:t>Proj</w:t>
+        </w:r>
+        <w:r>
+          <w:rPr>
+            <w:rStyle w:val="Hyperlink"/>
+            <w:rFonts w:ascii="Calibri" w:hAnsi="Calibri" w:cs="Calibri"/>
+          </w:rPr>
+          <w:t>e</w:t>
+        </w:r>
+        <w:r>
+          <w:rPr>
+            <w:rStyle w:val="Hyperlink"/>
+            <w:rFonts w:ascii="Calibri" w:hAnsi="Calibri" w:cs="Calibri"/>
+          </w:rPr>
+          <w:t>ct</w:t>
+        </w:r>
+        <w:r>
+          <w:rPr>
+            <w:rStyle w:val="Hyperlink"/>
+            <w:rFonts w:ascii="Calibri" w:hAnsi="Calibri" w:cs="Calibri"/>
+            <w:lang w:val="el-GR"/>
+          </w:rPr>
+          <w:t xml:space="preserve"> </w:t>
+        </w:r>
+        <w:r>
+          <w:rPr>
+            <w:rStyle w:val="Hyperlink"/>
+            <w:rFonts w:ascii="Calibri" w:hAnsi="Calibri" w:cs="Calibri"/>
+          </w:rPr>
+          <w:t>Detail</w:t>
+        </w:r>
+      </w:hyperlink>
+      <w:r>
+        <w:rPr>
+          <w:rFonts w:ascii="Calibri" w:hAnsi="Calibri" w:cs="Calibri"/>
+          <w:lang w:val="el-GR"/>
+        </w:rPr>
+        <w:t>)</w:t>
+      </w:r>
+      <w:r>
+        <w:rPr>
+          <w:rFonts w:ascii="Calibri" w:hAnsi="Calibri" w:cs="Calibri"/>
+          <w:lang w:val="el-GR"/>
+        </w:rPr>
+        <w:t>, όπου μπορεί να αρχίσει να προσθέτει περιεχόμενο.</w:t>
       </w:r>
     </w:p>
     <w:p>
@@ -2918,6 +2971,9 @@
         <w:jc w:val="center"/>
       </w:pPr>
       <w:r>
+        <w:rPr>
+          <w:noProof/>
+        </w:rPr>
         <w:lastRenderedPageBreak/>
         <w:drawing>
           <wp:inline distT="0" distB="0" distL="0" distR="0" wp14:anchorId="328F2F96" wp14:editId="0DDA73EA">
@@ -3091,6 +3147,7 @@
         <w:jc w:val="both"/>
         <w:rPr>
           <w:rFonts w:ascii="Calibri" w:hAnsi="Calibri" w:cs="Calibri"/>
+          <w:lang w:val="el-GR"/>
         </w:rPr>
       </w:pPr>
     </w:p>
@@ -3110,6 +3167,8 @@
           <w:lang w:val="el-GR"/>
         </w:rPr>
       </w:pPr>
+      <w:bookmarkStart w:id="1" w:name="_Project_Detail"/>
+      <w:bookmarkEnd w:id="1"/>
       <w:r>
         <w:rPr>
           <w:b/>
@@ -3124,14 +3183,454 @@
         <w:jc w:val="both"/>
         <w:rPr>
           <w:rFonts w:ascii="Calibri" w:hAnsi="Calibri" w:cs="Calibri"/>
-        </w:rPr>
-      </w:pPr>
-      <w:r>
-        <w:rPr>
-          <w:rFonts w:ascii="Calibri" w:hAnsi="Calibri" w:cs="Calibri"/>
-          <w:lang w:val="el-GR"/>
-        </w:rPr>
-        <w:t xml:space="preserve">Στην εικόνα 3 </w:t>
+          <w:lang w:val="el-GR"/>
+        </w:rPr>
+      </w:pPr>
+      <w:r>
+        <w:rPr>
+          <w:rFonts w:ascii="Calibri" w:hAnsi="Calibri" w:cs="Calibri"/>
+          <w:lang w:val="el-GR"/>
+        </w:rPr>
+        <w:t>Στ</w:t>
+      </w:r>
+      <w:r>
+        <w:rPr>
+          <w:rFonts w:ascii="Calibri" w:hAnsi="Calibri" w:cs="Calibri"/>
+          <w:lang w:val="el-GR"/>
+        </w:rPr>
+        <w:t>ις</w:t>
+      </w:r>
+      <w:r>
+        <w:rPr>
+          <w:rFonts w:ascii="Calibri" w:hAnsi="Calibri" w:cs="Calibri"/>
+          <w:lang w:val="el-GR"/>
+        </w:rPr>
+        <w:t xml:space="preserve"> εικόν</w:t>
+      </w:r>
+      <w:r>
+        <w:rPr>
+          <w:rFonts w:ascii="Calibri" w:hAnsi="Calibri" w:cs="Calibri"/>
+          <w:lang w:val="el-GR"/>
+        </w:rPr>
+        <w:t>ες</w:t>
+      </w:r>
+      <w:r>
+        <w:rPr>
+          <w:rFonts w:ascii="Calibri" w:hAnsi="Calibri" w:cs="Calibri"/>
+          <w:lang w:val="el-GR"/>
+        </w:rPr>
+        <w:t xml:space="preserve"> </w:t>
+      </w:r>
+      <w:r>
+        <w:rPr>
+          <w:rFonts w:ascii="Calibri" w:hAnsi="Calibri" w:cs="Calibri"/>
+          <w:lang w:val="el-GR"/>
+        </w:rPr>
+        <w:t>3</w:t>
+      </w:r>
+      <w:r>
+        <w:rPr>
+          <w:rFonts w:ascii="Calibri" w:hAnsi="Calibri" w:cs="Calibri"/>
+          <w:lang w:val="el-GR"/>
+        </w:rPr>
+        <w:t>.1</w:t>
+      </w:r>
+      <w:r>
+        <w:rPr>
+          <w:rFonts w:ascii="Calibri" w:hAnsi="Calibri" w:cs="Calibri"/>
+          <w:lang w:val="el-GR"/>
+        </w:rPr>
+        <w:t xml:space="preserve">, </w:t>
+      </w:r>
+      <w:r>
+        <w:rPr>
+          <w:rFonts w:ascii="Calibri" w:hAnsi="Calibri" w:cs="Calibri"/>
+          <w:lang w:val="el-GR"/>
+        </w:rPr>
+        <w:t>3</w:t>
+      </w:r>
+      <w:r>
+        <w:rPr>
+          <w:rFonts w:ascii="Calibri" w:hAnsi="Calibri" w:cs="Calibri"/>
+          <w:lang w:val="el-GR"/>
+        </w:rPr>
+        <w:t>.2</w:t>
+      </w:r>
+      <w:r>
+        <w:rPr>
+          <w:rFonts w:ascii="Calibri" w:hAnsi="Calibri" w:cs="Calibri"/>
+          <w:lang w:val="el-GR"/>
+        </w:rPr>
+        <w:t xml:space="preserve"> και 3.3</w:t>
+      </w:r>
+      <w:r>
+        <w:rPr>
+          <w:rFonts w:ascii="Calibri" w:hAnsi="Calibri" w:cs="Calibri"/>
+          <w:lang w:val="el-GR"/>
+        </w:rPr>
+        <w:t xml:space="preserve"> παρουσιάζουμε την αρχική και τ</w:t>
+      </w:r>
+      <w:r>
+        <w:rPr>
+          <w:rFonts w:ascii="Calibri" w:hAnsi="Calibri" w:cs="Calibri"/>
+          <w:lang w:val="el-GR"/>
+        </w:rPr>
+        <w:t>ις</w:t>
+      </w:r>
+      <w:r>
+        <w:rPr>
+          <w:rFonts w:ascii="Calibri" w:hAnsi="Calibri" w:cs="Calibri"/>
+          <w:lang w:val="el-GR"/>
+        </w:rPr>
+        <w:t xml:space="preserve"> τελικ</w:t>
+      </w:r>
+      <w:r>
+        <w:rPr>
+          <w:rFonts w:ascii="Calibri" w:hAnsi="Calibri" w:cs="Calibri"/>
+          <w:lang w:val="el-GR"/>
+        </w:rPr>
+        <w:t>ές</w:t>
+      </w:r>
+      <w:r>
+        <w:rPr>
+          <w:rFonts w:ascii="Calibri" w:hAnsi="Calibri" w:cs="Calibri"/>
+          <w:lang w:val="el-GR"/>
+        </w:rPr>
+        <w:t xml:space="preserve"> σχεδίασ</w:t>
+      </w:r>
+      <w:r>
+        <w:rPr>
+          <w:rFonts w:ascii="Calibri" w:hAnsi="Calibri" w:cs="Calibri"/>
+          <w:lang w:val="el-GR"/>
+        </w:rPr>
+        <w:t>εις</w:t>
+      </w:r>
+      <w:r>
+        <w:rPr>
+          <w:rFonts w:ascii="Calibri" w:hAnsi="Calibri" w:cs="Calibri"/>
+          <w:lang w:val="el-GR"/>
+        </w:rPr>
+        <w:t xml:space="preserve"> αντίστοιχα, της οθόνης</w:t>
+      </w:r>
+      <w:r>
+        <w:rPr>
+          <w:rFonts w:ascii="Calibri" w:hAnsi="Calibri" w:cs="Calibri"/>
+          <w:lang w:val="el-GR"/>
+        </w:rPr>
+        <w:t xml:space="preserve"> </w:t>
+      </w:r>
+      <w:r>
+        <w:rPr>
+          <w:rFonts w:ascii="Calibri" w:hAnsi="Calibri" w:cs="Calibri"/>
+        </w:rPr>
+        <w:t>Project</w:t>
+      </w:r>
+      <w:r>
+        <w:rPr>
+          <w:rFonts w:ascii="Calibri" w:hAnsi="Calibri" w:cs="Calibri"/>
+          <w:lang w:val="el-GR"/>
+        </w:rPr>
+        <w:t xml:space="preserve"> </w:t>
+      </w:r>
+      <w:r>
+        <w:rPr>
+          <w:rFonts w:ascii="Calibri" w:hAnsi="Calibri" w:cs="Calibri"/>
+        </w:rPr>
+        <w:t>Detail</w:t>
+      </w:r>
+      <w:r>
+        <w:rPr>
+          <w:rFonts w:ascii="Calibri" w:hAnsi="Calibri" w:cs="Calibri"/>
+          <w:lang w:val="el-GR"/>
+        </w:rPr>
+        <w:t>.</w:t>
+      </w:r>
+      <w:r>
+        <w:rPr>
+          <w:rFonts w:ascii="Calibri" w:hAnsi="Calibri" w:cs="Calibri"/>
+          <w:lang w:val="el-GR"/>
+        </w:rPr>
+        <w:t xml:space="preserve"> </w:t>
+      </w:r>
+      <w:r>
+        <w:rPr>
+          <w:rFonts w:ascii="Calibri" w:hAnsi="Calibri" w:cs="Calibri"/>
+          <w:lang w:val="el-GR"/>
+        </w:rPr>
+        <w:t xml:space="preserve">Η σελίδα αυτή είναι υπεύθυνη για </w:t>
+      </w:r>
+      <w:r>
+        <w:rPr>
+          <w:rFonts w:ascii="Calibri" w:hAnsi="Calibri" w:cs="Calibri"/>
+          <w:lang w:val="el-GR"/>
+        </w:rPr>
+        <w:t xml:space="preserve">την προβολή ενός </w:t>
+      </w:r>
+      <w:r>
+        <w:rPr>
+          <w:rFonts w:ascii="Calibri" w:hAnsi="Calibri" w:cs="Calibri"/>
+          <w:lang w:val="el-GR"/>
+        </w:rPr>
+        <w:t>συγκεκριμένου</w:t>
+      </w:r>
+      <w:r>
+        <w:rPr>
+          <w:rFonts w:ascii="Calibri" w:hAnsi="Calibri" w:cs="Calibri"/>
+          <w:lang w:val="el-GR"/>
+        </w:rPr>
+        <w:t xml:space="preserve"> </w:t>
+      </w:r>
+      <w:r>
+        <w:rPr>
+          <w:rFonts w:ascii="Calibri" w:hAnsi="Calibri" w:cs="Calibri"/>
+        </w:rPr>
+        <w:t>project</w:t>
+      </w:r>
+      <w:r>
+        <w:rPr>
+          <w:rFonts w:ascii="Calibri" w:hAnsi="Calibri" w:cs="Calibri"/>
+          <w:lang w:val="el-GR"/>
+        </w:rPr>
+        <w:t xml:space="preserve"> από τον χρήστη.</w:t>
+      </w:r>
+      <w:r>
+        <w:rPr>
+          <w:rFonts w:ascii="Calibri" w:hAnsi="Calibri" w:cs="Calibri"/>
+          <w:lang w:val="el-GR"/>
+        </w:rPr>
+        <w:t xml:space="preserve"> Συγκεκριμένα, ε</w:t>
+      </w:r>
+      <w:r>
+        <w:rPr>
+          <w:rFonts w:ascii="Calibri" w:hAnsi="Calibri" w:cs="Calibri"/>
+          <w:lang w:val="el-GR"/>
+        </w:rPr>
+        <w:t xml:space="preserve">μφανίζει το όνομα και την περιγραφή του, καθώς και το σύνολο των απαιτήσεων που έχουν καταγραφεί. </w:t>
+      </w:r>
+      <w:r>
+        <w:rPr>
+          <w:rFonts w:ascii="Calibri" w:hAnsi="Calibri" w:cs="Calibri"/>
+          <w:lang w:val="el-GR"/>
+        </w:rPr>
+        <w:t>Μόνο ο</w:t>
+      </w:r>
+      <w:r>
+        <w:rPr>
+          <w:rFonts w:ascii="Calibri" w:hAnsi="Calibri" w:cs="Calibri"/>
+          <w:lang w:val="el-GR"/>
+        </w:rPr>
+        <w:t xml:space="preserve"> </w:t>
+      </w:r>
+      <w:r>
+        <w:rPr>
+          <w:rFonts w:ascii="Calibri" w:hAnsi="Calibri" w:cs="Calibri"/>
+          <w:lang w:val="el-GR"/>
+        </w:rPr>
+        <w:t>Ιδιοκτήτης</w:t>
+      </w:r>
+      <w:r>
+        <w:rPr>
+          <w:rFonts w:ascii="Calibri" w:hAnsi="Calibri" w:cs="Calibri"/>
+          <w:lang w:val="el-GR"/>
+        </w:rPr>
+        <w:t xml:space="preserve"> </w:t>
+      </w:r>
+      <w:r>
+        <w:rPr>
+          <w:rFonts w:ascii="Calibri" w:hAnsi="Calibri" w:cs="Calibri"/>
+          <w:lang w:val="el-GR"/>
+        </w:rPr>
+        <w:t xml:space="preserve">Οργανισμού </w:t>
+      </w:r>
+      <w:r>
+        <w:rPr>
+          <w:rFonts w:ascii="Calibri" w:hAnsi="Calibri" w:cs="Calibri"/>
+          <w:lang w:val="el-GR"/>
+        </w:rPr>
+        <w:t xml:space="preserve">μπορεί να διαχειριστεί τους συμμετέχοντες </w:t>
+      </w:r>
+      <w:r>
+        <w:rPr>
+          <w:rFonts w:ascii="Calibri" w:hAnsi="Calibri" w:cs="Calibri"/>
+          <w:lang w:val="el-GR"/>
+        </w:rPr>
+        <w:t xml:space="preserve">του </w:t>
+      </w:r>
+      <w:r>
+        <w:rPr>
+          <w:rFonts w:ascii="Calibri" w:hAnsi="Calibri" w:cs="Calibri"/>
+        </w:rPr>
+        <w:t>project</w:t>
+      </w:r>
+      <w:r>
+        <w:rPr>
+          <w:rFonts w:ascii="Calibri" w:hAnsi="Calibri" w:cs="Calibri"/>
+          <w:lang w:val="el-GR"/>
+        </w:rPr>
+        <w:t xml:space="preserve"> </w:t>
+      </w:r>
+      <w:r>
+        <w:rPr>
+          <w:rFonts w:ascii="Calibri" w:hAnsi="Calibri" w:cs="Calibri"/>
+          <w:lang w:val="el-GR"/>
+        </w:rPr>
+        <w:t xml:space="preserve">(κουμπί </w:t>
+      </w:r>
+      <w:r>
+        <w:rPr>
+          <w:rFonts w:ascii="Calibri" w:hAnsi="Calibri" w:cs="Calibri"/>
+        </w:rPr>
+        <w:t>Manage</w:t>
+      </w:r>
+      <w:r>
+        <w:rPr>
+          <w:rFonts w:ascii="Calibri" w:hAnsi="Calibri" w:cs="Calibri"/>
+          <w:lang w:val="el-GR"/>
+        </w:rPr>
+        <w:t xml:space="preserve"> </w:t>
+      </w:r>
+      <w:r>
+        <w:rPr>
+          <w:rFonts w:ascii="Calibri" w:hAnsi="Calibri" w:cs="Calibri"/>
+        </w:rPr>
+        <w:t>Participants</w:t>
+      </w:r>
+      <w:r>
+        <w:rPr>
+          <w:rFonts w:ascii="Calibri" w:hAnsi="Calibri" w:cs="Calibri"/>
+          <w:lang w:val="el-GR"/>
+        </w:rPr>
+        <w:t>)</w:t>
+      </w:r>
+      <w:r>
+        <w:rPr>
+          <w:rFonts w:ascii="Calibri" w:hAnsi="Calibri" w:cs="Calibri"/>
+          <w:lang w:val="el-GR"/>
+        </w:rPr>
+        <w:t xml:space="preserve"> </w:t>
+      </w:r>
+      <w:r>
+        <w:rPr>
+          <w:rFonts w:ascii="Calibri" w:hAnsi="Calibri" w:cs="Calibri"/>
+          <w:lang w:val="el-GR"/>
+        </w:rPr>
+        <w:t xml:space="preserve">όπως φαίνεται από την </w:t>
+      </w:r>
+      <w:r>
+        <w:rPr>
+          <w:rFonts w:ascii="Calibri" w:hAnsi="Calibri" w:cs="Calibri"/>
+          <w:lang w:val="el-GR"/>
+        </w:rPr>
+        <w:t>εικόνα 3.2</w:t>
+      </w:r>
+      <w:r>
+        <w:rPr>
+          <w:rFonts w:ascii="Calibri" w:hAnsi="Calibri" w:cs="Calibri"/>
+          <w:lang w:val="el-GR"/>
+        </w:rPr>
+        <w:t xml:space="preserve">. Ο </w:t>
+      </w:r>
+      <w:r>
+        <w:rPr>
+          <w:rFonts w:ascii="Calibri" w:hAnsi="Calibri" w:cs="Calibri"/>
+          <w:lang w:val="el-GR"/>
+        </w:rPr>
+        <w:t xml:space="preserve">προγραμματιστής δεν έχει αυτή τη </w:t>
+      </w:r>
+      <w:r>
+        <w:rPr>
+          <w:rFonts w:ascii="Calibri" w:hAnsi="Calibri" w:cs="Calibri"/>
+          <w:lang w:val="el-GR"/>
+        </w:rPr>
+        <w:t>δικαιοδοσία, αλλά μπορεί να διαγράψει</w:t>
+      </w:r>
+      <w:r>
+        <w:rPr>
+          <w:rFonts w:ascii="Calibri" w:hAnsi="Calibri" w:cs="Calibri"/>
+          <w:lang w:val="el-GR"/>
+        </w:rPr>
+        <w:t xml:space="preserve"> </w:t>
+      </w:r>
+      <w:r>
+        <w:rPr>
+          <w:rFonts w:ascii="Calibri" w:hAnsi="Calibri" w:cs="Calibri"/>
+          <w:lang w:val="el-GR"/>
+        </w:rPr>
+        <w:t xml:space="preserve">το </w:t>
+      </w:r>
+      <w:r>
+        <w:rPr>
+          <w:rFonts w:ascii="Calibri" w:hAnsi="Calibri" w:cs="Calibri"/>
+        </w:rPr>
+        <w:t>project</w:t>
+      </w:r>
+      <w:r>
+        <w:rPr>
+          <w:rFonts w:ascii="Calibri" w:hAnsi="Calibri" w:cs="Calibri"/>
+          <w:lang w:val="el-GR"/>
+        </w:rPr>
+        <w:t xml:space="preserve"> όπως</w:t>
+      </w:r>
+      <w:r>
+        <w:rPr>
+          <w:rFonts w:ascii="Calibri" w:hAnsi="Calibri" w:cs="Calibri"/>
+          <w:lang w:val="el-GR"/>
+        </w:rPr>
+        <w:t xml:space="preserve"> </w:t>
+      </w:r>
+      <w:r>
+        <w:rPr>
+          <w:rFonts w:ascii="Calibri" w:hAnsi="Calibri" w:cs="Calibri"/>
+          <w:lang w:val="el-GR"/>
+        </w:rPr>
+        <w:t xml:space="preserve">φαίνεται στην εικόνα </w:t>
+      </w:r>
+      <w:r>
+        <w:rPr>
+          <w:rFonts w:ascii="Calibri" w:hAnsi="Calibri" w:cs="Calibri"/>
+          <w:lang w:val="el-GR"/>
+        </w:rPr>
+        <w:t xml:space="preserve"> 3.3</w:t>
+      </w:r>
+      <w:r>
+        <w:rPr>
+          <w:rFonts w:ascii="Calibri" w:hAnsi="Calibri" w:cs="Calibri"/>
+          <w:lang w:val="el-GR"/>
+        </w:rPr>
+        <w:t xml:space="preserve"> (κουμπί </w:t>
+      </w:r>
+      <w:r>
+        <w:rPr>
+          <w:rFonts w:ascii="Calibri" w:hAnsi="Calibri" w:cs="Calibri"/>
+        </w:rPr>
+        <w:t>Delete</w:t>
+      </w:r>
+      <w:r>
+        <w:rPr>
+          <w:rFonts w:ascii="Calibri" w:hAnsi="Calibri" w:cs="Calibri"/>
+          <w:lang w:val="el-GR"/>
+        </w:rPr>
+        <w:t xml:space="preserve"> </w:t>
+      </w:r>
+      <w:r>
+        <w:rPr>
+          <w:rFonts w:ascii="Calibri" w:hAnsi="Calibri" w:cs="Calibri"/>
+        </w:rPr>
+        <w:t>Project</w:t>
+      </w:r>
+      <w:r>
+        <w:rPr>
+          <w:rFonts w:ascii="Calibri" w:hAnsi="Calibri" w:cs="Calibri"/>
+          <w:lang w:val="el-GR"/>
+        </w:rPr>
+        <w:t>)</w:t>
+      </w:r>
+      <w:r>
+        <w:rPr>
+          <w:rFonts w:ascii="Calibri" w:hAnsi="Calibri" w:cs="Calibri"/>
+          <w:lang w:val="el-GR"/>
+        </w:rPr>
+        <w:t>.</w:t>
       </w:r>
     </w:p>
     <w:p>
@@ -3148,87 +3647,7 @@
           <w:rFonts w:ascii="Calibri" w:hAnsi="Calibri" w:cs="Calibri"/>
           <w:lang w:val="el-GR"/>
         </w:rPr>
-        <w:t>παρουσιάζουμε</w:t>
-      </w:r>
-      <w:r>
-        <w:rPr>
-          <w:rFonts w:ascii="Calibri" w:hAnsi="Calibri" w:cs="Calibri"/>
-          <w:lang w:val="el-GR"/>
-        </w:rPr>
-        <w:t xml:space="preserve"> το </w:t>
-      </w:r>
-      <w:r>
-        <w:rPr>
-          <w:rFonts w:ascii="Calibri" w:hAnsi="Calibri" w:cs="Calibri"/>
-        </w:rPr>
-        <w:t>mock</w:t>
-      </w:r>
-      <w:r>
-        <w:rPr>
-          <w:rFonts w:ascii="Calibri" w:hAnsi="Calibri" w:cs="Calibri"/>
-          <w:lang w:val="el-GR"/>
-        </w:rPr>
-        <w:t>-</w:t>
-      </w:r>
-      <w:r>
-        <w:rPr>
-          <w:rFonts w:ascii="Calibri" w:hAnsi="Calibri" w:cs="Calibri"/>
-        </w:rPr>
-        <w:t>up</w:t>
-      </w:r>
-      <w:r>
-        <w:rPr>
-          <w:rFonts w:ascii="Calibri" w:hAnsi="Calibri" w:cs="Calibri"/>
-          <w:lang w:val="el-GR"/>
-        </w:rPr>
-        <w:t xml:space="preserve"> </w:t>
-      </w:r>
-      <w:r>
-        <w:rPr>
-          <w:rFonts w:ascii="Calibri" w:hAnsi="Calibri" w:cs="Calibri"/>
-        </w:rPr>
-        <w:t>screen</w:t>
-      </w:r>
-      <w:r>
-        <w:rPr>
-          <w:rFonts w:ascii="Calibri" w:hAnsi="Calibri" w:cs="Calibri"/>
-          <w:lang w:val="el-GR"/>
-        </w:rPr>
-        <w:t xml:space="preserve"> τη</w:t>
-      </w:r>
-      <w:r>
-        <w:rPr>
-          <w:rFonts w:ascii="Calibri" w:hAnsi="Calibri" w:cs="Calibri"/>
-          <w:lang w:val="el-GR"/>
-        </w:rPr>
-        <w:t>ς</w:t>
-      </w:r>
-      <w:r>
-        <w:rPr>
-          <w:rFonts w:ascii="Calibri" w:hAnsi="Calibri" w:cs="Calibri"/>
-          <w:lang w:val="el-GR"/>
-        </w:rPr>
-        <w:t xml:space="preserve"> κ</w:t>
-      </w:r>
-      <w:r>
-        <w:rPr>
-          <w:rFonts w:ascii="Calibri" w:hAnsi="Calibri" w:cs="Calibri"/>
-          <w:lang w:val="el-GR"/>
-        </w:rPr>
-        <w:t xml:space="preserve">εντρική οθόνη ενός </w:t>
-      </w:r>
-      <w:r>
-        <w:rPr>
-          <w:rFonts w:ascii="Calibri" w:hAnsi="Calibri" w:cs="Calibri"/>
-        </w:rPr>
-        <w:t>project</w:t>
-      </w:r>
-      <w:r>
-        <w:rPr>
-          <w:rFonts w:ascii="Calibri" w:hAnsi="Calibri" w:cs="Calibri"/>
-          <w:lang w:val="el-GR"/>
-        </w:rPr>
-        <w:t>. Εμφανίζει το όνομα και την περιγραφή του, καθώς και το σύνολο των απαιτήσεων που έχουν καταγραφεί. Ο Developer μπορεί να διαχειριστεί τους συμμετέχοντες στο έργο ή να το διαγράψει. Από εδώ γίνεται η πλοήγηση σε όλες τις ενότητες: τους χρήστες που εμπλέκονται στο σύστημα, τις απαιτήσεις χρήσης, τη δομή των κλάσεων και τα αυτόματα παραγόμενα διαγράμματα. Ο Organization Owner έχει πρόσβαση σε όλα τα έργα του οργανισμού και μπορεί από εδώ να εγκρίνει ή να απορρίψει απαιτήσεις</w:t>
+        <w:t>Από εδώ γίνεται η πλοήγηση σε όλες τις ενότητες: τους χρήστες που εμπλέκονται στο σύστημα, τις απαιτήσεις χρήσης, τη δομή των κλάσεων και τα αυτόματα παραγόμενα διαγράμματα. Ο Organization Owner έχει πρόσβαση σε όλα τα έργα του οργανισμού και μπορεί από εδώ να εγκρίνει ή να απορρίψει απαιτήσεις</w:t>
       </w:r>
       <w:r>
         <w:rPr>
@@ -3304,190 +3723,448 @@
         <w:pStyle w:val="Caption"/>
         <w:jc w:val="center"/>
         <w:rPr>
-          <w:rFonts w:ascii="Calibri" w:hAnsi="Calibri" w:cs="Calibri"/>
-          <w:lang w:val="el-GR"/>
-        </w:rPr>
-      </w:pPr>
-      <w:r>
-        <w:rPr>
-          <w:rFonts w:ascii="Calibri" w:hAnsi="Calibri" w:cs="Calibri"/>
+          <w:lang w:val="el-GR"/>
+        </w:rPr>
+      </w:pPr>
+      <w:r>
+        <w:rPr>
           <w:lang w:val="el-GR"/>
         </w:rPr>
         <w:t xml:space="preserve">Εικόνα </w:t>
       </w:r>
       <w:r>
         <w:rPr>
-          <w:rFonts w:ascii="Calibri" w:hAnsi="Calibri" w:cs="Calibri"/>
+          <w:lang w:val="el-GR"/>
         </w:rPr>
         <w:t>3.1</w:t>
       </w:r>
       <w:r>
         <w:rPr>
-          <w:rFonts w:ascii="Calibri" w:hAnsi="Calibri" w:cs="Calibri"/>
           <w:lang w:val="el-GR"/>
         </w:rPr>
         <w:t xml:space="preserve">: </w:t>
       </w:r>
       <w:r>
         <w:rPr>
-          <w:rFonts w:ascii="Calibri" w:hAnsi="Calibri" w:cs="Calibri"/>
-        </w:rPr>
+          <w:lang w:val="el-GR"/>
+        </w:rPr>
+        <w:t xml:space="preserve">Αρχική Σχεδίαση </w:t>
+      </w:r>
+      <w:r>
         <w:t>Project</w:t>
       </w:r>
       <w:r>
         <w:rPr>
-          <w:rFonts w:ascii="Calibri" w:hAnsi="Calibri" w:cs="Calibri"/>
-          <w:lang w:val="el-GR"/>
-        </w:rPr>
-        <w:t xml:space="preserve"> </w:t>
-      </w:r>
-      <w:r>
-        <w:rPr>
-          <w:rFonts w:ascii="Calibri" w:hAnsi="Calibri" w:cs="Calibri"/>
-        </w:rPr>
-        <w:t>Details</w:t>
-      </w:r>
-    </w:p>
-    <w:p>
-      <w:pPr>
-        <w:jc w:val="both"/>
-        <w:rPr>
-          <w:rFonts w:ascii="Calibri" w:hAnsi="Calibri" w:cs="Calibri"/>
-          <w:lang w:val="el-GR"/>
-        </w:rPr>
-      </w:pPr>
-    </w:p>
-    <w:p>
-      <w:pPr>
-        <w:jc w:val="both"/>
-        <w:rPr>
-          <w:rFonts w:ascii="Calibri" w:hAnsi="Calibri" w:cs="Calibri"/>
-          <w:lang w:val="el-GR"/>
-        </w:rPr>
-      </w:pPr>
-    </w:p>
-    <w:p>
-      <w:pPr>
-        <w:jc w:val="both"/>
-        <w:rPr>
-          <w:rFonts w:ascii="Calibri" w:hAnsi="Calibri" w:cs="Calibri"/>
-          <w:lang w:val="el-GR"/>
-        </w:rPr>
-      </w:pPr>
-    </w:p>
-    <w:p>
-      <w:pPr>
-        <w:jc w:val="both"/>
-        <w:rPr>
-          <w:rFonts w:ascii="Calibri" w:hAnsi="Calibri" w:cs="Calibri"/>
-          <w:lang w:val="el-GR"/>
-        </w:rPr>
-      </w:pPr>
-    </w:p>
-    <w:p>
-      <w:pPr>
-        <w:jc w:val="both"/>
-        <w:rPr>
-          <w:rFonts w:ascii="Calibri" w:hAnsi="Calibri" w:cs="Calibri"/>
-          <w:lang w:val="el-GR"/>
-        </w:rPr>
-      </w:pPr>
-    </w:p>
-    <w:p>
-      <w:pPr>
-        <w:jc w:val="both"/>
-        <w:rPr>
-          <w:rFonts w:ascii="Calibri" w:hAnsi="Calibri" w:cs="Calibri"/>
-          <w:lang w:val="el-GR"/>
-        </w:rPr>
-      </w:pPr>
-    </w:p>
-    <w:p>
-      <w:pPr>
-        <w:jc w:val="both"/>
-        <w:rPr>
-          <w:rFonts w:ascii="Calibri" w:hAnsi="Calibri" w:cs="Calibri"/>
-          <w:lang w:val="el-GR"/>
-        </w:rPr>
-      </w:pPr>
-    </w:p>
-    <w:p>
-      <w:pPr>
-        <w:jc w:val="both"/>
-        <w:rPr>
-          <w:rFonts w:ascii="Calibri" w:hAnsi="Calibri" w:cs="Calibri"/>
-          <w:lang w:val="el-GR"/>
-        </w:rPr>
-      </w:pPr>
-    </w:p>
-    <w:p>
-      <w:pPr>
-        <w:jc w:val="both"/>
-        <w:rPr>
-          <w:rFonts w:ascii="Calibri" w:hAnsi="Calibri" w:cs="Calibri"/>
-          <w:lang w:val="el-GR"/>
-        </w:rPr>
-      </w:pPr>
-    </w:p>
-    <w:p>
-      <w:pPr>
-        <w:jc w:val="both"/>
-        <w:rPr>
-          <w:rFonts w:ascii="Calibri" w:hAnsi="Calibri" w:cs="Calibri"/>
-          <w:lang w:val="el-GR"/>
-        </w:rPr>
-      </w:pPr>
-    </w:p>
-    <w:p>
-      <w:pPr>
-        <w:jc w:val="both"/>
-        <w:rPr>
-          <w:rFonts w:ascii="Calibri" w:hAnsi="Calibri" w:cs="Calibri"/>
-          <w:lang w:val="el-GR"/>
-        </w:rPr>
-      </w:pPr>
-    </w:p>
-    <w:p>
-      <w:pPr>
-        <w:jc w:val="both"/>
-        <w:rPr>
-          <w:rFonts w:ascii="Calibri" w:hAnsi="Calibri" w:cs="Calibri"/>
-          <w:lang w:val="el-GR"/>
-        </w:rPr>
-      </w:pPr>
-    </w:p>
-    <w:p>
-      <w:pPr>
-        <w:jc w:val="both"/>
-        <w:rPr>
-          <w:rFonts w:ascii="Calibri" w:hAnsi="Calibri" w:cs="Calibri"/>
-          <w:lang w:val="el-GR"/>
-        </w:rPr>
-      </w:pPr>
-    </w:p>
-    <w:p>
-      <w:pPr>
-        <w:jc w:val="both"/>
-        <w:rPr>
-          <w:rFonts w:ascii="Calibri" w:hAnsi="Calibri" w:cs="Calibri"/>
-          <w:lang w:val="el-GR"/>
-        </w:rPr>
-      </w:pPr>
-    </w:p>
-    <w:p>
-      <w:pPr>
-        <w:jc w:val="both"/>
-        <w:rPr>
-          <w:rFonts w:ascii="Calibri" w:hAnsi="Calibri" w:cs="Calibri"/>
-          <w:lang w:val="el-GR"/>
-        </w:rPr>
-      </w:pPr>
-      <w:r>
-        <w:rPr>
-          <w:rFonts w:ascii="Calibri" w:hAnsi="Calibri" w:cs="Calibri"/>
-          <w:lang w:val="el-GR"/>
-        </w:rPr>
-        <w:t xml:space="preserve">Στην εικόνα </w:t>
+          <w:lang w:val="el-GR"/>
+        </w:rPr>
+        <w:t xml:space="preserve"> </w:t>
+      </w:r>
+      <w:r>
+        <w:t>Detail</w:t>
+      </w:r>
+    </w:p>
+    <w:p>
+      <w:pPr>
+        <w:jc w:val="both"/>
+        <w:rPr>
+          <w:rFonts w:ascii="Calibri" w:hAnsi="Calibri" w:cs="Calibri"/>
+          <w:lang w:val="el-GR"/>
+        </w:rPr>
+      </w:pPr>
+    </w:p>
+    <w:p>
+      <w:pPr>
+        <w:keepNext/>
+        <w:jc w:val="center"/>
+      </w:pPr>
+      <w:r>
+        <w:lastRenderedPageBreak/>
+        <w:drawing>
+          <wp:inline distT="0" distB="0" distL="0" distR="0" wp14:anchorId="275D30EB" wp14:editId="0475614C">
+            <wp:extent cx="5943600" cy="5201285"/>
+            <wp:effectExtent l="0" t="0" r="0" b="0"/>
+            <wp:docPr id="1187658038" name="Picture 1"/>
+            <wp:cNvGraphicFramePr>
+              <a:graphicFrameLocks xmlns:a="http://schemas.openxmlformats.org/drawingml/2006/main" noChangeAspect="1"/>
+            </wp:cNvGraphicFramePr>
+            <a:graphic xmlns:a="http://schemas.openxmlformats.org/drawingml/2006/main">
+              <a:graphicData uri="http://schemas.openxmlformats.org/drawingml/2006/picture">
+                <pic:pic xmlns:pic="http://schemas.openxmlformats.org/drawingml/2006/picture">
+                  <pic:nvPicPr>
+                    <pic:cNvPr id="1187658038" name=""/>
+                    <pic:cNvPicPr/>
+                  </pic:nvPicPr>
+                  <pic:blipFill>
+                    <a:blip r:embed="rId15"/>
+                    <a:stretch>
+                      <a:fillRect/>
+                    </a:stretch>
+                  </pic:blipFill>
+                  <pic:spPr>
+                    <a:xfrm>
+                      <a:off x="0" y="0"/>
+                      <a:ext cx="5943600" cy="5201285"/>
+                    </a:xfrm>
+                    <a:prstGeom prst="rect">
+                      <a:avLst/>
+                    </a:prstGeom>
+                  </pic:spPr>
+                </pic:pic>
+              </a:graphicData>
+            </a:graphic>
+          </wp:inline>
+        </w:drawing>
+      </w:r>
+    </w:p>
+    <w:p>
+      <w:pPr>
+        <w:pStyle w:val="Caption"/>
+        <w:jc w:val="center"/>
+        <w:rPr>
+          <w:lang w:val="el-GR"/>
+        </w:rPr>
+      </w:pPr>
+      <w:r>
+        <w:rPr>
+          <w:lang w:val="el-GR"/>
+        </w:rPr>
+        <w:t xml:space="preserve">Εικόνα </w:t>
+      </w:r>
+      <w:r>
+        <w:fldChar w:fldCharType="begin"/>
+      </w:r>
+      <w:r>
+        <w:rPr>
+          <w:lang w:val="el-GR"/>
+        </w:rPr>
+        <w:instrText xml:space="preserve"> </w:instrText>
+      </w:r>
+      <w:r>
+        <w:instrText>SEQ</w:instrText>
+      </w:r>
+      <w:r>
+        <w:rPr>
+          <w:lang w:val="el-GR"/>
+        </w:rPr>
+        <w:instrText xml:space="preserve"> Εικόνα \* </w:instrText>
+      </w:r>
+      <w:r>
+        <w:instrText>ARABIC</w:instrText>
+      </w:r>
+      <w:r>
+        <w:rPr>
+          <w:lang w:val="el-GR"/>
+        </w:rPr>
+        <w:instrText xml:space="preserve"> </w:instrText>
+      </w:r>
+      <w:r>
+        <w:fldChar w:fldCharType="separate"/>
+      </w:r>
+      <w:r>
+        <w:rPr>
+          <w:noProof/>
+          <w:lang w:val="el-GR"/>
+        </w:rPr>
+        <w:t>3</w:t>
+      </w:r>
+      <w:r>
+        <w:fldChar w:fldCharType="end"/>
+      </w:r>
+      <w:r>
+        <w:rPr>
+          <w:lang w:val="el-GR"/>
+        </w:rPr>
+        <w:t xml:space="preserve">.2: </w:t>
+      </w:r>
+      <w:r>
+        <w:rPr>
+          <w:lang w:val="el-GR"/>
+        </w:rPr>
+        <w:t xml:space="preserve">Τελική οθόνη </w:t>
+      </w:r>
+      <w:r>
+        <w:t>Project</w:t>
+      </w:r>
+      <w:r>
+        <w:rPr>
+          <w:lang w:val="el-GR"/>
+        </w:rPr>
+        <w:t xml:space="preserve"> </w:t>
+      </w:r>
+      <w:r>
+        <w:t>Detail</w:t>
+      </w:r>
+      <w:r>
+        <w:rPr>
+          <w:lang w:val="el-GR"/>
+        </w:rPr>
+        <w:t xml:space="preserve"> (Συνδεδεμένος ως Ιδιοκτήτης Οργανισμού)</w:t>
+      </w:r>
+    </w:p>
+    <w:p>
+      <w:pPr>
+        <w:rPr>
+          <w:lang w:val="el-GR"/>
+        </w:rPr>
+      </w:pPr>
+    </w:p>
+    <w:p>
+      <w:pPr>
+        <w:keepNext/>
+        <w:jc w:val="center"/>
+      </w:pPr>
+      <w:r>
+        <w:rPr>
+          <w:lang w:val="el-GR"/>
+        </w:rPr>
+        <w:lastRenderedPageBreak/>
+        <w:drawing>
+          <wp:inline distT="0" distB="0" distL="0" distR="0" wp14:anchorId="768467A1" wp14:editId="61432237">
+            <wp:extent cx="5943600" cy="5222875"/>
+            <wp:effectExtent l="0" t="0" r="0" b="0"/>
+            <wp:docPr id="524123491" name="Picture 1"/>
+            <wp:cNvGraphicFramePr>
+              <a:graphicFrameLocks xmlns:a="http://schemas.openxmlformats.org/drawingml/2006/main" noChangeAspect="1"/>
+            </wp:cNvGraphicFramePr>
+            <a:graphic xmlns:a="http://schemas.openxmlformats.org/drawingml/2006/main">
+              <a:graphicData uri="http://schemas.openxmlformats.org/drawingml/2006/picture">
+                <pic:pic xmlns:pic="http://schemas.openxmlformats.org/drawingml/2006/picture">
+                  <pic:nvPicPr>
+                    <pic:cNvPr id="524123491" name=""/>
+                    <pic:cNvPicPr/>
+                  </pic:nvPicPr>
+                  <pic:blipFill>
+                    <a:blip r:embed="rId16"/>
+                    <a:stretch>
+                      <a:fillRect/>
+                    </a:stretch>
+                  </pic:blipFill>
+                  <pic:spPr>
+                    <a:xfrm>
+                      <a:off x="0" y="0"/>
+                      <a:ext cx="5943600" cy="5222875"/>
+                    </a:xfrm>
+                    <a:prstGeom prst="rect">
+                      <a:avLst/>
+                    </a:prstGeom>
+                  </pic:spPr>
+                </pic:pic>
+              </a:graphicData>
+            </a:graphic>
+          </wp:inline>
+        </w:drawing>
+      </w:r>
+    </w:p>
+    <w:p>
+      <w:pPr>
+        <w:pStyle w:val="Caption"/>
+        <w:jc w:val="center"/>
+        <w:rPr>
+          <w:lang w:val="el-GR"/>
+        </w:rPr>
+      </w:pPr>
+      <w:r>
+        <w:rPr>
+          <w:lang w:val="el-GR"/>
+        </w:rPr>
+        <w:t xml:space="preserve">Εικόνα </w:t>
+      </w:r>
+      <w:r>
+        <w:rPr>
+          <w:lang w:val="el-GR"/>
+        </w:rPr>
+        <w:t>3</w:t>
+      </w:r>
+      <w:r>
+        <w:rPr>
+          <w:lang w:val="el-GR"/>
+        </w:rPr>
+        <w:t xml:space="preserve">.3: </w:t>
+      </w:r>
+      <w:r>
+        <w:rPr>
+          <w:lang w:val="el-GR"/>
+        </w:rPr>
+        <w:t xml:space="preserve">Τελική οθόνη </w:t>
+      </w:r>
+      <w:r>
+        <w:t>Project</w:t>
+      </w:r>
+      <w:r>
+        <w:rPr>
+          <w:lang w:val="el-GR"/>
+        </w:rPr>
+        <w:t xml:space="preserve"> </w:t>
+      </w:r>
+      <w:r>
+        <w:t>Detail</w:t>
+      </w:r>
+      <w:r>
+        <w:rPr>
+          <w:lang w:val="el-GR"/>
+        </w:rPr>
+        <w:t xml:space="preserve"> (Συνδεδεμένος ως </w:t>
+      </w:r>
+      <w:r>
+        <w:rPr>
+          <w:lang w:val="el-GR"/>
+        </w:rPr>
+        <w:t>Προγραμματιστής</w:t>
+      </w:r>
+      <w:r>
+        <w:rPr>
+          <w:lang w:val="el-GR"/>
+        </w:rPr>
+        <w:t>)</w:t>
+      </w:r>
+    </w:p>
+    <w:p>
+      <w:pPr>
+        <w:pStyle w:val="Caption"/>
+        <w:jc w:val="center"/>
+        <w:rPr>
+          <w:lang w:val="el-GR"/>
+        </w:rPr>
+      </w:pPr>
+    </w:p>
+    <w:p>
+      <w:pPr>
+        <w:jc w:val="both"/>
+        <w:rPr>
+          <w:rFonts w:ascii="Calibri" w:hAnsi="Calibri" w:cs="Calibri"/>
+          <w:lang w:val="el-GR"/>
+        </w:rPr>
+      </w:pPr>
+    </w:p>
+    <w:p>
+      <w:pPr>
+        <w:jc w:val="both"/>
+        <w:rPr>
+          <w:rFonts w:ascii="Calibri" w:hAnsi="Calibri" w:cs="Calibri"/>
+          <w:lang w:val="el-GR"/>
+        </w:rPr>
+      </w:pPr>
+    </w:p>
+    <w:p>
+      <w:pPr>
+        <w:jc w:val="both"/>
+        <w:rPr>
+          <w:rFonts w:ascii="Calibri" w:hAnsi="Calibri" w:cs="Calibri"/>
+          <w:lang w:val="el-GR"/>
+        </w:rPr>
+      </w:pPr>
+    </w:p>
+    <w:p>
+      <w:pPr>
+        <w:jc w:val="both"/>
+        <w:rPr>
+          <w:rFonts w:ascii="Calibri" w:hAnsi="Calibri" w:cs="Calibri"/>
+          <w:lang w:val="el-GR"/>
+        </w:rPr>
+      </w:pPr>
+    </w:p>
+    <w:p>
+      <w:pPr>
+        <w:jc w:val="both"/>
+        <w:rPr>
+          <w:rFonts w:ascii="Calibri" w:hAnsi="Calibri" w:cs="Calibri"/>
+          <w:lang w:val="el-GR"/>
+        </w:rPr>
+      </w:pPr>
+    </w:p>
+    <w:p>
+      <w:pPr>
+        <w:jc w:val="both"/>
+        <w:rPr>
+          <w:rFonts w:ascii="Calibri" w:hAnsi="Calibri" w:cs="Calibri"/>
+          <w:lang w:val="el-GR"/>
+        </w:rPr>
+      </w:pPr>
+    </w:p>
+    <w:p>
+      <w:pPr>
+        <w:jc w:val="both"/>
+        <w:rPr>
+          <w:rFonts w:ascii="Calibri" w:hAnsi="Calibri" w:cs="Calibri"/>
+          <w:lang w:val="el-GR"/>
+        </w:rPr>
+      </w:pPr>
+    </w:p>
+    <w:p>
+      <w:pPr>
+        <w:jc w:val="both"/>
+        <w:rPr>
+          <w:rFonts w:ascii="Calibri" w:hAnsi="Calibri" w:cs="Calibri"/>
+          <w:lang w:val="el-GR"/>
+        </w:rPr>
+      </w:pPr>
+    </w:p>
+    <w:p>
+      <w:pPr>
+        <w:pStyle w:val="Heading3"/>
+        <w:numPr>
+          <w:ilvl w:val="0"/>
+          <w:numId w:val="4"/>
+        </w:numPr>
+        <w:pBdr>
+          <w:bottom w:val="single" w:sz="4" w:space="1" w:color="auto"/>
+        </w:pBdr>
+        <w:rPr>
+          <w:b/>
+          <w:bCs/>
+          <w:lang w:val="el-GR"/>
+        </w:rPr>
+      </w:pPr>
+      <w:r>
+        <w:rPr>
+          <w:b/>
+          <w:bCs/>
+        </w:rPr>
+        <w:t>Use Case Form</w:t>
+      </w:r>
+    </w:p>
+    <w:p>
+      <w:pPr>
+        <w:jc w:val="both"/>
+        <w:rPr>
+          <w:rFonts w:ascii="Calibri" w:hAnsi="Calibri" w:cs="Calibri"/>
+          <w:lang w:val="el-GR"/>
+        </w:rPr>
+      </w:pPr>
+      <w:r>
+        <w:rPr>
+          <w:rFonts w:ascii="Calibri" w:hAnsi="Calibri" w:cs="Calibri"/>
+          <w:lang w:val="el-GR"/>
+        </w:rPr>
+        <w:t>Στ</w:t>
+      </w:r>
+      <w:r>
+        <w:rPr>
+          <w:rFonts w:ascii="Calibri" w:hAnsi="Calibri" w:cs="Calibri"/>
+          <w:lang w:val="el-GR"/>
+        </w:rPr>
+        <w:t>ις</w:t>
+      </w:r>
+      <w:r>
+        <w:rPr>
+          <w:rFonts w:ascii="Calibri" w:hAnsi="Calibri" w:cs="Calibri"/>
+          <w:lang w:val="el-GR"/>
+        </w:rPr>
+        <w:t xml:space="preserve"> εικόν</w:t>
+      </w:r>
+      <w:r>
+        <w:rPr>
+          <w:rFonts w:ascii="Calibri" w:hAnsi="Calibri" w:cs="Calibri"/>
+          <w:lang w:val="el-GR"/>
+        </w:rPr>
+        <w:t>ες</w:t>
+      </w:r>
+      <w:r>
+        <w:rPr>
+          <w:rFonts w:ascii="Calibri" w:hAnsi="Calibri" w:cs="Calibri"/>
+          <w:lang w:val="el-GR"/>
+        </w:rPr>
+        <w:t xml:space="preserve"> </w:t>
       </w:r>
       <w:r>
         <w:rPr>
@@ -3501,53 +4178,128 @@
           <w:rFonts w:ascii="Calibri" w:hAnsi="Calibri" w:cs="Calibri"/>
           <w:lang w:val="el-GR"/>
         </w:rPr>
-        <w:t xml:space="preserve"> παρουσιάζουμε το </w:t>
-      </w:r>
-      <w:r>
-        <w:rPr>
-          <w:rFonts w:ascii="Calibri" w:hAnsi="Calibri" w:cs="Calibri"/>
-        </w:rPr>
-        <w:t>mock</w:t>
-      </w:r>
-      <w:r>
-        <w:rPr>
-          <w:rFonts w:ascii="Calibri" w:hAnsi="Calibri" w:cs="Calibri"/>
-          <w:lang w:val="el-GR"/>
-        </w:rPr>
-        <w:t>-</w:t>
-      </w:r>
-      <w:r>
-        <w:rPr>
-          <w:rFonts w:ascii="Calibri" w:hAnsi="Calibri" w:cs="Calibri"/>
-        </w:rPr>
-        <w:t>up</w:t>
-      </w:r>
-      <w:r>
-        <w:rPr>
-          <w:rFonts w:ascii="Calibri" w:hAnsi="Calibri" w:cs="Calibri"/>
-          <w:lang w:val="el-GR"/>
-        </w:rPr>
-        <w:t xml:space="preserve"> </w:t>
-      </w:r>
-      <w:r>
-        <w:rPr>
-          <w:rFonts w:ascii="Calibri" w:hAnsi="Calibri" w:cs="Calibri"/>
-        </w:rPr>
-        <w:t>screen</w:t>
-      </w:r>
-      <w:r>
-        <w:rPr>
-          <w:rFonts w:ascii="Calibri" w:hAnsi="Calibri" w:cs="Calibri"/>
-          <w:lang w:val="el-GR"/>
-        </w:rPr>
-        <w:t xml:space="preserve"> για την </w:t>
-      </w:r>
-      <w:r>
-        <w:rPr>
-          <w:rFonts w:ascii="Calibri" w:hAnsi="Calibri" w:cs="Calibri"/>
-          <w:lang w:val="el-GR"/>
-        </w:rPr>
-        <w:t>καταγραφή μιας νέας απαίτησης χρήσης. Ο χρήστης ορίζει το όνομά της, επιλέγει ποιοι χρήστες του συστήματος εμπλέκονται και περιγράφει την προϋπόθεση, τη βασική ροή, τις εναλλακτικές ροές και το αποτέλεσμα. Η εφαρμογή διασφαλίζει ότι κάθε απαίτηση συνδέεται με τουλάχιστον έναν χρήστη του συστήματος.</w:t>
+        <w:t xml:space="preserve">.1 και </w:t>
+      </w:r>
+      <w:r>
+        <w:rPr>
+          <w:rFonts w:ascii="Calibri" w:hAnsi="Calibri" w:cs="Calibri"/>
+          <w:lang w:val="el-GR"/>
+        </w:rPr>
+        <w:t>4</w:t>
+      </w:r>
+      <w:r>
+        <w:rPr>
+          <w:rFonts w:ascii="Calibri" w:hAnsi="Calibri" w:cs="Calibri"/>
+          <w:lang w:val="el-GR"/>
+        </w:rPr>
+        <w:t>.2 παρουσιάζουμε την αρχική και την τελική σχεδίαση αντίστοιχα, της οθόνης</w:t>
+      </w:r>
+      <w:r>
+        <w:rPr>
+          <w:rFonts w:ascii="Calibri" w:hAnsi="Calibri" w:cs="Calibri"/>
+          <w:lang w:val="el-GR"/>
+        </w:rPr>
+        <w:t xml:space="preserve"> </w:t>
+      </w:r>
+      <w:r>
+        <w:rPr>
+          <w:rFonts w:ascii="Calibri" w:hAnsi="Calibri" w:cs="Calibri"/>
+        </w:rPr>
+        <w:t>Use</w:t>
+      </w:r>
+      <w:r>
+        <w:rPr>
+          <w:rFonts w:ascii="Calibri" w:hAnsi="Calibri" w:cs="Calibri"/>
+          <w:lang w:val="el-GR"/>
+        </w:rPr>
+        <w:t xml:space="preserve"> </w:t>
+      </w:r>
+      <w:r>
+        <w:rPr>
+          <w:rFonts w:ascii="Calibri" w:hAnsi="Calibri" w:cs="Calibri"/>
+        </w:rPr>
+        <w:t>Case</w:t>
+      </w:r>
+      <w:r>
+        <w:rPr>
+          <w:rFonts w:ascii="Calibri" w:hAnsi="Calibri" w:cs="Calibri"/>
+          <w:lang w:val="el-GR"/>
+        </w:rPr>
+        <w:t xml:space="preserve"> </w:t>
+      </w:r>
+      <w:r>
+        <w:rPr>
+          <w:rFonts w:ascii="Calibri" w:hAnsi="Calibri" w:cs="Calibri"/>
+        </w:rPr>
+        <w:t>Form</w:t>
+      </w:r>
+      <w:r>
+        <w:rPr>
+          <w:rFonts w:ascii="Calibri" w:hAnsi="Calibri" w:cs="Calibri"/>
+          <w:lang w:val="el-GR"/>
+        </w:rPr>
+        <w:t>.</w:t>
+      </w:r>
+      <w:r>
+        <w:rPr>
+          <w:rFonts w:ascii="Calibri" w:hAnsi="Calibri" w:cs="Calibri"/>
+          <w:lang w:val="el-GR"/>
+        </w:rPr>
+        <w:t xml:space="preserve"> </w:t>
+      </w:r>
+      <w:r>
+        <w:rPr>
+          <w:rFonts w:ascii="Calibri" w:hAnsi="Calibri" w:cs="Calibri"/>
+          <w:lang w:val="el-GR"/>
+        </w:rPr>
+        <w:t xml:space="preserve">Η σελίδα αυτή είναι υπεύθυνη για την δημιουργία ενός καινούργιου </w:t>
+      </w:r>
+      <w:r>
+        <w:rPr>
+          <w:rFonts w:ascii="Calibri" w:hAnsi="Calibri" w:cs="Calibri"/>
+        </w:rPr>
+        <w:t>use</w:t>
+      </w:r>
+      <w:r>
+        <w:rPr>
+          <w:rFonts w:ascii="Calibri" w:hAnsi="Calibri" w:cs="Calibri"/>
+          <w:lang w:val="el-GR"/>
+        </w:rPr>
+        <w:t xml:space="preserve"> </w:t>
+      </w:r>
+      <w:r>
+        <w:rPr>
+          <w:rFonts w:ascii="Calibri" w:hAnsi="Calibri" w:cs="Calibri"/>
+        </w:rPr>
+        <w:t>case</w:t>
+      </w:r>
+      <w:r>
+        <w:rPr>
+          <w:rFonts w:ascii="Calibri" w:hAnsi="Calibri" w:cs="Calibri"/>
+          <w:lang w:val="el-GR"/>
+        </w:rPr>
+        <w:t xml:space="preserve"> </w:t>
+      </w:r>
+      <w:r>
+        <w:rPr>
+          <w:rFonts w:ascii="Calibri" w:hAnsi="Calibri" w:cs="Calibri"/>
+          <w:lang w:val="el-GR"/>
+        </w:rPr>
+        <w:t>από τον χρήστη.</w:t>
+      </w:r>
+      <w:r>
+        <w:rPr>
+          <w:rFonts w:ascii="Calibri" w:hAnsi="Calibri" w:cs="Calibri"/>
+          <w:lang w:val="el-GR"/>
+        </w:rPr>
+        <w:t xml:space="preserve"> </w:t>
+      </w:r>
+      <w:r>
+        <w:rPr>
+          <w:rFonts w:ascii="Calibri" w:hAnsi="Calibri" w:cs="Calibri"/>
+          <w:lang w:val="el-GR"/>
+        </w:rPr>
+        <w:t>Ο χρήστης ορίζει το όνομά της, επιλέγει ποιοι χρήστες του συστήματος εμπλέκονται και περιγράφει την προϋπόθεση, τη βασική ροή, τις εναλλακτικές ροές και το αποτέλεσμα.</w:t>
       </w:r>
     </w:p>
     <w:p>
@@ -3588,7 +4340,7 @@
                     <pic:cNvPicPr/>
                   </pic:nvPicPr>
                   <pic:blipFill>
-                    <a:blip r:embed="rId15"/>
+                    <a:blip r:embed="rId17"/>
                     <a:stretch>
                       <a:fillRect/>
                     </a:stretch>
@@ -3674,27 +4426,388 @@
         <w:rPr>
           <w:rFonts w:ascii="Calibri" w:hAnsi="Calibri" w:cs="Calibri"/>
           <w:noProof/>
+          <w:lang w:val="el-GR"/>
+        </w:rPr>
+        <w:t>4</w:t>
+      </w:r>
+      <w:r>
+        <w:rPr>
+          <w:rFonts w:ascii="Calibri" w:hAnsi="Calibri" w:cs="Calibri"/>
+        </w:rPr>
+        <w:fldChar w:fldCharType="end"/>
+      </w:r>
+      <w:r>
+        <w:rPr>
+          <w:rFonts w:ascii="Calibri" w:hAnsi="Calibri" w:cs="Calibri"/>
+          <w:lang w:val="el-GR"/>
+        </w:rPr>
+        <w:t>.1</w:t>
+      </w:r>
+      <w:r>
+        <w:rPr>
+          <w:rFonts w:ascii="Calibri" w:hAnsi="Calibri" w:cs="Calibri"/>
+          <w:lang w:val="el-GR"/>
+        </w:rPr>
+        <w:t xml:space="preserve">: </w:t>
+      </w:r>
+      <w:r>
+        <w:rPr>
+          <w:rFonts w:ascii="Calibri" w:hAnsi="Calibri" w:cs="Calibri"/>
+          <w:lang w:val="el-GR"/>
+        </w:rPr>
+        <w:t xml:space="preserve">Αρχική Σχεδίαση </w:t>
+      </w:r>
+      <w:r>
+        <w:rPr>
+          <w:rFonts w:ascii="Calibri" w:hAnsi="Calibri" w:cs="Calibri"/>
+        </w:rPr>
+        <w:t>Use</w:t>
+      </w:r>
+      <w:r>
+        <w:rPr>
+          <w:rFonts w:ascii="Calibri" w:hAnsi="Calibri" w:cs="Calibri"/>
+          <w:lang w:val="el-GR"/>
+        </w:rPr>
+        <w:t xml:space="preserve"> </w:t>
+      </w:r>
+      <w:r>
+        <w:rPr>
+          <w:rFonts w:ascii="Calibri" w:hAnsi="Calibri" w:cs="Calibri"/>
+        </w:rPr>
+        <w:t>Case</w:t>
+      </w:r>
+      <w:r>
+        <w:rPr>
+          <w:rFonts w:ascii="Calibri" w:hAnsi="Calibri" w:cs="Calibri"/>
+          <w:lang w:val="el-GR"/>
+        </w:rPr>
+        <w:t xml:space="preserve"> </w:t>
+      </w:r>
+      <w:r>
+        <w:rPr>
+          <w:rFonts w:ascii="Calibri" w:hAnsi="Calibri" w:cs="Calibri"/>
+        </w:rPr>
+        <w:t>Form</w:t>
+      </w:r>
+    </w:p>
+    <w:p>
+      <w:pPr>
+        <w:keepNext/>
+        <w:jc w:val="center"/>
+      </w:pPr>
+      <w:r>
+        <w:rPr>
+          <w:rFonts w:ascii="Calibri" w:hAnsi="Calibri" w:cs="Calibri"/>
+          <w:lang w:val="el-GR"/>
+        </w:rPr>
+        <w:lastRenderedPageBreak/>
+        <w:drawing>
+          <wp:inline distT="0" distB="0" distL="0" distR="0" wp14:anchorId="30F31981" wp14:editId="5AE60CEC">
+            <wp:extent cx="5943600" cy="4211955"/>
+            <wp:effectExtent l="0" t="0" r="0" b="0"/>
+            <wp:docPr id="1055459672" name="Picture 1"/>
+            <wp:cNvGraphicFramePr>
+              <a:graphicFrameLocks xmlns:a="http://schemas.openxmlformats.org/drawingml/2006/main" noChangeAspect="1"/>
+            </wp:cNvGraphicFramePr>
+            <a:graphic xmlns:a="http://schemas.openxmlformats.org/drawingml/2006/main">
+              <a:graphicData uri="http://schemas.openxmlformats.org/drawingml/2006/picture">
+                <pic:pic xmlns:pic="http://schemas.openxmlformats.org/drawingml/2006/picture">
+                  <pic:nvPicPr>
+                    <pic:cNvPr id="1055459672" name=""/>
+                    <pic:cNvPicPr/>
+                  </pic:nvPicPr>
+                  <pic:blipFill>
+                    <a:blip r:embed="rId18"/>
+                    <a:stretch>
+                      <a:fillRect/>
+                    </a:stretch>
+                  </pic:blipFill>
+                  <pic:spPr>
+                    <a:xfrm>
+                      <a:off x="0" y="0"/>
+                      <a:ext cx="5943600" cy="4211955"/>
+                    </a:xfrm>
+                    <a:prstGeom prst="rect">
+                      <a:avLst/>
+                    </a:prstGeom>
+                  </pic:spPr>
+                </pic:pic>
+              </a:graphicData>
+            </a:graphic>
+          </wp:inline>
+        </w:drawing>
+      </w:r>
+    </w:p>
+    <w:p>
+      <w:pPr>
+        <w:pStyle w:val="Caption"/>
+        <w:jc w:val="center"/>
+        <w:rPr>
+          <w:rFonts w:ascii="Calibri" w:hAnsi="Calibri" w:cs="Calibri"/>
+          <w:lang w:val="el-GR"/>
+        </w:rPr>
+      </w:pPr>
+      <w:r>
+        <w:rPr>
+          <w:lang w:val="el-GR"/>
+        </w:rPr>
+        <w:t xml:space="preserve">Εικόνα 4.2: </w:t>
+      </w:r>
+      <w:r>
+        <w:rPr>
+          <w:rFonts w:ascii="Calibri" w:hAnsi="Calibri" w:cs="Calibri"/>
+          <w:lang w:val="el-GR"/>
+        </w:rPr>
+        <w:t>Τελική οθόνη</w:t>
+      </w:r>
+      <w:r>
+        <w:rPr>
+          <w:rFonts w:ascii="Calibri" w:hAnsi="Calibri" w:cs="Calibri"/>
+          <w:lang w:val="el-GR"/>
+        </w:rPr>
+        <w:t xml:space="preserve"> </w:t>
+      </w:r>
+      <w:r>
+        <w:rPr>
+          <w:rFonts w:ascii="Calibri" w:hAnsi="Calibri" w:cs="Calibri"/>
+        </w:rPr>
+        <w:t>Use</w:t>
+      </w:r>
+      <w:r>
+        <w:rPr>
+          <w:rFonts w:ascii="Calibri" w:hAnsi="Calibri" w:cs="Calibri"/>
+          <w:lang w:val="el-GR"/>
+        </w:rPr>
+        <w:t xml:space="preserve"> </w:t>
+      </w:r>
+      <w:r>
+        <w:rPr>
+          <w:rFonts w:ascii="Calibri" w:hAnsi="Calibri" w:cs="Calibri"/>
+        </w:rPr>
+        <w:t>Case</w:t>
+      </w:r>
+      <w:r>
+        <w:rPr>
+          <w:rFonts w:ascii="Calibri" w:hAnsi="Calibri" w:cs="Calibri"/>
+          <w:lang w:val="el-GR"/>
+        </w:rPr>
+        <w:t xml:space="preserve"> </w:t>
+      </w:r>
+      <w:r>
+        <w:rPr>
+          <w:rFonts w:ascii="Calibri" w:hAnsi="Calibri" w:cs="Calibri"/>
+        </w:rPr>
+        <w:t>Form</w:t>
+      </w:r>
+    </w:p>
+    <w:p>
+      <w:pPr>
+        <w:jc w:val="both"/>
+        <w:rPr>
+          <w:rFonts w:ascii="Calibri" w:hAnsi="Calibri" w:cs="Calibri"/>
+          <w:lang w:val="el-GR"/>
+        </w:rPr>
+      </w:pPr>
+    </w:p>
+    <w:p>
+      <w:pPr>
+        <w:jc w:val="both"/>
+        <w:rPr>
+          <w:rFonts w:ascii="Calibri" w:hAnsi="Calibri" w:cs="Calibri"/>
+          <w:lang w:val="el-GR"/>
+        </w:rPr>
+      </w:pPr>
+    </w:p>
+    <w:p>
+      <w:pPr>
+        <w:jc w:val="both"/>
+        <w:rPr>
+          <w:rFonts w:ascii="Calibri" w:hAnsi="Calibri" w:cs="Calibri"/>
+          <w:lang w:val="el-GR"/>
+        </w:rPr>
+      </w:pPr>
+    </w:p>
+    <w:p>
+      <w:pPr>
+        <w:jc w:val="both"/>
+        <w:rPr>
+          <w:rFonts w:ascii="Calibri" w:hAnsi="Calibri" w:cs="Calibri"/>
+          <w:lang w:val="el-GR"/>
+        </w:rPr>
+      </w:pPr>
+    </w:p>
+    <w:p>
+      <w:pPr>
+        <w:jc w:val="both"/>
+        <w:rPr>
+          <w:rFonts w:ascii="Calibri" w:hAnsi="Calibri" w:cs="Calibri"/>
+          <w:lang w:val="el-GR"/>
+        </w:rPr>
+      </w:pPr>
+    </w:p>
+    <w:p>
+      <w:pPr>
+        <w:jc w:val="both"/>
+        <w:rPr>
+          <w:rFonts w:ascii="Calibri" w:hAnsi="Calibri" w:cs="Calibri"/>
+          <w:lang w:val="el-GR"/>
+        </w:rPr>
+      </w:pPr>
+    </w:p>
+    <w:p>
+      <w:pPr>
+        <w:jc w:val="both"/>
+        <w:rPr>
+          <w:rFonts w:ascii="Calibri" w:hAnsi="Calibri" w:cs="Calibri"/>
+          <w:lang w:val="el-GR"/>
+        </w:rPr>
+      </w:pPr>
+    </w:p>
+    <w:p>
+      <w:pPr>
+        <w:jc w:val="both"/>
+        <w:rPr>
+          <w:rFonts w:ascii="Calibri" w:hAnsi="Calibri" w:cs="Calibri"/>
+          <w:lang w:val="el-GR"/>
+        </w:rPr>
+      </w:pPr>
+    </w:p>
+    <w:p>
+      <w:pPr>
+        <w:jc w:val="both"/>
+        <w:rPr>
+          <w:rFonts w:ascii="Calibri" w:hAnsi="Calibri" w:cs="Calibri"/>
+          <w:lang w:val="el-GR"/>
+        </w:rPr>
+      </w:pPr>
+    </w:p>
+    <w:p>
+      <w:pPr>
+        <w:jc w:val="both"/>
+        <w:rPr>
+          <w:rFonts w:ascii="Calibri" w:hAnsi="Calibri" w:cs="Calibri"/>
+          <w:lang w:val="el-GR"/>
+        </w:rPr>
+      </w:pPr>
+    </w:p>
+    <w:p>
+      <w:pPr>
+        <w:jc w:val="both"/>
+        <w:rPr>
+          <w:rFonts w:ascii="Calibri" w:hAnsi="Calibri" w:cs="Calibri"/>
+          <w:lang w:val="el-GR"/>
+        </w:rPr>
+      </w:pPr>
+    </w:p>
+    <w:p>
+      <w:pPr>
+        <w:jc w:val="both"/>
+        <w:rPr>
+          <w:rFonts w:ascii="Calibri" w:hAnsi="Calibri" w:cs="Calibri"/>
+        </w:rPr>
+      </w:pPr>
+    </w:p>
+    <w:p>
+      <w:pPr>
+        <w:pStyle w:val="Heading3"/>
+        <w:numPr>
+          <w:ilvl w:val="0"/>
+          <w:numId w:val="4"/>
+        </w:numPr>
+        <w:pBdr>
+          <w:bottom w:val="single" w:sz="4" w:space="1" w:color="auto"/>
+        </w:pBdr>
+        <w:rPr>
+          <w:b/>
+          <w:bCs/>
+          <w:lang w:val="el-GR"/>
+        </w:rPr>
+      </w:pPr>
+      <w:r>
+        <w:rPr>
+          <w:b/>
+          <w:bCs/>
+        </w:rPr>
+        <w:t xml:space="preserve">Use Case </w:t>
+      </w:r>
+      <w:r>
+        <w:rPr>
+          <w:b/>
+          <w:bCs/>
+        </w:rPr>
+        <w:t>Detail</w:t>
+      </w:r>
+    </w:p>
+    <w:p>
+      <w:pPr>
+        <w:jc w:val="both"/>
+        <w:rPr>
+          <w:rFonts w:ascii="Calibri" w:hAnsi="Calibri" w:cs="Calibri"/>
+          <w:lang w:val="el-GR"/>
+        </w:rPr>
+      </w:pPr>
+      <w:r>
+        <w:rPr>
+          <w:rFonts w:ascii="Calibri" w:hAnsi="Calibri" w:cs="Calibri"/>
+          <w:lang w:val="el-GR"/>
+        </w:rPr>
+        <w:t>Στ</w:t>
+      </w:r>
+      <w:r>
+        <w:rPr>
+          <w:rFonts w:ascii="Calibri" w:hAnsi="Calibri" w:cs="Calibri"/>
+          <w:lang w:val="el-GR"/>
+        </w:rPr>
+        <w:t>ις</w:t>
+      </w:r>
+      <w:r>
+        <w:rPr>
+          <w:rFonts w:ascii="Calibri" w:hAnsi="Calibri" w:cs="Calibri"/>
+          <w:lang w:val="el-GR"/>
+        </w:rPr>
+        <w:t xml:space="preserve"> εικόν</w:t>
+      </w:r>
+      <w:r>
+        <w:rPr>
+          <w:rFonts w:ascii="Calibri" w:hAnsi="Calibri" w:cs="Calibri"/>
+          <w:lang w:val="el-GR"/>
+        </w:rPr>
+        <w:t>ες</w:t>
+      </w:r>
+      <w:r>
+        <w:rPr>
+          <w:rFonts w:ascii="Calibri" w:hAnsi="Calibri" w:cs="Calibri"/>
+          <w:lang w:val="el-GR"/>
+        </w:rPr>
+        <w:t xml:space="preserve"> </w:t>
+      </w:r>
+      <w:r>
+        <w:rPr>
+          <w:rFonts w:ascii="Calibri" w:hAnsi="Calibri" w:cs="Calibri"/>
+          <w:lang w:val="el-GR"/>
         </w:rPr>
         <w:t>5</w:t>
       </w:r>
       <w:r>
         <w:rPr>
           <w:rFonts w:ascii="Calibri" w:hAnsi="Calibri" w:cs="Calibri"/>
-        </w:rPr>
-        <w:fldChar w:fldCharType="end"/>
-      </w:r>
-      <w:r>
-        <w:rPr>
-          <w:rFonts w:ascii="Calibri" w:hAnsi="Calibri" w:cs="Calibri"/>
-          <w:lang w:val="el-GR"/>
-        </w:rPr>
-        <w:t xml:space="preserve">: </w:t>
-      </w:r>
-      <w:r>
-        <w:rPr>
-          <w:rFonts w:ascii="Calibri" w:hAnsi="Calibri" w:cs="Calibri"/>
-        </w:rPr>
-        <w:t>Create</w:t>
+          <w:lang w:val="el-GR"/>
+        </w:rPr>
+        <w:t xml:space="preserve">.1 και </w:t>
+      </w:r>
+      <w:r>
+        <w:rPr>
+          <w:rFonts w:ascii="Calibri" w:hAnsi="Calibri" w:cs="Calibri"/>
+          <w:lang w:val="el-GR"/>
+        </w:rPr>
+        <w:t>5</w:t>
+      </w:r>
+      <w:r>
+        <w:rPr>
+          <w:rFonts w:ascii="Calibri" w:hAnsi="Calibri" w:cs="Calibri"/>
+          <w:lang w:val="el-GR"/>
+        </w:rPr>
+        <w:t>.2 παρουσιάζουμε την αρχική και την τελική σχεδίαση αντίστοιχα, της οθόνης</w:t>
       </w:r>
       <w:r>
         <w:rPr>
@@ -3722,87 +4835,142 @@
         </w:rPr>
         <w:t>Case</w:t>
       </w:r>
-    </w:p>
-    <w:p>
-      <w:pPr>
-        <w:jc w:val="both"/>
-        <w:rPr>
-          <w:rFonts w:ascii="Calibri" w:hAnsi="Calibri" w:cs="Calibri"/>
-          <w:lang w:val="el-GR"/>
-        </w:rPr>
-      </w:pPr>
-    </w:p>
-    <w:p>
-      <w:pPr>
-        <w:jc w:val="both"/>
-        <w:rPr>
-          <w:rFonts w:ascii="Calibri" w:hAnsi="Calibri" w:cs="Calibri"/>
-          <w:lang w:val="el-GR"/>
-        </w:rPr>
-      </w:pPr>
-    </w:p>
-    <w:p>
-      <w:pPr>
-        <w:jc w:val="both"/>
-        <w:rPr>
-          <w:rFonts w:ascii="Calibri" w:hAnsi="Calibri" w:cs="Calibri"/>
-          <w:lang w:val="el-GR"/>
-        </w:rPr>
-      </w:pPr>
-    </w:p>
-    <w:p>
-      <w:pPr>
-        <w:jc w:val="both"/>
-        <w:rPr>
-          <w:rFonts w:ascii="Calibri" w:hAnsi="Calibri" w:cs="Calibri"/>
-          <w:lang w:val="el-GR"/>
-        </w:rPr>
-      </w:pPr>
-      <w:r>
-        <w:rPr>
-          <w:rFonts w:ascii="Calibri" w:hAnsi="Calibri" w:cs="Calibri"/>
-          <w:lang w:val="el-GR"/>
-        </w:rPr>
-        <w:t xml:space="preserve">Στην εικόνα 5 παρουσιάζουμε το </w:t>
-      </w:r>
-      <w:r>
-        <w:rPr>
-          <w:rFonts w:ascii="Calibri" w:hAnsi="Calibri" w:cs="Calibri"/>
-        </w:rPr>
-        <w:t>mock</w:t>
-      </w:r>
-      <w:r>
-        <w:rPr>
-          <w:rFonts w:ascii="Calibri" w:hAnsi="Calibri" w:cs="Calibri"/>
-          <w:lang w:val="el-GR"/>
-        </w:rPr>
-        <w:t>-</w:t>
-      </w:r>
-      <w:r>
-        <w:rPr>
-          <w:rFonts w:ascii="Calibri" w:hAnsi="Calibri" w:cs="Calibri"/>
-        </w:rPr>
-        <w:t>up</w:t>
-      </w:r>
-      <w:r>
-        <w:rPr>
-          <w:rFonts w:ascii="Calibri" w:hAnsi="Calibri" w:cs="Calibri"/>
-          <w:lang w:val="el-GR"/>
-        </w:rPr>
-        <w:t xml:space="preserve"> </w:t>
-      </w:r>
-      <w:r>
-        <w:rPr>
-          <w:rFonts w:ascii="Calibri" w:hAnsi="Calibri" w:cs="Calibri"/>
-        </w:rPr>
-        <w:t>screen</w:t>
-      </w:r>
-      <w:r>
-        <w:rPr>
-          <w:rFonts w:ascii="Calibri" w:hAnsi="Calibri" w:cs="Calibri"/>
-          <w:lang w:val="el-GR"/>
-        </w:rPr>
-        <w:t xml:space="preserve"> με τα πλήρη στοιχεία μιας απαίτησης χρήσης. Ο Developer και οι Collaborators μπορούν να την επεξεργαστούν ή να τη διαγράψουν. Κάθε απαίτηση φέρει μια κατάσταση έγκρισης: μπορεί να είναι σε αναμονή, εγκεκριμένη ή απορριφθείσα από τον Organization Owner, ο οποίος μπορεί να ζητήσει διορθώσεις μέσω σχολίων. Στο κάτω μέρος της οθόνης βρίσκεται η ενότητα σχολίων, όπου όλοι οι συμμετέχοντες μπορούν να αφήνουν παρατηρήσεις και feedback απευθείας πάνω στην απαίτηση.</w:t>
+      <w:r>
+        <w:rPr>
+          <w:rFonts w:ascii="Calibri" w:hAnsi="Calibri" w:cs="Calibri"/>
+          <w:lang w:val="el-GR"/>
+        </w:rPr>
+        <w:t xml:space="preserve"> </w:t>
+      </w:r>
+      <w:r>
+        <w:rPr>
+          <w:rFonts w:ascii="Calibri" w:hAnsi="Calibri" w:cs="Calibri"/>
+        </w:rPr>
+        <w:t>Detail</w:t>
+      </w:r>
+      <w:r>
+        <w:rPr>
+          <w:rFonts w:ascii="Calibri" w:hAnsi="Calibri" w:cs="Calibri"/>
+          <w:lang w:val="el-GR"/>
+        </w:rPr>
+        <w:t>.</w:t>
+      </w:r>
+      <w:r>
+        <w:rPr>
+          <w:rFonts w:ascii="Calibri" w:hAnsi="Calibri" w:cs="Calibri"/>
+          <w:lang w:val="el-GR"/>
+        </w:rPr>
+        <w:t xml:space="preserve"> </w:t>
+      </w:r>
+      <w:r>
+        <w:rPr>
+          <w:rFonts w:ascii="Calibri" w:hAnsi="Calibri" w:cs="Calibri"/>
+          <w:lang w:val="el-GR"/>
+        </w:rPr>
+        <w:t xml:space="preserve">Η σελίδα αυτή είναι υπεύθυνη για την </w:t>
+      </w:r>
+      <w:r>
+        <w:rPr>
+          <w:rFonts w:ascii="Calibri" w:hAnsi="Calibri" w:cs="Calibri"/>
+          <w:lang w:val="el-GR"/>
+        </w:rPr>
+        <w:t xml:space="preserve">προβολή ενός </w:t>
+      </w:r>
+      <w:r>
+        <w:rPr>
+          <w:rFonts w:ascii="Calibri" w:hAnsi="Calibri" w:cs="Calibri"/>
+        </w:rPr>
+        <w:t>use</w:t>
+      </w:r>
+      <w:r>
+        <w:rPr>
+          <w:rFonts w:ascii="Calibri" w:hAnsi="Calibri" w:cs="Calibri"/>
+          <w:lang w:val="el-GR"/>
+        </w:rPr>
+        <w:t xml:space="preserve"> </w:t>
+      </w:r>
+      <w:r>
+        <w:rPr>
+          <w:rFonts w:ascii="Calibri" w:hAnsi="Calibri" w:cs="Calibri"/>
+        </w:rPr>
+        <w:t>case</w:t>
+      </w:r>
+      <w:r>
+        <w:rPr>
+          <w:rFonts w:ascii="Calibri" w:hAnsi="Calibri" w:cs="Calibri"/>
+          <w:lang w:val="el-GR"/>
+        </w:rPr>
+        <w:t xml:space="preserve"> </w:t>
+      </w:r>
+      <w:r>
+        <w:rPr>
+          <w:rFonts w:ascii="Calibri" w:hAnsi="Calibri" w:cs="Calibri"/>
+          <w:lang w:val="el-GR"/>
+        </w:rPr>
+        <w:t>από τον χρήστη</w:t>
+      </w:r>
+      <w:r>
+        <w:rPr>
+          <w:rFonts w:ascii="Calibri" w:hAnsi="Calibri" w:cs="Calibri"/>
+          <w:lang w:val="el-GR"/>
+        </w:rPr>
+        <w:t>. Ο Developer και οι Collaborators μπορούν να επεξεργαστούν ή να διαγράψουν</w:t>
+      </w:r>
+      <w:r>
+        <w:rPr>
+          <w:rFonts w:ascii="Calibri" w:hAnsi="Calibri" w:cs="Calibri"/>
+          <w:lang w:val="el-GR"/>
+        </w:rPr>
+        <w:t xml:space="preserve"> τ</w:t>
+      </w:r>
+      <w:r>
+        <w:rPr>
+          <w:rFonts w:ascii="Calibri" w:hAnsi="Calibri" w:cs="Calibri"/>
+          <w:lang w:val="el-GR"/>
+        </w:rPr>
+        <w:t>η</w:t>
+      </w:r>
+      <w:r>
+        <w:rPr>
+          <w:rFonts w:ascii="Calibri" w:hAnsi="Calibri" w:cs="Calibri"/>
+          <w:lang w:val="el-GR"/>
+        </w:rPr>
+        <w:t xml:space="preserve"> συγκεκριμένη Περίπτωση Χρήσης</w:t>
+      </w:r>
+      <w:r>
+        <w:rPr>
+          <w:rFonts w:ascii="Calibri" w:hAnsi="Calibri" w:cs="Calibri"/>
+          <w:lang w:val="el-GR"/>
+        </w:rPr>
+        <w:t xml:space="preserve">. Κάθε </w:t>
+      </w:r>
+      <w:r>
+        <w:rPr>
+          <w:rFonts w:ascii="Calibri" w:hAnsi="Calibri" w:cs="Calibri"/>
+          <w:lang w:val="el-GR"/>
+        </w:rPr>
+        <w:t xml:space="preserve">Περίπτωση Χρήσης </w:t>
+      </w:r>
+      <w:r>
+        <w:rPr>
+          <w:rFonts w:ascii="Calibri" w:hAnsi="Calibri" w:cs="Calibri"/>
+          <w:lang w:val="el-GR"/>
+        </w:rPr>
+        <w:t xml:space="preserve">φέρει μια κατάσταση έγκρισης: μπορεί να είναι σε αναμονή, εγκεκριμένη ή απορριφθείσα από τον Organization Owner, ο οποίος μπορεί να ζητήσει διορθώσεις μέσω σχολίων. Στο κάτω μέρος της οθόνης βρίσκεται η ενότητα σχολίων, όπου όλοι οι συμμετέχοντες μπορούν να αφήνουν παρατηρήσεις και feedback απευθείας πάνω στην </w:t>
+      </w:r>
+      <w:r>
+        <w:rPr>
+          <w:rFonts w:ascii="Calibri" w:hAnsi="Calibri" w:cs="Calibri"/>
+          <w:lang w:val="el-GR"/>
+        </w:rPr>
+        <w:t>Περίπτωση χρήσης</w:t>
+      </w:r>
+      <w:r>
+        <w:rPr>
+          <w:rFonts w:ascii="Calibri" w:hAnsi="Calibri" w:cs="Calibri"/>
+          <w:lang w:val="el-GR"/>
+        </w:rPr>
+        <w:t>.</w:t>
       </w:r>
     </w:p>
     <w:p>
@@ -3843,7 +5011,7 @@
                     <pic:cNvPicPr/>
                   </pic:nvPicPr>
                   <pic:blipFill>
-                    <a:blip r:embed="rId16"/>
+                    <a:blip r:embed="rId19"/>
                     <a:stretch>
                       <a:fillRect/>
                     </a:stretch>
@@ -3884,66 +5052,422 @@
         <w:rPr>
           <w:rFonts w:ascii="Calibri" w:hAnsi="Calibri" w:cs="Calibri"/>
         </w:rPr>
+        <w:t>5.1</w:t>
+      </w:r>
+      <w:r>
+        <w:rPr>
+          <w:rFonts w:ascii="Calibri" w:hAnsi="Calibri" w:cs="Calibri"/>
+          <w:lang w:val="el-GR"/>
+        </w:rPr>
+        <w:t xml:space="preserve">: </w:t>
+      </w:r>
+      <w:r>
+        <w:rPr>
+          <w:rFonts w:ascii="Calibri" w:hAnsi="Calibri" w:cs="Calibri"/>
+          <w:lang w:val="el-GR"/>
+        </w:rPr>
+        <w:t xml:space="preserve">Αρχική Σχεδίαση </w:t>
+      </w:r>
+      <w:r>
+        <w:rPr>
+          <w:rFonts w:ascii="Calibri" w:hAnsi="Calibri" w:cs="Calibri"/>
+        </w:rPr>
+        <w:t>Use</w:t>
+      </w:r>
+      <w:r>
+        <w:rPr>
+          <w:rFonts w:ascii="Calibri" w:hAnsi="Calibri" w:cs="Calibri"/>
+          <w:lang w:val="el-GR"/>
+        </w:rPr>
+        <w:t xml:space="preserve"> </w:t>
+      </w:r>
+      <w:r>
+        <w:rPr>
+          <w:rFonts w:ascii="Calibri" w:hAnsi="Calibri" w:cs="Calibri"/>
+        </w:rPr>
+        <w:t>case</w:t>
+      </w:r>
+      <w:r>
+        <w:rPr>
+          <w:rFonts w:ascii="Calibri" w:hAnsi="Calibri" w:cs="Calibri"/>
+          <w:lang w:val="el-GR"/>
+        </w:rPr>
+        <w:t xml:space="preserve"> </w:t>
+      </w:r>
+      <w:r>
+        <w:rPr>
+          <w:rFonts w:ascii="Calibri" w:hAnsi="Calibri" w:cs="Calibri"/>
+        </w:rPr>
+        <w:t>Detail</w:t>
+      </w:r>
+    </w:p>
+    <w:p>
+      <w:pPr>
+        <w:pStyle w:val="Heading2"/>
+        <w:jc w:val="both"/>
+        <w:rPr>
+          <w:rFonts w:ascii="Calibri" w:hAnsi="Calibri" w:cs="Calibri"/>
+          <w:lang w:val="el-GR"/>
+        </w:rPr>
+      </w:pPr>
+    </w:p>
+    <w:p>
+      <w:pPr>
+        <w:rPr>
+          <w:rFonts w:ascii="Calibri" w:hAnsi="Calibri" w:cs="Calibri"/>
+          <w:lang w:val="el-GR"/>
+        </w:rPr>
+      </w:pPr>
+    </w:p>
+    <w:p>
+      <w:pPr>
+        <w:rPr>
+          <w:rFonts w:ascii="Calibri" w:hAnsi="Calibri" w:cs="Calibri"/>
+          <w:lang w:val="el-GR"/>
+        </w:rPr>
+      </w:pPr>
+    </w:p>
+    <w:p>
+      <w:pPr>
+        <w:rPr>
+          <w:rFonts w:ascii="Calibri" w:hAnsi="Calibri" w:cs="Calibri"/>
+          <w:lang w:val="el-GR"/>
+        </w:rPr>
+      </w:pPr>
+    </w:p>
+    <w:p>
+      <w:pPr>
+        <w:rPr>
+          <w:rFonts w:ascii="Calibri" w:hAnsi="Calibri" w:cs="Calibri"/>
+          <w:lang w:val="el-GR"/>
+        </w:rPr>
+      </w:pPr>
+    </w:p>
+    <w:p>
+      <w:pPr>
+        <w:keepNext/>
+        <w:jc w:val="center"/>
+      </w:pPr>
+      <w:r>
+        <w:drawing>
+          <wp:inline distT="0" distB="0" distL="0" distR="0" wp14:anchorId="5CCBBC16" wp14:editId="16474202">
+            <wp:extent cx="5943600" cy="3506470"/>
+            <wp:effectExtent l="0" t="0" r="0" b="0"/>
+            <wp:docPr id="1943196911" name="Picture 1"/>
+            <wp:cNvGraphicFramePr>
+              <a:graphicFrameLocks xmlns:a="http://schemas.openxmlformats.org/drawingml/2006/main" noChangeAspect="1"/>
+            </wp:cNvGraphicFramePr>
+            <a:graphic xmlns:a="http://schemas.openxmlformats.org/drawingml/2006/main">
+              <a:graphicData uri="http://schemas.openxmlformats.org/drawingml/2006/picture">
+                <pic:pic xmlns:pic="http://schemas.openxmlformats.org/drawingml/2006/picture">
+                  <pic:nvPicPr>
+                    <pic:cNvPr id="1943196911" name=""/>
+                    <pic:cNvPicPr/>
+                  </pic:nvPicPr>
+                  <pic:blipFill>
+                    <a:blip r:embed="rId20"/>
+                    <a:stretch>
+                      <a:fillRect/>
+                    </a:stretch>
+                  </pic:blipFill>
+                  <pic:spPr>
+                    <a:xfrm>
+                      <a:off x="0" y="0"/>
+                      <a:ext cx="5943600" cy="3506470"/>
+                    </a:xfrm>
+                    <a:prstGeom prst="rect">
+                      <a:avLst/>
+                    </a:prstGeom>
+                  </pic:spPr>
+                </pic:pic>
+              </a:graphicData>
+            </a:graphic>
+          </wp:inline>
+        </w:drawing>
+      </w:r>
+    </w:p>
+    <w:p>
+      <w:pPr>
+        <w:pStyle w:val="Caption"/>
+        <w:jc w:val="center"/>
+        <w:rPr>
+          <w:rFonts w:ascii="Calibri" w:hAnsi="Calibri" w:cs="Calibri"/>
+          <w:lang w:val="el-GR"/>
+        </w:rPr>
+      </w:pPr>
+      <w:r>
+        <w:t xml:space="preserve">Εικόνα </w:t>
+      </w:r>
+      <w:r>
         <w:fldChar w:fldCharType="begin"/>
       </w:r>
       <w:r>
-        <w:rPr>
-          <w:rFonts w:ascii="Calibri" w:hAnsi="Calibri" w:cs="Calibri"/>
-          <w:lang w:val="el-GR"/>
-        </w:rPr>
-        <w:instrText xml:space="preserve"> </w:instrText>
-      </w:r>
-      <w:r>
-        <w:rPr>
-          <w:rFonts w:ascii="Calibri" w:hAnsi="Calibri" w:cs="Calibri"/>
-        </w:rPr>
-        <w:instrText>SEQ</w:instrText>
-      </w:r>
-      <w:r>
-        <w:rPr>
-          <w:rFonts w:ascii="Calibri" w:hAnsi="Calibri" w:cs="Calibri"/>
-          <w:lang w:val="el-GR"/>
-        </w:rPr>
-        <w:instrText xml:space="preserve"> Εικόνα \* </w:instrText>
-      </w:r>
-      <w:r>
-        <w:rPr>
-          <w:rFonts w:ascii="Calibri" w:hAnsi="Calibri" w:cs="Calibri"/>
-        </w:rPr>
-        <w:instrText>ARABIC</w:instrText>
-      </w:r>
-      <w:r>
-        <w:rPr>
-          <w:rFonts w:ascii="Calibri" w:hAnsi="Calibri" w:cs="Calibri"/>
-          <w:lang w:val="el-GR"/>
-        </w:rPr>
-        <w:instrText xml:space="preserve"> </w:instrText>
-      </w:r>
-      <w:r>
-        <w:rPr>
-          <w:rFonts w:ascii="Calibri" w:hAnsi="Calibri" w:cs="Calibri"/>
-        </w:rPr>
+        <w:instrText xml:space="preserve"> SEQ Εικόνα \* ARABIC </w:instrText>
+      </w:r>
+      <w:r>
         <w:fldChar w:fldCharType="separate"/>
       </w:r>
       <w:r>
         <w:rPr>
-          <w:rFonts w:ascii="Calibri" w:hAnsi="Calibri" w:cs="Calibri"/>
           <w:noProof/>
         </w:rPr>
+        <w:t>5</w:t>
+      </w:r>
+      <w:r>
+        <w:fldChar w:fldCharType="end"/>
+      </w:r>
+      <w:r>
+        <w:rPr>
+          <w:lang w:val="el-GR"/>
+        </w:rPr>
+        <w:t xml:space="preserve">.2: Τελική οθόνη </w:t>
+      </w:r>
+      <w:r>
+        <w:rPr>
+          <w:rFonts w:ascii="Calibri" w:hAnsi="Calibri" w:cs="Calibri"/>
+        </w:rPr>
+        <w:t>Use</w:t>
+      </w:r>
+      <w:r>
+        <w:rPr>
+          <w:rFonts w:ascii="Calibri" w:hAnsi="Calibri" w:cs="Calibri"/>
+          <w:lang w:val="el-GR"/>
+        </w:rPr>
+        <w:t xml:space="preserve"> </w:t>
+      </w:r>
+      <w:r>
+        <w:rPr>
+          <w:rFonts w:ascii="Calibri" w:hAnsi="Calibri" w:cs="Calibri"/>
+        </w:rPr>
+        <w:t>case</w:t>
+      </w:r>
+      <w:r>
+        <w:rPr>
+          <w:rFonts w:ascii="Calibri" w:hAnsi="Calibri" w:cs="Calibri"/>
+          <w:lang w:val="el-GR"/>
+        </w:rPr>
+        <w:t xml:space="preserve"> </w:t>
+      </w:r>
+      <w:r>
+        <w:rPr>
+          <w:rFonts w:ascii="Calibri" w:hAnsi="Calibri" w:cs="Calibri"/>
+        </w:rPr>
+        <w:t>Detail</w:t>
+      </w:r>
+    </w:p>
+    <w:p>
+      <w:pPr>
+        <w:rPr>
+          <w:rFonts w:ascii="Calibri" w:hAnsi="Calibri" w:cs="Calibri"/>
+          <w:lang w:val="el-GR"/>
+        </w:rPr>
+      </w:pPr>
+    </w:p>
+    <w:p>
+      <w:pPr>
+        <w:rPr>
+          <w:rFonts w:ascii="Calibri" w:hAnsi="Calibri" w:cs="Calibri"/>
+          <w:lang w:val="el-GR"/>
+        </w:rPr>
+      </w:pPr>
+    </w:p>
+    <w:p>
+      <w:pPr>
+        <w:rPr>
+          <w:rFonts w:ascii="Calibri" w:hAnsi="Calibri" w:cs="Calibri"/>
+          <w:lang w:val="el-GR"/>
+        </w:rPr>
+      </w:pPr>
+    </w:p>
+    <w:p>
+      <w:pPr>
+        <w:rPr>
+          <w:rFonts w:ascii="Calibri" w:hAnsi="Calibri" w:cs="Calibri"/>
+          <w:lang w:val="el-GR"/>
+        </w:rPr>
+      </w:pPr>
+    </w:p>
+    <w:p>
+      <w:pPr>
+        <w:rPr>
+          <w:rFonts w:ascii="Calibri" w:hAnsi="Calibri" w:cs="Calibri"/>
+          <w:lang w:val="el-GR"/>
+        </w:rPr>
+      </w:pPr>
+    </w:p>
+    <w:p>
+      <w:pPr>
+        <w:rPr>
+          <w:rFonts w:ascii="Calibri" w:hAnsi="Calibri" w:cs="Calibri"/>
+          <w:lang w:val="el-GR"/>
+        </w:rPr>
+      </w:pPr>
+    </w:p>
+    <w:p>
+      <w:pPr>
+        <w:rPr>
+          <w:rFonts w:ascii="Calibri" w:hAnsi="Calibri" w:cs="Calibri"/>
+          <w:lang w:val="el-GR"/>
+        </w:rPr>
+      </w:pPr>
+    </w:p>
+    <w:p>
+      <w:pPr>
+        <w:rPr>
+          <w:rFonts w:ascii="Calibri" w:hAnsi="Calibri" w:cs="Calibri"/>
+          <w:lang w:val="el-GR"/>
+        </w:rPr>
+      </w:pPr>
+    </w:p>
+    <w:p>
+      <w:pPr>
+        <w:rPr>
+          <w:rFonts w:ascii="Calibri" w:hAnsi="Calibri" w:cs="Calibri"/>
+          <w:lang w:val="el-GR"/>
+        </w:rPr>
+      </w:pPr>
+    </w:p>
+    <w:p>
+      <w:pPr>
+        <w:rPr>
+          <w:rFonts w:ascii="Calibri" w:hAnsi="Calibri" w:cs="Calibri"/>
+          <w:lang w:val="el-GR"/>
+        </w:rPr>
+      </w:pPr>
+    </w:p>
+    <w:p>
+      <w:pPr>
+        <w:rPr>
+          <w:rFonts w:ascii="Calibri" w:hAnsi="Calibri" w:cs="Calibri"/>
+          <w:lang w:val="el-GR"/>
+        </w:rPr>
+      </w:pPr>
+    </w:p>
+    <w:p>
+      <w:pPr>
+        <w:rPr>
+          <w:rFonts w:ascii="Calibri" w:hAnsi="Calibri" w:cs="Calibri"/>
+          <w:lang w:val="el-GR"/>
+        </w:rPr>
+      </w:pPr>
+    </w:p>
+    <w:p>
+      <w:pPr>
+        <w:rPr>
+          <w:rFonts w:ascii="Calibri" w:hAnsi="Calibri" w:cs="Calibri"/>
+          <w:lang w:val="el-GR"/>
+        </w:rPr>
+      </w:pPr>
+    </w:p>
+    <w:p>
+      <w:pPr>
+        <w:rPr>
+          <w:rFonts w:ascii="Calibri" w:hAnsi="Calibri" w:cs="Calibri"/>
+          <w:lang w:val="el-GR"/>
+        </w:rPr>
+      </w:pPr>
+    </w:p>
+    <w:p>
+      <w:pPr>
+        <w:pStyle w:val="Heading3"/>
+        <w:numPr>
+          <w:ilvl w:val="0"/>
+          <w:numId w:val="4"/>
+        </w:numPr>
+        <w:pBdr>
+          <w:bottom w:val="single" w:sz="4" w:space="1" w:color="auto"/>
+        </w:pBdr>
+        <w:rPr>
+          <w:b/>
+          <w:bCs/>
+          <w:lang w:val="el-GR"/>
+        </w:rPr>
+      </w:pPr>
+      <w:r>
+        <w:rPr>
+          <w:b/>
+          <w:bCs/>
+        </w:rPr>
+        <w:t>CRC Card Form</w:t>
+      </w:r>
+    </w:p>
+    <w:p>
+      <w:pPr>
+        <w:jc w:val="both"/>
+        <w:rPr>
+          <w:rFonts w:ascii="Calibri" w:hAnsi="Calibri" w:cs="Calibri"/>
+          <w:lang w:val="el-GR"/>
+        </w:rPr>
+      </w:pPr>
+      <w:r>
+        <w:rPr>
+          <w:rFonts w:ascii="Calibri" w:hAnsi="Calibri" w:cs="Calibri"/>
+          <w:lang w:val="el-GR"/>
+        </w:rPr>
+        <w:t>Στ</w:t>
+      </w:r>
+      <w:r>
+        <w:rPr>
+          <w:rFonts w:ascii="Calibri" w:hAnsi="Calibri" w:cs="Calibri"/>
+          <w:lang w:val="el-GR"/>
+        </w:rPr>
+        <w:t>ις</w:t>
+      </w:r>
+      <w:r>
+        <w:rPr>
+          <w:rFonts w:ascii="Calibri" w:hAnsi="Calibri" w:cs="Calibri"/>
+          <w:lang w:val="el-GR"/>
+        </w:rPr>
+        <w:t xml:space="preserve"> εικόν</w:t>
+      </w:r>
+      <w:r>
+        <w:rPr>
+          <w:rFonts w:ascii="Calibri" w:hAnsi="Calibri" w:cs="Calibri"/>
+          <w:lang w:val="el-GR"/>
+        </w:rPr>
+        <w:t>ες</w:t>
+      </w:r>
+      <w:r>
+        <w:rPr>
+          <w:rFonts w:ascii="Calibri" w:hAnsi="Calibri" w:cs="Calibri"/>
+          <w:lang w:val="el-GR"/>
+        </w:rPr>
+        <w:t xml:space="preserve"> </w:t>
+      </w:r>
+      <w:r>
+        <w:rPr>
+          <w:rFonts w:ascii="Calibri" w:hAnsi="Calibri" w:cs="Calibri"/>
+          <w:lang w:val="el-GR"/>
+        </w:rPr>
         <w:t>6</w:t>
       </w:r>
       <w:r>
         <w:rPr>
           <w:rFonts w:ascii="Calibri" w:hAnsi="Calibri" w:cs="Calibri"/>
-        </w:rPr>
-        <w:fldChar w:fldCharType="end"/>
-      </w:r>
-      <w:r>
-        <w:rPr>
-          <w:rFonts w:ascii="Calibri" w:hAnsi="Calibri" w:cs="Calibri"/>
-          <w:lang w:val="el-GR"/>
-        </w:rPr>
-        <w:t xml:space="preserve">: </w:t>
+          <w:lang w:val="el-GR"/>
+        </w:rPr>
+        <w:t xml:space="preserve">.1 και </w:t>
+      </w:r>
+      <w:r>
+        <w:rPr>
+          <w:rFonts w:ascii="Calibri" w:hAnsi="Calibri" w:cs="Calibri"/>
+          <w:lang w:val="el-GR"/>
+        </w:rPr>
+        <w:t>6</w:t>
+      </w:r>
+      <w:r>
+        <w:rPr>
+          <w:rFonts w:ascii="Calibri" w:hAnsi="Calibri" w:cs="Calibri"/>
+          <w:lang w:val="el-GR"/>
+        </w:rPr>
+        <w:t>.2 παρουσιάζουμε την αρχική και την τελική σχεδίαση αντίστοιχα, της οθόνης</w:t>
+      </w:r>
+      <w:r>
+        <w:rPr>
+          <w:rFonts w:ascii="Calibri" w:hAnsi="Calibri" w:cs="Calibri"/>
+          <w:lang w:val="el-GR"/>
+        </w:rPr>
+        <w:t xml:space="preserve"> </w:t>
       </w:r>
       <w:r>
         <w:rPr>
@@ -3962,6 +5486,59 @@
         <w:rPr>
           <w:rFonts w:ascii="Calibri" w:hAnsi="Calibri" w:cs="Calibri"/>
         </w:rPr>
+        <w:t>Case</w:t>
+      </w:r>
+      <w:r>
+        <w:rPr>
+          <w:rFonts w:ascii="Calibri" w:hAnsi="Calibri" w:cs="Calibri"/>
+          <w:lang w:val="el-GR"/>
+        </w:rPr>
+        <w:t xml:space="preserve"> </w:t>
+      </w:r>
+      <w:r>
+        <w:rPr>
+          <w:rFonts w:ascii="Calibri" w:hAnsi="Calibri" w:cs="Calibri"/>
+        </w:rPr>
+        <w:t>Form</w:t>
+      </w:r>
+      <w:r>
+        <w:rPr>
+          <w:rFonts w:ascii="Calibri" w:hAnsi="Calibri" w:cs="Calibri"/>
+          <w:lang w:val="el-GR"/>
+        </w:rPr>
+        <w:t>.</w:t>
+      </w:r>
+      <w:r>
+        <w:rPr>
+          <w:rFonts w:ascii="Calibri" w:hAnsi="Calibri" w:cs="Calibri"/>
+          <w:lang w:val="el-GR"/>
+        </w:rPr>
+        <w:t xml:space="preserve"> </w:t>
+      </w:r>
+      <w:r>
+        <w:rPr>
+          <w:rFonts w:ascii="Calibri" w:hAnsi="Calibri" w:cs="Calibri"/>
+          <w:lang w:val="el-GR"/>
+        </w:rPr>
+        <w:t xml:space="preserve">Η σελίδα αυτή είναι υπεύθυνη για την δημιουργία ενός καινούργιου </w:t>
+      </w:r>
+      <w:r>
+        <w:rPr>
+          <w:rFonts w:ascii="Calibri" w:hAnsi="Calibri" w:cs="Calibri"/>
+        </w:rPr>
+        <w:t>use</w:t>
+      </w:r>
+      <w:r>
+        <w:rPr>
+          <w:rFonts w:ascii="Calibri" w:hAnsi="Calibri" w:cs="Calibri"/>
+          <w:lang w:val="el-GR"/>
+        </w:rPr>
+        <w:t xml:space="preserve"> </w:t>
+      </w:r>
+      <w:r>
+        <w:rPr>
+          <w:rFonts w:ascii="Calibri" w:hAnsi="Calibri" w:cs="Calibri"/>
+        </w:rPr>
         <w:t>case</w:t>
       </w:r>
       <w:r>
@@ -3974,90 +5551,39 @@
       <w:r>
         <w:rPr>
           <w:rFonts w:ascii="Calibri" w:hAnsi="Calibri" w:cs="Calibri"/>
-        </w:rPr>
-        <w:t>Detail</w:t>
-      </w:r>
-    </w:p>
-    <w:p>
-      <w:pPr>
-        <w:pStyle w:val="Heading2"/>
-        <w:jc w:val="both"/>
-        <w:rPr>
-          <w:rFonts w:ascii="Calibri" w:hAnsi="Calibri" w:cs="Calibri"/>
-          <w:lang w:val="el-GR"/>
-        </w:rPr>
-      </w:pPr>
-    </w:p>
-    <w:p>
-      <w:pPr>
-        <w:rPr>
-          <w:rFonts w:ascii="Calibri" w:hAnsi="Calibri" w:cs="Calibri"/>
-          <w:lang w:val="el-GR"/>
-        </w:rPr>
-      </w:pPr>
-    </w:p>
-    <w:p>
-      <w:pPr>
-        <w:rPr>
-          <w:rFonts w:ascii="Calibri" w:hAnsi="Calibri" w:cs="Calibri"/>
-          <w:lang w:val="el-GR"/>
-        </w:rPr>
-      </w:pPr>
-    </w:p>
-    <w:p>
-      <w:pPr>
-        <w:rPr>
-          <w:rFonts w:ascii="Calibri" w:hAnsi="Calibri" w:cs="Calibri"/>
-          <w:lang w:val="el-GR"/>
-        </w:rPr>
-      </w:pPr>
-    </w:p>
-    <w:p>
-      <w:pPr>
-        <w:rPr>
-          <w:rFonts w:ascii="Calibri" w:hAnsi="Calibri" w:cs="Calibri"/>
-          <w:lang w:val="el-GR"/>
-        </w:rPr>
-      </w:pPr>
-    </w:p>
-    <w:p>
-      <w:pPr>
-        <w:rPr>
-          <w:rFonts w:ascii="Calibri" w:hAnsi="Calibri" w:cs="Calibri"/>
-          <w:lang w:val="el-GR"/>
-        </w:rPr>
-      </w:pPr>
-    </w:p>
-    <w:p>
-      <w:pPr>
-        <w:rPr>
-          <w:rFonts w:ascii="Calibri" w:hAnsi="Calibri" w:cs="Calibri"/>
-          <w:lang w:val="el-GR"/>
-        </w:rPr>
-      </w:pPr>
-    </w:p>
-    <w:p>
-      <w:pPr>
-        <w:rPr>
-          <w:rFonts w:ascii="Calibri" w:hAnsi="Calibri" w:cs="Calibri"/>
-          <w:lang w:val="el-GR"/>
-        </w:rPr>
-      </w:pPr>
-    </w:p>
-    <w:p>
-      <w:pPr>
-        <w:jc w:val="both"/>
-        <w:rPr>
-          <w:rFonts w:ascii="Calibri" w:hAnsi="Calibri" w:cs="Calibri"/>
-          <w:lang w:val="el-GR"/>
-        </w:rPr>
-      </w:pPr>
-      <w:r>
-        <w:rPr>
-          <w:rFonts w:ascii="Calibri" w:hAnsi="Calibri" w:cs="Calibri"/>
-          <w:lang w:val="el-GR"/>
-        </w:rPr>
-        <w:t xml:space="preserve">Στην εικόνα 6 παρουσιάζουμε το </w:t>
+          <w:lang w:val="el-GR"/>
+        </w:rPr>
+        <w:t>από τον χρήστη.</w:t>
+      </w:r>
+      <w:r>
+        <w:rPr>
+          <w:rFonts w:ascii="Calibri" w:hAnsi="Calibri" w:cs="Calibri"/>
+          <w:lang w:val="el-GR"/>
+        </w:rPr>
+        <w:t xml:space="preserve"> </w:t>
+      </w:r>
+      <w:r>
+        <w:rPr>
+          <w:rFonts w:ascii="Calibri" w:hAnsi="Calibri" w:cs="Calibri"/>
+          <w:lang w:val="el-GR"/>
+        </w:rPr>
+        <w:t>Ο χρήστης ορίζει το όνομά της, επιλέγει ποιοι χρήστες του συστήματος εμπλέκονται και περιγράφει την προϋπόθεση, τη βασική ροή, τις εναλλακτικές ροές και το αποτέλεσμα.</w:t>
+      </w:r>
+    </w:p>
+    <w:p>
+      <w:pPr>
+        <w:jc w:val="both"/>
+        <w:rPr>
+          <w:rFonts w:ascii="Calibri" w:hAnsi="Calibri" w:cs="Calibri"/>
+          <w:lang w:val="el-GR"/>
+        </w:rPr>
+      </w:pPr>
+      <w:r>
+        <w:rPr>
+          <w:rFonts w:ascii="Calibri" w:hAnsi="Calibri" w:cs="Calibri"/>
+          <w:lang w:val="el-GR"/>
+        </w:rPr>
+        <w:t xml:space="preserve">παρουσιάζουμε το </w:t>
       </w:r>
       <w:r>
         <w:rPr>
@@ -4134,7 +5660,7 @@
                     <pic:cNvPicPr/>
                   </pic:nvPicPr>
                   <pic:blipFill>
-                    <a:blip r:embed="rId17"/>
+                    <a:blip r:embed="rId21"/>
                     <a:stretch>
                       <a:fillRect/>
                     </a:stretch>
@@ -4220,8 +5746,9 @@
         <w:rPr>
           <w:rFonts w:ascii="Calibri" w:hAnsi="Calibri" w:cs="Calibri"/>
           <w:noProof/>
-        </w:rPr>
-        <w:t>7</w:t>
+          <w:lang w:val="el-GR"/>
+        </w:rPr>
+        <w:t>6</w:t>
       </w:r>
       <w:r>
         <w:rPr>
@@ -4234,6 +5761,13 @@
           <w:rFonts w:ascii="Calibri" w:hAnsi="Calibri" w:cs="Calibri"/>
           <w:lang w:val="el-GR"/>
         </w:rPr>
+        <w:t>.1</w:t>
+      </w:r>
+      <w:r>
+        <w:rPr>
+          <w:rFonts w:ascii="Calibri" w:hAnsi="Calibri" w:cs="Calibri"/>
+          <w:lang w:val="el-GR"/>
+        </w:rPr>
         <w:t>:</w:t>
       </w:r>
       <w:r>
@@ -4246,15 +5780,9 @@
       <w:r>
         <w:rPr>
           <w:rFonts w:ascii="Calibri" w:hAnsi="Calibri" w:cs="Calibri"/>
-        </w:rPr>
-        <w:t>Create</w:t>
-      </w:r>
-      <w:r>
-        <w:rPr>
-          <w:rFonts w:ascii="Calibri" w:hAnsi="Calibri" w:cs="Calibri"/>
-          <w:lang w:val="el-GR"/>
-        </w:rPr>
-        <w:t xml:space="preserve"> </w:t>
+          <w:lang w:val="el-GR"/>
+        </w:rPr>
+        <w:t xml:space="preserve">Αρχική </w:t>
       </w:r>
       <w:r>
         <w:rPr>
@@ -4273,7 +5801,26 @@
         <w:rPr>
           <w:rFonts w:ascii="Calibri" w:hAnsi="Calibri" w:cs="Calibri"/>
         </w:rPr>
-        <w:t>card</w:t>
+        <w:t>C</w:t>
+      </w:r>
+      <w:r>
+        <w:rPr>
+          <w:rFonts w:ascii="Calibri" w:hAnsi="Calibri" w:cs="Calibri"/>
+        </w:rPr>
+        <w:t>ard</w:t>
+      </w:r>
+      <w:r>
+        <w:rPr>
+          <w:rFonts w:ascii="Calibri" w:hAnsi="Calibri" w:cs="Calibri"/>
+          <w:lang w:val="el-GR"/>
+        </w:rPr>
+        <w:t xml:space="preserve"> </w:t>
+      </w:r>
+      <w:r>
+        <w:rPr>
+          <w:rFonts w:ascii="Calibri" w:hAnsi="Calibri" w:cs="Calibri"/>
+        </w:rPr>
+        <w:t>Form</w:t>
       </w:r>
     </w:p>
     <w:p>
@@ -4439,7 +5986,7 @@
                     <pic:cNvPicPr/>
                   </pic:nvPicPr>
                   <pic:blipFill>
-                    <a:blip r:embed="rId18"/>
+                    <a:blip r:embed="rId22"/>
                     <a:stretch>
                       <a:fillRect/>
                     </a:stretch>
@@ -4526,7 +6073,7 @@
           <w:rFonts w:ascii="Calibri" w:hAnsi="Calibri" w:cs="Calibri"/>
           <w:noProof/>
         </w:rPr>
-        <w:t>8</w:t>
+        <w:t>7</w:t>
       </w:r>
       <w:r>
         <w:rPr>
@@ -4725,7 +6272,7 @@
                     <pic:cNvPicPr/>
                   </pic:nvPicPr>
                   <pic:blipFill>
-                    <a:blip r:embed="rId19"/>
+                    <a:blip r:embed="rId23"/>
                     <a:stretch>
                       <a:fillRect/>
                     </a:stretch>
@@ -4812,7 +6359,7 @@
           <w:rFonts w:ascii="Calibri" w:hAnsi="Calibri" w:cs="Calibri"/>
           <w:noProof/>
         </w:rPr>
-        <w:t>9</w:t>
+        <w:t>8</w:t>
       </w:r>
       <w:r>
         <w:rPr>
@@ -4960,7 +6507,7 @@
                     <pic:cNvPicPr/>
                   </pic:nvPicPr>
                   <pic:blipFill>
-                    <a:blip r:embed="rId20"/>
+                    <a:blip r:embed="rId24"/>
                     <a:stretch>
                       <a:fillRect/>
                     </a:stretch>
@@ -5047,7 +6594,7 @@
           <w:rFonts w:ascii="Calibri" w:hAnsi="Calibri" w:cs="Calibri"/>
           <w:noProof/>
         </w:rPr>
-        <w:t>10</w:t>
+        <w:t>9</w:t>
       </w:r>
       <w:r>
         <w:rPr>
@@ -5199,7 +6746,7 @@
                     <pic:cNvPicPr/>
                   </pic:nvPicPr>
                   <pic:blipFill>
-                    <a:blip r:embed="rId21"/>
+                    <a:blip r:embed="rId25"/>
                     <a:stretch>
                       <a:fillRect/>
                     </a:stretch>
@@ -5286,7 +6833,7 @@
           <w:rFonts w:ascii="Calibri" w:hAnsi="Calibri" w:cs="Calibri"/>
           <w:noProof/>
         </w:rPr>
-        <w:t>11</w:t>
+        <w:t>10</w:t>
       </w:r>
       <w:r>
         <w:rPr>
@@ -5451,7 +6998,7 @@
         </w:rPr>
         <w:t xml:space="preserve"> της εφαρμογής δημιουργήθηκε μέσω του </w:t>
       </w:r>
-      <w:hyperlink r:id="rId22" w:history="1">
+      <w:hyperlink r:id="rId26" w:history="1">
         <w:r>
           <w:rPr>
             <w:rStyle w:val="Hyperlink"/>
@@ -5506,7 +7053,7 @@
         </w:rPr>
         <w:t xml:space="preserve"> υλοποιήθηκαν με τη χρήση του εργαλείου </w:t>
       </w:r>
-      <w:hyperlink r:id="rId23" w:history="1">
+      <w:hyperlink r:id="rId27" w:history="1">
         <w:r>
           <w:rPr>
             <w:rStyle w:val="Hyperlink"/>
@@ -5540,8 +7087,8 @@
       </w:pPr>
     </w:p>
     <w:sectPr>
-      <w:headerReference w:type="default" r:id="rId24"/>
-      <w:footerReference w:type="default" r:id="rId25"/>
+      <w:headerReference w:type="default" r:id="rId28"/>
+      <w:footerReference w:type="default" r:id="rId29"/>
       <w:pgSz w:w="12240" w:h="15840"/>
       <w:pgMar w:top="1440" w:right="1440" w:bottom="1440" w:left="1440" w:header="720" w:footer="720" w:gutter="0"/>
       <w:cols w:space="720"/>
@@ -6799,6 +8346,7 @@
   <w:style w:type="character" w:default="1" w:styleId="DefaultParagraphFont">
     <w:name w:val="Default Paragraph Font"/>
     <w:uiPriority w:val="1"/>
+    <w:semiHidden/>
     <w:unhideWhenUsed/>
   </w:style>
   <w:style w:type="table" w:default="1" w:styleId="TableNormal">

</xml_diff>

<commit_message>
feat: update project description file for the 4th phase
</commit_message>
<xml_diff>
--- a/4th_phase/Project-description-v1.0.docx
+++ b/4th_phase/Project-description-v1.0.docx
@@ -1852,7 +1852,28 @@
           <w:rFonts w:ascii="Calibri" w:hAnsi="Calibri" w:cs="Calibri"/>
           <w:lang w:val="el-GR"/>
         </w:rPr>
-        <w:t xml:space="preserve"> της εφαρμογής μας:</w:t>
+        <w:t xml:space="preserve"> της εφαρμογής μας</w:t>
+      </w:r>
+      <w:r>
+        <w:rPr>
+          <w:rFonts w:ascii="Calibri" w:hAnsi="Calibri" w:cs="Calibri"/>
+          <w:lang w:val="el-GR"/>
+        </w:rPr>
+        <w:t xml:space="preserve"> </w:t>
+      </w:r>
+      <w:r>
+        <w:rPr>
+          <w:rFonts w:ascii="Calibri" w:hAnsi="Calibri" w:cs="Calibri"/>
+          <w:lang w:val="el-GR"/>
+        </w:rPr>
+        <w:t>αλλά και τις τελικές οθόνες που υλοποιήσαμε μαζί με ενδεικτικές εισόδους που συμπληρώθηκαν κατά την εκτέλεση της εφαρμογής</w:t>
+      </w:r>
+      <w:r>
+        <w:rPr>
+          <w:rFonts w:ascii="Calibri" w:hAnsi="Calibri" w:cs="Calibri"/>
+          <w:lang w:val="el-GR"/>
+        </w:rPr>
+        <w:t>:</w:t>
       </w:r>
     </w:p>
     <w:p>
@@ -2214,6 +2235,7 @@
         <w:rPr>
           <w:rFonts w:ascii="Calibri" w:hAnsi="Calibri" w:cs="Calibri"/>
           <w:noProof/>
+          <w:lang w:val="el-GR"/>
         </w:rPr>
         <w:t>1</w:t>
       </w:r>
@@ -2401,6 +2423,7 @@
         <w:rPr>
           <w:rFonts w:ascii="Calibri" w:hAnsi="Calibri" w:cs="Calibri"/>
           <w:noProof/>
+          <w:lang w:val="el-GR"/>
         </w:rPr>
         <w:t>2</w:t>
       </w:r>
@@ -2787,21 +2810,7 @@
             <w:rStyle w:val="Hyperlink"/>
             <w:rFonts w:ascii="Calibri" w:hAnsi="Calibri" w:cs="Calibri"/>
           </w:rPr>
-          <w:t>Proj</w:t>
-        </w:r>
-        <w:r>
-          <w:rPr>
-            <w:rStyle w:val="Hyperlink"/>
-            <w:rFonts w:ascii="Calibri" w:hAnsi="Calibri" w:cs="Calibri"/>
-          </w:rPr>
-          <w:t>e</w:t>
-        </w:r>
-        <w:r>
-          <w:rPr>
-            <w:rStyle w:val="Hyperlink"/>
-            <w:rFonts w:ascii="Calibri" w:hAnsi="Calibri" w:cs="Calibri"/>
-          </w:rPr>
-          <w:t>ct</w:t>
+          <w:t>Project</w:t>
         </w:r>
         <w:r>
           <w:rPr>
@@ -3147,7 +3156,6 @@
         <w:jc w:val="both"/>
         <w:rPr>
           <w:rFonts w:ascii="Calibri" w:hAnsi="Calibri" w:cs="Calibri"/>
-          <w:lang w:val="el-GR"/>
         </w:rPr>
       </w:pPr>
     </w:p>
@@ -3514,21 +3522,7 @@
           <w:rFonts w:ascii="Calibri" w:hAnsi="Calibri" w:cs="Calibri"/>
           <w:lang w:val="el-GR"/>
         </w:rPr>
-        <w:t xml:space="preserve">όπως φαίνεται από την </w:t>
-      </w:r>
-      <w:r>
-        <w:rPr>
-          <w:rFonts w:ascii="Calibri" w:hAnsi="Calibri" w:cs="Calibri"/>
-          <w:lang w:val="el-GR"/>
-        </w:rPr>
-        <w:t>εικόνα 3.2</w:t>
-      </w:r>
-      <w:r>
-        <w:rPr>
-          <w:rFonts w:ascii="Calibri" w:hAnsi="Calibri" w:cs="Calibri"/>
-          <w:lang w:val="el-GR"/>
-        </w:rPr>
-        <w:t xml:space="preserve">. Ο </w:t>
+        <w:t xml:space="preserve">όπως φαίνεται από την εικόνα 3.2. Ο </w:t>
       </w:r>
       <w:r>
         <w:rPr>
@@ -3778,6 +3772,9 @@
         <w:jc w:val="center"/>
       </w:pPr>
       <w:r>
+        <w:rPr>
+          <w:noProof/>
+        </w:rPr>
         <w:lastRenderedPageBreak/>
         <w:drawing>
           <wp:inline distT="0" distB="0" distL="0" distR="0" wp14:anchorId="275D30EB" wp14:editId="0475614C">
@@ -3915,6 +3912,7 @@
       </w:pPr>
       <w:r>
         <w:rPr>
+          <w:noProof/>
           <w:lang w:val="el-GR"/>
         </w:rPr>
         <w:lastRenderedPageBreak/>
@@ -3979,13 +3977,7 @@
         <w:rPr>
           <w:lang w:val="el-GR"/>
         </w:rPr>
-        <w:t xml:space="preserve">.3: </w:t>
-      </w:r>
-      <w:r>
-        <w:rPr>
-          <w:lang w:val="el-GR"/>
-        </w:rPr>
-        <w:t xml:space="preserve">Τελική οθόνη </w:t>
+        <w:t xml:space="preserve">.3: Τελική οθόνη </w:t>
       </w:r>
       <w:r>
         <w:t>Project</w:t>
@@ -4003,19 +3995,7 @@
         <w:rPr>
           <w:lang w:val="el-GR"/>
         </w:rPr>
-        <w:t xml:space="preserve"> (Συνδεδεμένος ως </w:t>
-      </w:r>
-      <w:r>
-        <w:rPr>
-          <w:lang w:val="el-GR"/>
-        </w:rPr>
-        <w:t>Προγραμματιστής</w:t>
-      </w:r>
-      <w:r>
-        <w:rPr>
-          <w:lang w:val="el-GR"/>
-        </w:rPr>
-        <w:t>)</w:t>
+        <w:t xml:space="preserve"> (Συνδεδεμένος ως Προγραμματιστής)</w:t>
       </w:r>
     </w:p>
     <w:p>
@@ -4498,6 +4478,7 @@
       <w:r>
         <w:rPr>
           <w:rFonts w:ascii="Calibri" w:hAnsi="Calibri" w:cs="Calibri"/>
+          <w:noProof/>
           <w:lang w:val="el-GR"/>
         </w:rPr>
         <w:lastRenderedPageBreak/>
@@ -4558,14 +4539,7 @@
           <w:rFonts w:ascii="Calibri" w:hAnsi="Calibri" w:cs="Calibri"/>
           <w:lang w:val="el-GR"/>
         </w:rPr>
-        <w:t>Τελική οθόνη</w:t>
-      </w:r>
-      <w:r>
-        <w:rPr>
-          <w:rFonts w:ascii="Calibri" w:hAnsi="Calibri" w:cs="Calibri"/>
-          <w:lang w:val="el-GR"/>
-        </w:rPr>
-        <w:t xml:space="preserve"> </w:t>
+        <w:t xml:space="preserve">Τελική οθόνη </w:t>
       </w:r>
       <w:r>
         <w:rPr>
@@ -4704,6 +4678,7 @@
         <w:jc w:val="both"/>
         <w:rPr>
           <w:rFonts w:ascii="Calibri" w:hAnsi="Calibri" w:cs="Calibri"/>
+          <w:lang w:val="el-GR"/>
         </w:rPr>
       </w:pPr>
     </w:p>
@@ -5149,6 +5124,9 @@
         <w:jc w:val="center"/>
       </w:pPr>
       <w:r>
+        <w:rPr>
+          <w:noProof/>
+        </w:rPr>
         <w:drawing>
           <wp:inline distT="0" distB="0" distL="0" distR="0" wp14:anchorId="5CCBBC16" wp14:editId="16474202">
             <wp:extent cx="5943600" cy="3506470"/>
@@ -5198,24 +5176,14 @@
       <w:r>
         <w:t xml:space="preserve">Εικόνα </w:t>
       </w:r>
-      <w:r>
-        <w:fldChar w:fldCharType="begin"/>
-      </w:r>
-      <w:r>
-        <w:instrText xml:space="preserve"> SEQ Εικόνα \* ARABIC </w:instrText>
-      </w:r>
-      <w:r>
-        <w:fldChar w:fldCharType="separate"/>
-      </w:r>
-      <w:r>
-        <w:rPr>
-          <w:noProof/>
-        </w:rPr>
-        <w:t>5</w:t>
-      </w:r>
-      <w:r>
-        <w:fldChar w:fldCharType="end"/>
-      </w:r>
+      <w:fldSimple w:instr=" SEQ Εικόνα \* ARABIC ">
+        <w:r>
+          <w:rPr>
+            <w:noProof/>
+          </w:rPr>
+          <w:t>5</w:t>
+        </w:r>
+      </w:fldSimple>
       <w:r>
         <w:rPr>
           <w:lang w:val="el-GR"/>
@@ -5473,20 +5441,20 @@
         <w:rPr>
           <w:rFonts w:ascii="Calibri" w:hAnsi="Calibri" w:cs="Calibri"/>
         </w:rPr>
-        <w:t>Use</w:t>
-      </w:r>
-      <w:r>
-        <w:rPr>
-          <w:rFonts w:ascii="Calibri" w:hAnsi="Calibri" w:cs="Calibri"/>
-          <w:lang w:val="el-GR"/>
-        </w:rPr>
-        <w:t xml:space="preserve"> </w:t>
-      </w:r>
-      <w:r>
-        <w:rPr>
-          <w:rFonts w:ascii="Calibri" w:hAnsi="Calibri" w:cs="Calibri"/>
-        </w:rPr>
-        <w:t>Case</w:t>
+        <w:t>CRC</w:t>
+      </w:r>
+      <w:r>
+        <w:rPr>
+          <w:rFonts w:ascii="Calibri" w:hAnsi="Calibri" w:cs="Calibri"/>
+          <w:lang w:val="el-GR"/>
+        </w:rPr>
+        <w:t xml:space="preserve"> </w:t>
+      </w:r>
+      <w:r>
+        <w:rPr>
+          <w:rFonts w:ascii="Calibri" w:hAnsi="Calibri" w:cs="Calibri"/>
+        </w:rPr>
+        <w:t>Card</w:t>
       </w:r>
       <w:r>
         <w:rPr>
@@ -5520,26 +5488,54 @@
           <w:rFonts w:ascii="Calibri" w:hAnsi="Calibri" w:cs="Calibri"/>
           <w:lang w:val="el-GR"/>
         </w:rPr>
-        <w:t xml:space="preserve">Η σελίδα αυτή είναι υπεύθυνη για την δημιουργία ενός καινούργιου </w:t>
-      </w:r>
-      <w:r>
-        <w:rPr>
-          <w:rFonts w:ascii="Calibri" w:hAnsi="Calibri" w:cs="Calibri"/>
-        </w:rPr>
-        <w:t>use</w:t>
-      </w:r>
-      <w:r>
-        <w:rPr>
-          <w:rFonts w:ascii="Calibri" w:hAnsi="Calibri" w:cs="Calibri"/>
-          <w:lang w:val="el-GR"/>
-        </w:rPr>
-        <w:t xml:space="preserve"> </w:t>
-      </w:r>
-      <w:r>
-        <w:rPr>
-          <w:rFonts w:ascii="Calibri" w:hAnsi="Calibri" w:cs="Calibri"/>
-        </w:rPr>
-        <w:t>case</w:t>
+        <w:t xml:space="preserve">Η σελίδα αυτή είναι υπεύθυνη για την δημιουργία </w:t>
+      </w:r>
+      <w:r>
+        <w:rPr>
+          <w:rFonts w:ascii="Calibri" w:hAnsi="Calibri" w:cs="Calibri"/>
+          <w:lang w:val="el-GR"/>
+        </w:rPr>
+        <w:t>μιας</w:t>
+      </w:r>
+      <w:r>
+        <w:rPr>
+          <w:rFonts w:ascii="Calibri" w:hAnsi="Calibri" w:cs="Calibri"/>
+          <w:lang w:val="el-GR"/>
+        </w:rPr>
+        <w:t xml:space="preserve"> καινούργι</w:t>
+      </w:r>
+      <w:r>
+        <w:rPr>
+          <w:rFonts w:ascii="Calibri" w:hAnsi="Calibri" w:cs="Calibri"/>
+          <w:lang w:val="el-GR"/>
+        </w:rPr>
+        <w:t>ας</w:t>
+      </w:r>
+      <w:r>
+        <w:rPr>
+          <w:rFonts w:ascii="Calibri" w:hAnsi="Calibri" w:cs="Calibri"/>
+          <w:lang w:val="el-GR"/>
+        </w:rPr>
+        <w:t xml:space="preserve"> </w:t>
+      </w:r>
+      <w:r>
+        <w:rPr>
+          <w:rFonts w:ascii="Calibri" w:hAnsi="Calibri" w:cs="Calibri"/>
+        </w:rPr>
+        <w:t>CRC</w:t>
+      </w:r>
+      <w:r>
+        <w:rPr>
+          <w:rFonts w:ascii="Calibri" w:hAnsi="Calibri" w:cs="Calibri"/>
+          <w:lang w:val="el-GR"/>
+        </w:rPr>
+        <w:t xml:space="preserve"> </w:t>
+      </w:r>
+      <w:r>
+        <w:rPr>
+          <w:rFonts w:ascii="Calibri" w:hAnsi="Calibri" w:cs="Calibri"/>
+        </w:rPr>
+        <w:t>Card</w:t>
       </w:r>
       <w:r>
         <w:rPr>
@@ -5560,77 +5556,17 @@
           <w:rFonts w:ascii="Calibri" w:hAnsi="Calibri" w:cs="Calibri"/>
           <w:lang w:val="el-GR"/>
         </w:rPr>
-        <w:t xml:space="preserve"> </w:t>
-      </w:r>
-      <w:r>
-        <w:rPr>
-          <w:rFonts w:ascii="Calibri" w:hAnsi="Calibri" w:cs="Calibri"/>
-          <w:lang w:val="el-GR"/>
-        </w:rPr>
-        <w:t>Ο χρήστης ορίζει το όνομά της, επιλέγει ποιοι χρήστες του συστήματος εμπλέκονται και περιγράφει την προϋπόθεση, τη βασική ροή, τις εναλλακτικές ροές και το αποτέλεσμα.</w:t>
-      </w:r>
-    </w:p>
-    <w:p>
-      <w:pPr>
-        <w:jc w:val="both"/>
-        <w:rPr>
-          <w:rFonts w:ascii="Calibri" w:hAnsi="Calibri" w:cs="Calibri"/>
-          <w:lang w:val="el-GR"/>
-        </w:rPr>
-      </w:pPr>
-      <w:r>
-        <w:rPr>
-          <w:rFonts w:ascii="Calibri" w:hAnsi="Calibri" w:cs="Calibri"/>
-          <w:lang w:val="el-GR"/>
-        </w:rPr>
-        <w:t xml:space="preserve">παρουσιάζουμε το </w:t>
-      </w:r>
-      <w:r>
-        <w:rPr>
-          <w:rFonts w:ascii="Calibri" w:hAnsi="Calibri" w:cs="Calibri"/>
-        </w:rPr>
-        <w:t>mock</w:t>
-      </w:r>
-      <w:r>
-        <w:rPr>
-          <w:rFonts w:ascii="Calibri" w:hAnsi="Calibri" w:cs="Calibri"/>
-          <w:lang w:val="el-GR"/>
-        </w:rPr>
-        <w:t>-</w:t>
-      </w:r>
-      <w:r>
-        <w:rPr>
-          <w:rFonts w:ascii="Calibri" w:hAnsi="Calibri" w:cs="Calibri"/>
-        </w:rPr>
-        <w:t>up</w:t>
-      </w:r>
-      <w:r>
-        <w:rPr>
-          <w:rFonts w:ascii="Calibri" w:hAnsi="Calibri" w:cs="Calibri"/>
-          <w:lang w:val="el-GR"/>
-        </w:rPr>
-        <w:t xml:space="preserve"> </w:t>
-      </w:r>
-      <w:r>
-        <w:rPr>
-          <w:rFonts w:ascii="Calibri" w:hAnsi="Calibri" w:cs="Calibri"/>
-        </w:rPr>
-        <w:t>screen</w:t>
-      </w:r>
-      <w:r>
-        <w:rPr>
-          <w:rFonts w:ascii="Calibri" w:hAnsi="Calibri" w:cs="Calibri"/>
-          <w:lang w:val="el-GR"/>
-        </w:rPr>
-        <w:t xml:space="preserve"> </w:t>
-      </w:r>
-      <w:r>
-        <w:rPr>
-          <w:rFonts w:ascii="Calibri" w:hAnsi="Calibri" w:cs="Calibri"/>
-          <w:lang w:val="el-GR"/>
-        </w:rPr>
-        <w:t>για τη δημιουργίας μιας κάρτας κλάσης. Ο χρήστης ορίζει το όνομα της κλάσης, τις αρμοδιότητές της και με ποιες άλλες κλάσεις συνεργάζεται. Η εφαρμογή διασφαλίζει ότι κάθε κλάση έχει μοναδικό όνομα εντός του έργου.</w:t>
-      </w:r>
+        <w:t xml:space="preserve"> Ο χρήστης ορίζει το όνομα της κλάσης, τις αρμοδιότητές της και με ποιες άλλες κλάσεις συνεργάζεται.</w:t>
+      </w:r>
+    </w:p>
+    <w:p>
+      <w:pPr>
+        <w:jc w:val="both"/>
+        <w:rPr>
+          <w:rFonts w:ascii="Calibri" w:hAnsi="Calibri" w:cs="Calibri"/>
+          <w:lang w:val="el-GR"/>
+        </w:rPr>
+      </w:pPr>
     </w:p>
     <w:p>
       <w:pPr>
@@ -5787,6 +5723,13 @@
       <w:r>
         <w:rPr>
           <w:rFonts w:ascii="Calibri" w:hAnsi="Calibri" w:cs="Calibri"/>
+          <w:lang w:val="el-GR"/>
+        </w:rPr>
+        <w:t xml:space="preserve">Σχεδίαση </w:t>
+      </w:r>
+      <w:r>
+        <w:rPr>
+          <w:rFonts w:ascii="Calibri" w:hAnsi="Calibri" w:cs="Calibri"/>
         </w:rPr>
         <w:t>CRC</w:t>
       </w:r>
@@ -5843,109 +5786,405 @@
     </w:p>
     <w:p>
       <w:pPr>
-        <w:jc w:val="both"/>
-        <w:rPr>
-          <w:rFonts w:ascii="Calibri" w:hAnsi="Calibri" w:cs="Calibri"/>
-          <w:lang w:val="el-GR"/>
-        </w:rPr>
-      </w:pPr>
-    </w:p>
-    <w:p>
-      <w:pPr>
-        <w:jc w:val="both"/>
-        <w:rPr>
-          <w:rFonts w:ascii="Calibri" w:hAnsi="Calibri" w:cs="Calibri"/>
-          <w:lang w:val="el-GR"/>
-        </w:rPr>
-      </w:pPr>
-    </w:p>
-    <w:p>
-      <w:pPr>
-        <w:jc w:val="both"/>
-        <w:rPr>
-          <w:rFonts w:ascii="Calibri" w:hAnsi="Calibri" w:cs="Calibri"/>
-          <w:lang w:val="el-GR"/>
-        </w:rPr>
-      </w:pPr>
-    </w:p>
-    <w:p>
-      <w:pPr>
-        <w:jc w:val="both"/>
-        <w:rPr>
-          <w:rFonts w:ascii="Calibri" w:hAnsi="Calibri" w:cs="Calibri"/>
-          <w:lang w:val="el-GR"/>
-        </w:rPr>
-      </w:pPr>
-    </w:p>
-    <w:p>
-      <w:pPr>
-        <w:jc w:val="both"/>
-        <w:rPr>
-          <w:rFonts w:ascii="Calibri" w:hAnsi="Calibri" w:cs="Calibri"/>
-          <w:lang w:val="el-GR"/>
-        </w:rPr>
-      </w:pPr>
-    </w:p>
-    <w:p>
-      <w:pPr>
-        <w:jc w:val="both"/>
-        <w:rPr>
-          <w:rFonts w:ascii="Calibri" w:hAnsi="Calibri" w:cs="Calibri"/>
-          <w:lang w:val="el-GR"/>
-        </w:rPr>
-      </w:pPr>
-      <w:r>
-        <w:rPr>
-          <w:rFonts w:ascii="Calibri" w:hAnsi="Calibri" w:cs="Calibri"/>
-          <w:lang w:val="el-GR"/>
-        </w:rPr>
-        <w:t xml:space="preserve">Στην εικόνα 7 παρουσιάζουμε το </w:t>
-      </w:r>
-      <w:r>
-        <w:rPr>
-          <w:rFonts w:ascii="Calibri" w:hAnsi="Calibri" w:cs="Calibri"/>
-        </w:rPr>
-        <w:t>mock</w:t>
-      </w:r>
-      <w:r>
-        <w:rPr>
-          <w:rFonts w:ascii="Calibri" w:hAnsi="Calibri" w:cs="Calibri"/>
-          <w:lang w:val="el-GR"/>
-        </w:rPr>
-        <w:t>-</w:t>
-      </w:r>
-      <w:r>
-        <w:rPr>
-          <w:rFonts w:ascii="Calibri" w:hAnsi="Calibri" w:cs="Calibri"/>
-        </w:rPr>
-        <w:t>up</w:t>
-      </w:r>
-      <w:r>
-        <w:rPr>
-          <w:rFonts w:ascii="Calibri" w:hAnsi="Calibri" w:cs="Calibri"/>
-          <w:lang w:val="el-GR"/>
-        </w:rPr>
-        <w:t xml:space="preserve"> </w:t>
-      </w:r>
-      <w:r>
-        <w:rPr>
-          <w:rFonts w:ascii="Calibri" w:hAnsi="Calibri" w:cs="Calibri"/>
-        </w:rPr>
-        <w:t>screen</w:t>
-      </w:r>
-      <w:r>
-        <w:rPr>
-          <w:rFonts w:ascii="Calibri" w:hAnsi="Calibri" w:cs="Calibri"/>
-          <w:lang w:val="el-GR"/>
-        </w:rPr>
-        <w:t xml:space="preserve"> </w:t>
-      </w:r>
-      <w:r>
-        <w:rPr>
-          <w:rFonts w:ascii="Calibri" w:hAnsi="Calibri" w:cs="Calibri"/>
-          <w:lang w:val="el-GR"/>
-        </w:rPr>
-        <w:t>για τη παραγωγή αυτόματων διαγραμμάτων. Ο χρήστης επιλέγει τον τύπο διαγράμματος που επιθυμεί και η εφαρμογή παράγει αυτόματα ένα σενάριο που μπορεί να χρησιμοποιηθεί σε εξωτερικά εργαλεία οπτικοποίησης για την απεικόνιση της δομής και των λειτουργιών του συστήματος.</w:t>
+        <w:keepNext/>
+        <w:jc w:val="center"/>
+      </w:pPr>
+      <w:r>
+        <w:rPr>
+          <w:rFonts w:ascii="Calibri" w:hAnsi="Calibri" w:cs="Calibri"/>
+          <w:lang w:val="el-GR"/>
+        </w:rPr>
+        <w:lastRenderedPageBreak/>
+        <w:drawing>
+          <wp:inline distT="0" distB="0" distL="0" distR="0" wp14:anchorId="03E05892" wp14:editId="2BD58BE9">
+            <wp:extent cx="5943600" cy="3783330"/>
+            <wp:effectExtent l="0" t="0" r="0" b="7620"/>
+            <wp:docPr id="509511258" name="Picture 1"/>
+            <wp:cNvGraphicFramePr>
+              <a:graphicFrameLocks xmlns:a="http://schemas.openxmlformats.org/drawingml/2006/main" noChangeAspect="1"/>
+            </wp:cNvGraphicFramePr>
+            <a:graphic xmlns:a="http://schemas.openxmlformats.org/drawingml/2006/main">
+              <a:graphicData uri="http://schemas.openxmlformats.org/drawingml/2006/picture">
+                <pic:pic xmlns:pic="http://schemas.openxmlformats.org/drawingml/2006/picture">
+                  <pic:nvPicPr>
+                    <pic:cNvPr id="509511258" name=""/>
+                    <pic:cNvPicPr/>
+                  </pic:nvPicPr>
+                  <pic:blipFill>
+                    <a:blip r:embed="rId22"/>
+                    <a:stretch>
+                      <a:fillRect/>
+                    </a:stretch>
+                  </pic:blipFill>
+                  <pic:spPr>
+                    <a:xfrm>
+                      <a:off x="0" y="0"/>
+                      <a:ext cx="5943600" cy="3783330"/>
+                    </a:xfrm>
+                    <a:prstGeom prst="rect">
+                      <a:avLst/>
+                    </a:prstGeom>
+                  </pic:spPr>
+                </pic:pic>
+              </a:graphicData>
+            </a:graphic>
+          </wp:inline>
+        </w:drawing>
+      </w:r>
+    </w:p>
+    <w:p>
+      <w:pPr>
+        <w:pStyle w:val="Caption"/>
+        <w:jc w:val="center"/>
+        <w:rPr>
+          <w:rFonts w:ascii="Calibri" w:hAnsi="Calibri" w:cs="Calibri"/>
+          <w:lang w:val="el-GR"/>
+        </w:rPr>
+      </w:pPr>
+      <w:r>
+        <w:rPr>
+          <w:lang w:val="el-GR"/>
+        </w:rPr>
+        <w:t xml:space="preserve">Εικόνα 6.2: Τελική οθόνη </w:t>
+      </w:r>
+      <w:r>
+        <w:t>CRC</w:t>
+      </w:r>
+      <w:r>
+        <w:rPr>
+          <w:lang w:val="el-GR"/>
+        </w:rPr>
+        <w:t xml:space="preserve"> </w:t>
+      </w:r>
+      <w:r>
+        <w:t>Card</w:t>
+      </w:r>
+      <w:r>
+        <w:rPr>
+          <w:lang w:val="el-GR"/>
+        </w:rPr>
+        <w:t xml:space="preserve"> </w:t>
+      </w:r>
+      <w:r>
+        <w:t>Form</w:t>
+      </w:r>
+    </w:p>
+    <w:p>
+      <w:pPr>
+        <w:jc w:val="both"/>
+        <w:rPr>
+          <w:rFonts w:ascii="Calibri" w:hAnsi="Calibri" w:cs="Calibri"/>
+          <w:lang w:val="el-GR"/>
+        </w:rPr>
+      </w:pPr>
+    </w:p>
+    <w:p>
+      <w:pPr>
+        <w:jc w:val="both"/>
+        <w:rPr>
+          <w:rFonts w:ascii="Calibri" w:hAnsi="Calibri" w:cs="Calibri"/>
+          <w:lang w:val="el-GR"/>
+        </w:rPr>
+      </w:pPr>
+    </w:p>
+    <w:p>
+      <w:pPr>
+        <w:jc w:val="both"/>
+        <w:rPr>
+          <w:rFonts w:ascii="Calibri" w:hAnsi="Calibri" w:cs="Calibri"/>
+          <w:lang w:val="el-GR"/>
+        </w:rPr>
+      </w:pPr>
+    </w:p>
+    <w:p>
+      <w:pPr>
+        <w:jc w:val="both"/>
+        <w:rPr>
+          <w:rFonts w:ascii="Calibri" w:hAnsi="Calibri" w:cs="Calibri"/>
+          <w:lang w:val="el-GR"/>
+        </w:rPr>
+      </w:pPr>
+    </w:p>
+    <w:p>
+      <w:pPr>
+        <w:jc w:val="both"/>
+        <w:rPr>
+          <w:rFonts w:ascii="Calibri" w:hAnsi="Calibri" w:cs="Calibri"/>
+          <w:lang w:val="el-GR"/>
+        </w:rPr>
+      </w:pPr>
+    </w:p>
+    <w:p>
+      <w:pPr>
+        <w:jc w:val="both"/>
+        <w:rPr>
+          <w:rFonts w:ascii="Calibri" w:hAnsi="Calibri" w:cs="Calibri"/>
+          <w:lang w:val="el-GR"/>
+        </w:rPr>
+      </w:pPr>
+    </w:p>
+    <w:p>
+      <w:pPr>
+        <w:jc w:val="both"/>
+        <w:rPr>
+          <w:rFonts w:ascii="Calibri" w:hAnsi="Calibri" w:cs="Calibri"/>
+          <w:lang w:val="el-GR"/>
+        </w:rPr>
+      </w:pPr>
+    </w:p>
+    <w:p>
+      <w:pPr>
+        <w:jc w:val="both"/>
+        <w:rPr>
+          <w:rFonts w:ascii="Calibri" w:hAnsi="Calibri" w:cs="Calibri"/>
+          <w:lang w:val="el-GR"/>
+        </w:rPr>
+      </w:pPr>
+    </w:p>
+    <w:p>
+      <w:pPr>
+        <w:jc w:val="both"/>
+        <w:rPr>
+          <w:rFonts w:ascii="Calibri" w:hAnsi="Calibri" w:cs="Calibri"/>
+          <w:lang w:val="el-GR"/>
+        </w:rPr>
+      </w:pPr>
+    </w:p>
+    <w:p>
+      <w:pPr>
+        <w:jc w:val="both"/>
+        <w:rPr>
+          <w:rFonts w:ascii="Calibri" w:hAnsi="Calibri" w:cs="Calibri"/>
+          <w:lang w:val="el-GR"/>
+        </w:rPr>
+      </w:pPr>
+    </w:p>
+    <w:p>
+      <w:pPr>
+        <w:jc w:val="both"/>
+        <w:rPr>
+          <w:rFonts w:ascii="Calibri" w:hAnsi="Calibri" w:cs="Calibri"/>
+          <w:lang w:val="el-GR"/>
+        </w:rPr>
+      </w:pPr>
+    </w:p>
+    <w:p>
+      <w:pPr>
+        <w:jc w:val="both"/>
+        <w:rPr>
+          <w:rFonts w:ascii="Calibri" w:hAnsi="Calibri" w:cs="Calibri"/>
+          <w:lang w:val="el-GR"/>
+        </w:rPr>
+      </w:pPr>
+    </w:p>
+    <w:p>
+      <w:pPr>
+        <w:jc w:val="both"/>
+        <w:rPr>
+          <w:rFonts w:ascii="Calibri" w:hAnsi="Calibri" w:cs="Calibri"/>
+          <w:lang w:val="el-GR"/>
+        </w:rPr>
+      </w:pPr>
+    </w:p>
+    <w:p>
+      <w:pPr>
+        <w:jc w:val="both"/>
+        <w:rPr>
+          <w:rFonts w:ascii="Calibri" w:hAnsi="Calibri" w:cs="Calibri"/>
+          <w:lang w:val="el-GR"/>
+        </w:rPr>
+      </w:pPr>
+    </w:p>
+    <w:p>
+      <w:pPr>
+        <w:pStyle w:val="Heading3"/>
+        <w:numPr>
+          <w:ilvl w:val="0"/>
+          <w:numId w:val="4"/>
+        </w:numPr>
+        <w:pBdr>
+          <w:bottom w:val="single" w:sz="4" w:space="1" w:color="auto"/>
+        </w:pBdr>
+        <w:rPr>
+          <w:b/>
+          <w:bCs/>
+          <w:lang w:val="el-GR"/>
+        </w:rPr>
+      </w:pPr>
+      <w:r>
+        <w:rPr>
+          <w:b/>
+          <w:bCs/>
+        </w:rPr>
+        <w:t>Generate Diagrams</w:t>
+      </w:r>
+    </w:p>
+    <w:p>
+      <w:pPr>
+        <w:jc w:val="both"/>
+        <w:rPr>
+          <w:rFonts w:ascii="Calibri" w:hAnsi="Calibri" w:cs="Calibri"/>
+          <w:lang w:val="el-GR"/>
+        </w:rPr>
+      </w:pPr>
+      <w:r>
+        <w:rPr>
+          <w:rFonts w:ascii="Calibri" w:hAnsi="Calibri" w:cs="Calibri"/>
+          <w:lang w:val="el-GR"/>
+        </w:rPr>
+        <w:t>Στ</w:t>
+      </w:r>
+      <w:r>
+        <w:rPr>
+          <w:rFonts w:ascii="Calibri" w:hAnsi="Calibri" w:cs="Calibri"/>
+          <w:lang w:val="el-GR"/>
+        </w:rPr>
+        <w:t>ις</w:t>
+      </w:r>
+      <w:r>
+        <w:rPr>
+          <w:rFonts w:ascii="Calibri" w:hAnsi="Calibri" w:cs="Calibri"/>
+          <w:lang w:val="el-GR"/>
+        </w:rPr>
+        <w:t xml:space="preserve"> εικόν</w:t>
+      </w:r>
+      <w:r>
+        <w:rPr>
+          <w:rFonts w:ascii="Calibri" w:hAnsi="Calibri" w:cs="Calibri"/>
+          <w:lang w:val="el-GR"/>
+        </w:rPr>
+        <w:t>ες</w:t>
+      </w:r>
+      <w:r>
+        <w:rPr>
+          <w:rFonts w:ascii="Calibri" w:hAnsi="Calibri" w:cs="Calibri"/>
+          <w:lang w:val="el-GR"/>
+        </w:rPr>
+        <w:t xml:space="preserve"> </w:t>
+      </w:r>
+      <w:r>
+        <w:rPr>
+          <w:rFonts w:ascii="Calibri" w:hAnsi="Calibri" w:cs="Calibri"/>
+          <w:lang w:val="el-GR"/>
+        </w:rPr>
+        <w:t>7</w:t>
+      </w:r>
+      <w:r>
+        <w:rPr>
+          <w:rFonts w:ascii="Calibri" w:hAnsi="Calibri" w:cs="Calibri"/>
+          <w:lang w:val="el-GR"/>
+        </w:rPr>
+        <w:t xml:space="preserve">.1 και </w:t>
+      </w:r>
+      <w:r>
+        <w:rPr>
+          <w:rFonts w:ascii="Calibri" w:hAnsi="Calibri" w:cs="Calibri"/>
+          <w:lang w:val="el-GR"/>
+        </w:rPr>
+        <w:t>7</w:t>
+      </w:r>
+      <w:r>
+        <w:rPr>
+          <w:rFonts w:ascii="Calibri" w:hAnsi="Calibri" w:cs="Calibri"/>
+          <w:lang w:val="el-GR"/>
+        </w:rPr>
+        <w:t>.2 παρουσιάζουμε την αρχική και την τελική σχεδίαση αντίστοιχα, της οθόνης</w:t>
+      </w:r>
+      <w:r>
+        <w:rPr>
+          <w:rFonts w:ascii="Calibri" w:hAnsi="Calibri" w:cs="Calibri"/>
+          <w:lang w:val="el-GR"/>
+        </w:rPr>
+        <w:t xml:space="preserve"> </w:t>
+      </w:r>
+      <w:r>
+        <w:rPr>
+          <w:rFonts w:ascii="Calibri" w:hAnsi="Calibri" w:cs="Calibri"/>
+        </w:rPr>
+        <w:t>Generate</w:t>
+      </w:r>
+      <w:r>
+        <w:rPr>
+          <w:rFonts w:ascii="Calibri" w:hAnsi="Calibri" w:cs="Calibri"/>
+          <w:lang w:val="el-GR"/>
+        </w:rPr>
+        <w:t xml:space="preserve"> </w:t>
+      </w:r>
+      <w:r>
+        <w:rPr>
+          <w:rFonts w:ascii="Calibri" w:hAnsi="Calibri" w:cs="Calibri"/>
+        </w:rPr>
+        <w:t>Diagrams</w:t>
+      </w:r>
+      <w:r>
+        <w:rPr>
+          <w:rFonts w:ascii="Calibri" w:hAnsi="Calibri" w:cs="Calibri"/>
+          <w:lang w:val="el-GR"/>
+        </w:rPr>
+        <w:t>.</w:t>
+      </w:r>
+      <w:r>
+        <w:rPr>
+          <w:rFonts w:ascii="Calibri" w:hAnsi="Calibri" w:cs="Calibri"/>
+          <w:lang w:val="el-GR"/>
+        </w:rPr>
+        <w:t xml:space="preserve"> </w:t>
+      </w:r>
+      <w:r>
+        <w:rPr>
+          <w:rFonts w:ascii="Calibri" w:hAnsi="Calibri" w:cs="Calibri"/>
+          <w:lang w:val="el-GR"/>
+        </w:rPr>
+        <w:t xml:space="preserve">Η σελίδα αυτή είναι υπεύθυνη για την </w:t>
+      </w:r>
+      <w:r>
+        <w:rPr>
+          <w:rFonts w:ascii="Calibri" w:hAnsi="Calibri" w:cs="Calibri"/>
+          <w:lang w:val="el-GR"/>
+        </w:rPr>
+        <w:t>προβολή των διαγραμμάτων που επέλεξε ο χρήστης</w:t>
+      </w:r>
+      <w:r>
+        <w:rPr>
+          <w:rFonts w:ascii="Calibri" w:hAnsi="Calibri" w:cs="Calibri"/>
+          <w:lang w:val="el-GR"/>
+        </w:rPr>
+        <w:t xml:space="preserve"> να οπτικοποιήσει</w:t>
+      </w:r>
+      <w:r>
+        <w:rPr>
+          <w:rFonts w:ascii="Calibri" w:hAnsi="Calibri" w:cs="Calibri"/>
+          <w:lang w:val="el-GR"/>
+        </w:rPr>
+        <w:t>.</w:t>
+      </w:r>
+      <w:r>
+        <w:rPr>
+          <w:rFonts w:ascii="Calibri" w:hAnsi="Calibri" w:cs="Calibri"/>
+          <w:lang w:val="el-GR"/>
+        </w:rPr>
+        <w:t xml:space="preserve"> Συγκεκριμένα,</w:t>
+      </w:r>
+      <w:r>
+        <w:rPr>
+          <w:rFonts w:ascii="Calibri" w:hAnsi="Calibri" w:cs="Calibri"/>
+          <w:lang w:val="el-GR"/>
+        </w:rPr>
+        <w:t xml:space="preserve"> </w:t>
+      </w:r>
+      <w:r>
+        <w:rPr>
+          <w:rFonts w:ascii="Calibri" w:hAnsi="Calibri" w:cs="Calibri"/>
+          <w:lang w:val="el-GR"/>
+        </w:rPr>
+        <w:t>ο</w:t>
+      </w:r>
+      <w:r>
+        <w:rPr>
+          <w:rFonts w:ascii="Calibri" w:hAnsi="Calibri" w:cs="Calibri"/>
+          <w:lang w:val="el-GR"/>
+        </w:rPr>
+        <w:t xml:space="preserve"> χρήστης επιλέγει τον τύπο διαγράμματος που επιθυμεί και η εφαρμογή παράγει αυτόματα ένα σενάριο που μπορεί να χρησιμοποιηθεί σε εξωτερικά εργαλεία οπτικοποίησης για την απεικόνιση της δομής και των λειτουργιών του συστήματος.</w:t>
       </w:r>
     </w:p>
     <w:p>
@@ -5986,7 +6225,7 @@
                     <pic:cNvPicPr/>
                   </pic:nvPicPr>
                   <pic:blipFill>
-                    <a:blip r:embed="rId22"/>
+                    <a:blip r:embed="rId23"/>
                     <a:stretch>
                       <a:fillRect/>
                     </a:stretch>
@@ -6026,60 +6265,9 @@
       <w:r>
         <w:rPr>
           <w:rFonts w:ascii="Calibri" w:hAnsi="Calibri" w:cs="Calibri"/>
-        </w:rPr>
-        <w:fldChar w:fldCharType="begin"/>
-      </w:r>
-      <w:r>
-        <w:rPr>
-          <w:rFonts w:ascii="Calibri" w:hAnsi="Calibri" w:cs="Calibri"/>
-          <w:lang w:val="el-GR"/>
-        </w:rPr>
-        <w:instrText xml:space="preserve"> </w:instrText>
-      </w:r>
-      <w:r>
-        <w:rPr>
-          <w:rFonts w:ascii="Calibri" w:hAnsi="Calibri" w:cs="Calibri"/>
-        </w:rPr>
-        <w:instrText>SEQ</w:instrText>
-      </w:r>
-      <w:r>
-        <w:rPr>
-          <w:rFonts w:ascii="Calibri" w:hAnsi="Calibri" w:cs="Calibri"/>
-          <w:lang w:val="el-GR"/>
-        </w:rPr>
-        <w:instrText xml:space="preserve"> Εικόνα \* </w:instrText>
-      </w:r>
-      <w:r>
-        <w:rPr>
-          <w:rFonts w:ascii="Calibri" w:hAnsi="Calibri" w:cs="Calibri"/>
-        </w:rPr>
-        <w:instrText>ARABIC</w:instrText>
-      </w:r>
-      <w:r>
-        <w:rPr>
-          <w:rFonts w:ascii="Calibri" w:hAnsi="Calibri" w:cs="Calibri"/>
-          <w:lang w:val="el-GR"/>
-        </w:rPr>
-        <w:instrText xml:space="preserve"> </w:instrText>
-      </w:r>
-      <w:r>
-        <w:rPr>
-          <w:rFonts w:ascii="Calibri" w:hAnsi="Calibri" w:cs="Calibri"/>
-        </w:rPr>
-        <w:fldChar w:fldCharType="separate"/>
-      </w:r>
-      <w:r>
-        <w:rPr>
-          <w:rFonts w:ascii="Calibri" w:hAnsi="Calibri" w:cs="Calibri"/>
-          <w:noProof/>
-        </w:rPr>
-        <w:t>7</w:t>
-      </w:r>
-      <w:r>
-        <w:rPr>
-          <w:rFonts w:ascii="Calibri" w:hAnsi="Calibri" w:cs="Calibri"/>
-        </w:rPr>
-        <w:fldChar w:fldCharType="end"/>
+          <w:lang w:val="el-GR"/>
+        </w:rPr>
+        <w:t>7.1</w:t>
       </w:r>
       <w:r>
         <w:rPr>
@@ -6091,6 +6279,13 @@
       <w:r>
         <w:rPr>
           <w:rFonts w:ascii="Calibri" w:hAnsi="Calibri" w:cs="Calibri"/>
+          <w:lang w:val="el-GR"/>
+        </w:rPr>
+        <w:t xml:space="preserve">Αρχική Σχεδίαση </w:t>
+      </w:r>
+      <w:r>
+        <w:rPr>
+          <w:rFonts w:ascii="Calibri" w:hAnsi="Calibri" w:cs="Calibri"/>
         </w:rPr>
         <w:t>Generate</w:t>
       </w:r>
@@ -6173,75 +6368,203 @@
     </w:p>
     <w:p>
       <w:pPr>
-        <w:jc w:val="both"/>
-        <w:rPr>
-          <w:rFonts w:ascii="Calibri" w:hAnsi="Calibri" w:cs="Calibri"/>
-          <w:lang w:val="el-GR"/>
-        </w:rPr>
-      </w:pPr>
-    </w:p>
-    <w:p>
-      <w:pPr>
-        <w:jc w:val="both"/>
-        <w:rPr>
-          <w:rFonts w:ascii="Calibri" w:hAnsi="Calibri" w:cs="Calibri"/>
-          <w:lang w:val="el-GR"/>
-        </w:rPr>
-      </w:pPr>
-    </w:p>
-    <w:p>
-      <w:pPr>
-        <w:jc w:val="both"/>
-        <w:rPr>
-          <w:rFonts w:ascii="Calibri" w:hAnsi="Calibri" w:cs="Calibri"/>
-          <w:lang w:val="el-GR"/>
-        </w:rPr>
-      </w:pPr>
-      <w:r>
-        <w:rPr>
-          <w:rFonts w:ascii="Calibri" w:hAnsi="Calibri" w:cs="Calibri"/>
-          <w:lang w:val="el-GR"/>
-        </w:rPr>
-        <w:t xml:space="preserve">Στην εικόνα 8 παρουσιάζουμε το </w:t>
-      </w:r>
-      <w:r>
-        <w:rPr>
-          <w:rFonts w:ascii="Calibri" w:hAnsi="Calibri" w:cs="Calibri"/>
-        </w:rPr>
-        <w:t>mock</w:t>
-      </w:r>
-      <w:r>
-        <w:rPr>
-          <w:rFonts w:ascii="Calibri" w:hAnsi="Calibri" w:cs="Calibri"/>
-          <w:lang w:val="el-GR"/>
-        </w:rPr>
-        <w:t>-</w:t>
-      </w:r>
-      <w:r>
-        <w:rPr>
-          <w:rFonts w:ascii="Calibri" w:hAnsi="Calibri" w:cs="Calibri"/>
-        </w:rPr>
-        <w:t>up</w:t>
-      </w:r>
-      <w:r>
-        <w:rPr>
-          <w:rFonts w:ascii="Calibri" w:hAnsi="Calibri" w:cs="Calibri"/>
-          <w:lang w:val="el-GR"/>
-        </w:rPr>
-        <w:t xml:space="preserve"> </w:t>
-      </w:r>
-      <w:r>
-        <w:rPr>
-          <w:rFonts w:ascii="Calibri" w:hAnsi="Calibri" w:cs="Calibri"/>
-        </w:rPr>
-        <w:t>screen</w:t>
-      </w:r>
-      <w:r>
-        <w:rPr>
-          <w:rFonts w:ascii="Calibri" w:hAnsi="Calibri" w:cs="Calibri"/>
-          <w:lang w:val="el-GR"/>
-        </w:rPr>
-        <w:t xml:space="preserve"> για τον Administrator. Εμφανίζει όλους τους χρήστες της εφαρμογής μαζί με τον ρόλο τους. Ο Administrator μπορεί να αναζητήσει οποιονδήποτε χρήστη και να αλλάξει τον ρόλο του, με εξαίρεση τον δικό του.</w:t>
+        <w:pStyle w:val="Heading3"/>
+        <w:numPr>
+          <w:ilvl w:val="0"/>
+          <w:numId w:val="4"/>
+        </w:numPr>
+        <w:pBdr>
+          <w:bottom w:val="single" w:sz="4" w:space="1" w:color="auto"/>
+        </w:pBdr>
+        <w:rPr>
+          <w:b/>
+          <w:bCs/>
+          <w:lang w:val="el-GR"/>
+        </w:rPr>
+      </w:pPr>
+      <w:bookmarkStart w:id="2" w:name="_User_Management"/>
+      <w:bookmarkEnd w:id="2"/>
+      <w:r>
+        <w:rPr>
+          <w:b/>
+          <w:bCs/>
+        </w:rPr>
+        <w:t>User Management</w:t>
+      </w:r>
+    </w:p>
+    <w:p>
+      <w:pPr>
+        <w:jc w:val="both"/>
+        <w:rPr>
+          <w:rFonts w:ascii="Calibri" w:hAnsi="Calibri" w:cs="Calibri"/>
+          <w:lang w:val="el-GR"/>
+        </w:rPr>
+      </w:pPr>
+      <w:r>
+        <w:rPr>
+          <w:rFonts w:ascii="Calibri" w:hAnsi="Calibri" w:cs="Calibri"/>
+          <w:lang w:val="el-GR"/>
+        </w:rPr>
+        <w:t>Στ</w:t>
+      </w:r>
+      <w:r>
+        <w:rPr>
+          <w:rFonts w:ascii="Calibri" w:hAnsi="Calibri" w:cs="Calibri"/>
+          <w:lang w:val="el-GR"/>
+        </w:rPr>
+        <w:t>ις</w:t>
+      </w:r>
+      <w:r>
+        <w:rPr>
+          <w:rFonts w:ascii="Calibri" w:hAnsi="Calibri" w:cs="Calibri"/>
+          <w:lang w:val="el-GR"/>
+        </w:rPr>
+        <w:t xml:space="preserve"> εικόν</w:t>
+      </w:r>
+      <w:r>
+        <w:rPr>
+          <w:rFonts w:ascii="Calibri" w:hAnsi="Calibri" w:cs="Calibri"/>
+          <w:lang w:val="el-GR"/>
+        </w:rPr>
+        <w:t>ες</w:t>
+      </w:r>
+      <w:r>
+        <w:rPr>
+          <w:rFonts w:ascii="Calibri" w:hAnsi="Calibri" w:cs="Calibri"/>
+          <w:lang w:val="el-GR"/>
+        </w:rPr>
+        <w:t xml:space="preserve"> </w:t>
+      </w:r>
+      <w:r>
+        <w:rPr>
+          <w:rFonts w:ascii="Calibri" w:hAnsi="Calibri" w:cs="Calibri"/>
+          <w:lang w:val="el-GR"/>
+        </w:rPr>
+        <w:t>8</w:t>
+      </w:r>
+      <w:r>
+        <w:rPr>
+          <w:rFonts w:ascii="Calibri" w:hAnsi="Calibri" w:cs="Calibri"/>
+          <w:lang w:val="el-GR"/>
+        </w:rPr>
+        <w:t xml:space="preserve">.1 και </w:t>
+      </w:r>
+      <w:r>
+        <w:rPr>
+          <w:rFonts w:ascii="Calibri" w:hAnsi="Calibri" w:cs="Calibri"/>
+          <w:lang w:val="el-GR"/>
+        </w:rPr>
+        <w:t>8</w:t>
+      </w:r>
+      <w:r>
+        <w:rPr>
+          <w:rFonts w:ascii="Calibri" w:hAnsi="Calibri" w:cs="Calibri"/>
+          <w:lang w:val="el-GR"/>
+        </w:rPr>
+        <w:t>.2 παρουσιάζουμε την αρχική και την τελική σχεδίαση αντίστοιχα, της οθόνης</w:t>
+      </w:r>
+      <w:r>
+        <w:rPr>
+          <w:rFonts w:ascii="Calibri" w:hAnsi="Calibri" w:cs="Calibri"/>
+          <w:lang w:val="el-GR"/>
+        </w:rPr>
+        <w:t xml:space="preserve"> </w:t>
+      </w:r>
+      <w:r>
+        <w:rPr>
+          <w:rFonts w:ascii="Calibri" w:hAnsi="Calibri" w:cs="Calibri"/>
+        </w:rPr>
+        <w:t>User</w:t>
+      </w:r>
+      <w:r>
+        <w:rPr>
+          <w:rFonts w:ascii="Calibri" w:hAnsi="Calibri" w:cs="Calibri"/>
+          <w:lang w:val="el-GR"/>
+        </w:rPr>
+        <w:t xml:space="preserve"> </w:t>
+      </w:r>
+      <w:r>
+        <w:rPr>
+          <w:rFonts w:ascii="Calibri" w:hAnsi="Calibri" w:cs="Calibri"/>
+        </w:rPr>
+        <w:t>Management</w:t>
+      </w:r>
+      <w:r>
+        <w:rPr>
+          <w:rFonts w:ascii="Calibri" w:hAnsi="Calibri" w:cs="Calibri"/>
+          <w:lang w:val="el-GR"/>
+        </w:rPr>
+        <w:t>.</w:t>
+      </w:r>
+      <w:r>
+        <w:rPr>
+          <w:rFonts w:ascii="Calibri" w:hAnsi="Calibri" w:cs="Calibri"/>
+          <w:lang w:val="el-GR"/>
+        </w:rPr>
+        <w:t xml:space="preserve"> </w:t>
+      </w:r>
+      <w:r>
+        <w:rPr>
+          <w:rFonts w:ascii="Calibri" w:hAnsi="Calibri" w:cs="Calibri"/>
+          <w:lang w:val="el-GR"/>
+        </w:rPr>
+        <w:t xml:space="preserve">Η σελίδα αυτή είναι υπεύθυνη για την </w:t>
+      </w:r>
+      <w:r>
+        <w:rPr>
+          <w:rFonts w:ascii="Calibri" w:hAnsi="Calibri" w:cs="Calibri"/>
+          <w:lang w:val="el-GR"/>
+        </w:rPr>
+        <w:t xml:space="preserve">προβολή όλων των χρηστών του συστήματος και της αλλαγής ρόλων τους από τον </w:t>
+      </w:r>
+      <w:r>
+        <w:rPr>
+          <w:rFonts w:ascii="Calibri" w:hAnsi="Calibri" w:cs="Calibri"/>
+          <w:lang w:val="el-GR"/>
+        </w:rPr>
+        <w:t>Administration</w:t>
+      </w:r>
+      <w:r>
+        <w:rPr>
+          <w:rFonts w:ascii="Calibri" w:hAnsi="Calibri" w:cs="Calibri"/>
+          <w:lang w:val="el-GR"/>
+        </w:rPr>
+        <w:t>.</w:t>
+      </w:r>
+      <w:r>
+        <w:rPr>
+          <w:rFonts w:ascii="Calibri" w:hAnsi="Calibri" w:cs="Calibri"/>
+          <w:lang w:val="el-GR"/>
+        </w:rPr>
+        <w:t xml:space="preserve"> </w:t>
+      </w:r>
+      <w:r>
+        <w:rPr>
+          <w:rFonts w:ascii="Calibri" w:hAnsi="Calibri" w:cs="Calibri"/>
+          <w:lang w:val="el-GR"/>
+        </w:rPr>
+        <w:t>Συγκεκριμένα η οθόνη ε</w:t>
+      </w:r>
+      <w:r>
+        <w:rPr>
+          <w:rFonts w:ascii="Calibri" w:hAnsi="Calibri" w:cs="Calibri"/>
+          <w:lang w:val="el-GR"/>
+        </w:rPr>
+        <w:t xml:space="preserve">μφανίζει όλους τους χρήστες της εφαρμογής μαζί με τον ρόλο τους. Ο </w:t>
+      </w:r>
+      <w:r>
+        <w:rPr>
+          <w:rFonts w:ascii="Calibri" w:hAnsi="Calibri" w:cs="Calibri"/>
+          <w:lang w:val="el-GR"/>
+        </w:rPr>
+        <w:t>Administration</w:t>
+      </w:r>
+      <w:r>
+        <w:rPr>
+          <w:rFonts w:ascii="Calibri" w:hAnsi="Calibri" w:cs="Calibri"/>
+          <w:lang w:val="el-GR"/>
+        </w:rPr>
+        <w:t xml:space="preserve"> μπορεί να αναζητήσει οποιονδήποτε χρήστη και να αλλάξει τον ρόλο του, με εξαίρεση τον δικό του.</w:t>
       </w:r>
     </w:p>
     <w:p>
@@ -6272,7 +6595,7 @@
                     <pic:cNvPicPr/>
                   </pic:nvPicPr>
                   <pic:blipFill>
-                    <a:blip r:embed="rId23"/>
+                    <a:blip r:embed="rId24"/>
                     <a:stretch>
                       <a:fillRect/>
                     </a:stretch>
@@ -6307,190 +6630,331 @@
           <w:rFonts w:ascii="Calibri" w:hAnsi="Calibri" w:cs="Calibri"/>
           <w:lang w:val="el-GR"/>
         </w:rPr>
-        <w:t xml:space="preserve">Εικόνα </w:t>
-      </w:r>
-      <w:r>
-        <w:rPr>
-          <w:rFonts w:ascii="Calibri" w:hAnsi="Calibri" w:cs="Calibri"/>
-        </w:rPr>
-        <w:fldChar w:fldCharType="begin"/>
-      </w:r>
-      <w:r>
-        <w:rPr>
-          <w:rFonts w:ascii="Calibri" w:hAnsi="Calibri" w:cs="Calibri"/>
-          <w:lang w:val="el-GR"/>
-        </w:rPr>
-        <w:instrText xml:space="preserve"> </w:instrText>
-      </w:r>
-      <w:r>
-        <w:rPr>
-          <w:rFonts w:ascii="Calibri" w:hAnsi="Calibri" w:cs="Calibri"/>
-        </w:rPr>
-        <w:instrText>SEQ</w:instrText>
-      </w:r>
-      <w:r>
-        <w:rPr>
-          <w:rFonts w:ascii="Calibri" w:hAnsi="Calibri" w:cs="Calibri"/>
-          <w:lang w:val="el-GR"/>
-        </w:rPr>
-        <w:instrText xml:space="preserve"> Εικόνα \* </w:instrText>
-      </w:r>
-      <w:r>
-        <w:rPr>
-          <w:rFonts w:ascii="Calibri" w:hAnsi="Calibri" w:cs="Calibri"/>
-        </w:rPr>
-        <w:instrText>ARABIC</w:instrText>
-      </w:r>
-      <w:r>
-        <w:rPr>
-          <w:rFonts w:ascii="Calibri" w:hAnsi="Calibri" w:cs="Calibri"/>
-          <w:lang w:val="el-GR"/>
-        </w:rPr>
-        <w:instrText xml:space="preserve"> </w:instrText>
-      </w:r>
-      <w:r>
-        <w:rPr>
-          <w:rFonts w:ascii="Calibri" w:hAnsi="Calibri" w:cs="Calibri"/>
-        </w:rPr>
-        <w:fldChar w:fldCharType="separate"/>
-      </w:r>
+        <w:t>Εικόνα</w:t>
+      </w:r>
+      <w:r>
+        <w:rPr>
+          <w:rFonts w:ascii="Calibri" w:hAnsi="Calibri" w:cs="Calibri"/>
+        </w:rPr>
+        <w:t xml:space="preserve"> </w:t>
+      </w:r>
+      <w:r>
+        <w:rPr>
+          <w:rFonts w:ascii="Calibri" w:hAnsi="Calibri" w:cs="Calibri"/>
+          <w:lang w:val="el-GR"/>
+        </w:rPr>
+        <w:t>8.</w:t>
+      </w:r>
+      <w:r>
+        <w:rPr>
+          <w:rFonts w:ascii="Calibri" w:hAnsi="Calibri" w:cs="Calibri"/>
+        </w:rPr>
+        <w:t>1</w:t>
+      </w:r>
+      <w:r>
+        <w:rPr>
+          <w:rFonts w:ascii="Calibri" w:hAnsi="Calibri" w:cs="Calibri"/>
+          <w:lang w:val="el-GR"/>
+        </w:rPr>
+        <w:t>:</w:t>
+      </w:r>
+      <w:r>
+        <w:rPr>
+          <w:rFonts w:ascii="Calibri" w:hAnsi="Calibri" w:cs="Calibri"/>
+          <w:lang w:val="el-GR"/>
+        </w:rPr>
+        <w:t xml:space="preserve"> </w:t>
+      </w:r>
+      <w:r>
+        <w:rPr>
+          <w:rFonts w:ascii="Calibri" w:hAnsi="Calibri" w:cs="Calibri"/>
+          <w:lang w:val="el-GR"/>
+        </w:rPr>
+        <w:t>Αρχική Σχεδίαση</w:t>
+      </w:r>
+      <w:r>
+        <w:rPr>
+          <w:rFonts w:ascii="Calibri" w:hAnsi="Calibri" w:cs="Calibri"/>
+          <w:lang w:val="el-GR"/>
+        </w:rPr>
+        <w:t xml:space="preserve"> </w:t>
+      </w:r>
+      <w:r>
+        <w:rPr>
+          <w:rFonts w:ascii="Calibri" w:hAnsi="Calibri" w:cs="Calibri"/>
+        </w:rPr>
+        <w:t>User</w:t>
+      </w:r>
+      <w:r>
+        <w:rPr>
+          <w:rFonts w:ascii="Calibri" w:hAnsi="Calibri" w:cs="Calibri"/>
+          <w:lang w:val="el-GR"/>
+        </w:rPr>
+        <w:t xml:space="preserve"> </w:t>
+      </w:r>
+      <w:r>
+        <w:rPr>
+          <w:rFonts w:ascii="Calibri" w:hAnsi="Calibri" w:cs="Calibri"/>
+        </w:rPr>
+        <w:t>Management</w:t>
+      </w:r>
+    </w:p>
+    <w:p>
+      <w:pPr>
+        <w:rPr>
+          <w:rFonts w:ascii="Calibri" w:hAnsi="Calibri" w:cs="Calibri"/>
+          <w:lang w:val="el-GR"/>
+        </w:rPr>
+      </w:pPr>
+    </w:p>
+    <w:p>
+      <w:pPr>
+        <w:rPr>
+          <w:rFonts w:ascii="Calibri" w:hAnsi="Calibri" w:cs="Calibri"/>
+          <w:lang w:val="el-GR"/>
+        </w:rPr>
+      </w:pPr>
+    </w:p>
+    <w:p>
+      <w:pPr>
+        <w:rPr>
+          <w:rFonts w:ascii="Calibri" w:hAnsi="Calibri" w:cs="Calibri"/>
+          <w:lang w:val="el-GR"/>
+        </w:rPr>
+      </w:pPr>
+    </w:p>
+    <w:p>
+      <w:pPr>
+        <w:rPr>
+          <w:rFonts w:ascii="Calibri" w:hAnsi="Calibri" w:cs="Calibri"/>
+          <w:lang w:val="el-GR"/>
+        </w:rPr>
+      </w:pPr>
+    </w:p>
+    <w:p>
+      <w:pPr>
+        <w:rPr>
+          <w:rFonts w:ascii="Calibri" w:hAnsi="Calibri" w:cs="Calibri"/>
+          <w:lang w:val="el-GR"/>
+        </w:rPr>
+      </w:pPr>
+    </w:p>
+    <w:p>
+      <w:pPr>
+        <w:rPr>
+          <w:rFonts w:ascii="Calibri" w:hAnsi="Calibri" w:cs="Calibri"/>
+          <w:lang w:val="el-GR"/>
+        </w:rPr>
+      </w:pPr>
+    </w:p>
+    <w:p>
+      <w:pPr>
+        <w:rPr>
+          <w:rFonts w:ascii="Calibri" w:hAnsi="Calibri" w:cs="Calibri"/>
+          <w:lang w:val="el-GR"/>
+        </w:rPr>
+      </w:pPr>
+    </w:p>
+    <w:p>
+      <w:pPr>
+        <w:rPr>
+          <w:rFonts w:ascii="Calibri" w:hAnsi="Calibri" w:cs="Calibri"/>
+          <w:lang w:val="el-GR"/>
+        </w:rPr>
+      </w:pPr>
+    </w:p>
+    <w:p>
+      <w:pPr>
+        <w:rPr>
+          <w:rFonts w:ascii="Calibri" w:hAnsi="Calibri" w:cs="Calibri"/>
+          <w:lang w:val="el-GR"/>
+        </w:rPr>
+      </w:pPr>
+    </w:p>
+    <w:p>
+      <w:pPr>
+        <w:rPr>
+          <w:rFonts w:ascii="Calibri" w:hAnsi="Calibri" w:cs="Calibri"/>
+          <w:lang w:val="el-GR"/>
+        </w:rPr>
+      </w:pPr>
+    </w:p>
+    <w:p>
+      <w:pPr>
+        <w:rPr>
+          <w:rFonts w:ascii="Calibri" w:hAnsi="Calibri" w:cs="Calibri"/>
+          <w:lang w:val="el-GR"/>
+        </w:rPr>
+      </w:pPr>
+    </w:p>
+    <w:p>
+      <w:pPr>
+        <w:rPr>
+          <w:rFonts w:ascii="Calibri" w:hAnsi="Calibri" w:cs="Calibri"/>
+          <w:lang w:val="el-GR"/>
+        </w:rPr>
+      </w:pPr>
+    </w:p>
+    <w:p>
+      <w:pPr>
+        <w:rPr>
+          <w:rFonts w:ascii="Calibri" w:hAnsi="Calibri" w:cs="Calibri"/>
+          <w:lang w:val="el-GR"/>
+        </w:rPr>
+      </w:pPr>
+    </w:p>
+    <w:p>
+      <w:pPr>
+        <w:rPr>
+          <w:rFonts w:ascii="Calibri" w:hAnsi="Calibri" w:cs="Calibri"/>
+          <w:lang w:val="el-GR"/>
+        </w:rPr>
+      </w:pPr>
+    </w:p>
+    <w:p>
+      <w:pPr>
+        <w:rPr>
+          <w:rFonts w:ascii="Calibri" w:hAnsi="Calibri" w:cs="Calibri"/>
+          <w:lang w:val="el-GR"/>
+        </w:rPr>
+      </w:pPr>
+    </w:p>
+    <w:p>
+      <w:pPr>
+        <w:rPr>
+          <w:rFonts w:ascii="Calibri" w:hAnsi="Calibri" w:cs="Calibri"/>
+          <w:lang w:val="el-GR"/>
+        </w:rPr>
+      </w:pPr>
+    </w:p>
+    <w:p>
+      <w:pPr>
+        <w:pStyle w:val="Heading3"/>
+        <w:numPr>
+          <w:ilvl w:val="0"/>
+          <w:numId w:val="4"/>
+        </w:numPr>
+        <w:pBdr>
+          <w:bottom w:val="single" w:sz="4" w:space="1" w:color="auto"/>
+        </w:pBdr>
+        <w:rPr>
+          <w:b/>
+          <w:bCs/>
+          <w:lang w:val="el-GR"/>
+        </w:rPr>
+      </w:pPr>
+      <w:r>
+        <w:rPr>
+          <w:b/>
+          <w:bCs/>
+        </w:rPr>
+        <w:t>Login</w:t>
+      </w:r>
+    </w:p>
+    <w:p>
+      <w:pPr>
+        <w:jc w:val="both"/>
+        <w:rPr>
+          <w:rFonts w:ascii="Calibri" w:hAnsi="Calibri" w:cs="Calibri"/>
+          <w:lang w:val="el-GR"/>
+        </w:rPr>
+      </w:pPr>
+      <w:r>
+        <w:rPr>
+          <w:rFonts w:ascii="Calibri" w:hAnsi="Calibri" w:cs="Calibri"/>
+          <w:lang w:val="el-GR"/>
+        </w:rPr>
+        <w:t>Στ</w:t>
+      </w:r>
+      <w:r>
+        <w:rPr>
+          <w:rFonts w:ascii="Calibri" w:hAnsi="Calibri" w:cs="Calibri"/>
+          <w:lang w:val="el-GR"/>
+        </w:rPr>
+        <w:t>ις</w:t>
+      </w:r>
+      <w:r>
+        <w:rPr>
+          <w:rFonts w:ascii="Calibri" w:hAnsi="Calibri" w:cs="Calibri"/>
+          <w:lang w:val="el-GR"/>
+        </w:rPr>
+        <w:t xml:space="preserve"> εικόν</w:t>
+      </w:r>
+      <w:r>
+        <w:rPr>
+          <w:rFonts w:ascii="Calibri" w:hAnsi="Calibri" w:cs="Calibri"/>
+          <w:lang w:val="el-GR"/>
+        </w:rPr>
+        <w:t>ες</w:t>
+      </w:r>
+      <w:r>
+        <w:rPr>
+          <w:rFonts w:ascii="Calibri" w:hAnsi="Calibri" w:cs="Calibri"/>
+          <w:lang w:val="el-GR"/>
+        </w:rPr>
+        <w:t xml:space="preserve"> </w:t>
+      </w:r>
+      <w:r>
+        <w:rPr>
+          <w:rFonts w:ascii="Calibri" w:hAnsi="Calibri" w:cs="Calibri"/>
+          <w:lang w:val="el-GR"/>
+        </w:rPr>
+        <w:t>9</w:t>
+      </w:r>
+      <w:r>
+        <w:rPr>
+          <w:rFonts w:ascii="Calibri" w:hAnsi="Calibri" w:cs="Calibri"/>
+          <w:lang w:val="el-GR"/>
+        </w:rPr>
+        <w:t xml:space="preserve">.1 και </w:t>
+      </w:r>
+      <w:r>
+        <w:rPr>
+          <w:rFonts w:ascii="Calibri" w:hAnsi="Calibri" w:cs="Calibri"/>
+          <w:lang w:val="el-GR"/>
+        </w:rPr>
+        <w:t>9</w:t>
+      </w:r>
+      <w:r>
+        <w:rPr>
+          <w:rFonts w:ascii="Calibri" w:hAnsi="Calibri" w:cs="Calibri"/>
+          <w:lang w:val="el-GR"/>
+        </w:rPr>
+        <w:t>.2 παρουσιάζουμε την αρχική και την τελική σχεδίαση αντίστοιχα, της οθόνης</w:t>
+      </w:r>
+      <w:r>
+        <w:rPr>
+          <w:rFonts w:ascii="Calibri" w:hAnsi="Calibri" w:cs="Calibri"/>
+          <w:lang w:val="el-GR"/>
+        </w:rPr>
+        <w:t xml:space="preserve"> </w:t>
+      </w:r>
+      <w:r>
+        <w:rPr>
+          <w:rFonts w:ascii="Calibri" w:hAnsi="Calibri" w:cs="Calibri"/>
+        </w:rPr>
+        <w:t>Login</w:t>
+      </w:r>
+      <w:r>
+        <w:rPr>
+          <w:rFonts w:ascii="Calibri" w:hAnsi="Calibri" w:cs="Calibri"/>
+          <w:lang w:val="el-GR"/>
+        </w:rPr>
+        <w:t>. Ο χρήστης εισάγει τα στοιχεία του για να αποκτήσει πρόσβαση στην εφαρμογή. Από εδώ μπορεί επίσης να μεταβεί στη σελίδα εγγραφής αν δεν έχει ακόμα λογαριασμό.</w:t>
+      </w:r>
+    </w:p>
+    <w:p>
+      <w:pPr>
+        <w:jc w:val="center"/>
+        <w:rPr>
+          <w:rFonts w:ascii="Calibri" w:hAnsi="Calibri" w:cs="Calibri"/>
+        </w:rPr>
+      </w:pPr>
       <w:r>
         <w:rPr>
           <w:rFonts w:ascii="Calibri" w:hAnsi="Calibri" w:cs="Calibri"/>
           <w:noProof/>
         </w:rPr>
-        <w:t>8</w:t>
-      </w:r>
-      <w:r>
-        <w:rPr>
-          <w:rFonts w:ascii="Calibri" w:hAnsi="Calibri" w:cs="Calibri"/>
-        </w:rPr>
-        <w:fldChar w:fldCharType="end"/>
-      </w:r>
-      <w:r>
-        <w:rPr>
-          <w:rFonts w:ascii="Calibri" w:hAnsi="Calibri" w:cs="Calibri"/>
-          <w:lang w:val="el-GR"/>
-        </w:rPr>
-        <w:t>:</w:t>
-      </w:r>
-      <w:r>
-        <w:rPr>
-          <w:rFonts w:ascii="Calibri" w:hAnsi="Calibri" w:cs="Calibri"/>
-          <w:lang w:val="el-GR"/>
-        </w:rPr>
-        <w:t xml:space="preserve"> </w:t>
-      </w:r>
-      <w:r>
-        <w:rPr>
-          <w:rFonts w:ascii="Calibri" w:hAnsi="Calibri" w:cs="Calibri"/>
-        </w:rPr>
-        <w:t>Admin</w:t>
-      </w:r>
-      <w:r>
-        <w:rPr>
-          <w:rFonts w:ascii="Calibri" w:hAnsi="Calibri" w:cs="Calibri"/>
-          <w:lang w:val="el-GR"/>
-        </w:rPr>
-        <w:t xml:space="preserve"> </w:t>
-      </w:r>
-      <w:r>
-        <w:rPr>
-          <w:rFonts w:ascii="Calibri" w:hAnsi="Calibri" w:cs="Calibri"/>
-        </w:rPr>
-        <w:t>Panel</w:t>
-      </w:r>
-    </w:p>
-    <w:p>
-      <w:pPr>
-        <w:rPr>
-          <w:rFonts w:ascii="Calibri" w:hAnsi="Calibri" w:cs="Calibri"/>
-          <w:lang w:val="el-GR"/>
-        </w:rPr>
-      </w:pPr>
-    </w:p>
-    <w:p>
-      <w:pPr>
-        <w:jc w:val="both"/>
-        <w:rPr>
-          <w:rFonts w:ascii="Calibri" w:hAnsi="Calibri" w:cs="Calibri"/>
-          <w:lang w:val="el-GR"/>
-        </w:rPr>
-      </w:pPr>
-      <w:r>
-        <w:rPr>
-          <w:rFonts w:ascii="Calibri" w:hAnsi="Calibri" w:cs="Calibri"/>
-          <w:lang w:val="el-GR"/>
-        </w:rPr>
-        <w:t xml:space="preserve">Στην εικόνα 9 παρουσιάζουμε το </w:t>
-      </w:r>
-      <w:r>
-        <w:rPr>
-          <w:rFonts w:ascii="Calibri" w:hAnsi="Calibri" w:cs="Calibri"/>
-        </w:rPr>
-        <w:t>mock</w:t>
-      </w:r>
-      <w:r>
-        <w:rPr>
-          <w:rFonts w:ascii="Calibri" w:hAnsi="Calibri" w:cs="Calibri"/>
-          <w:lang w:val="el-GR"/>
-        </w:rPr>
-        <w:t>-</w:t>
-      </w:r>
-      <w:r>
-        <w:rPr>
-          <w:rFonts w:ascii="Calibri" w:hAnsi="Calibri" w:cs="Calibri"/>
-        </w:rPr>
-        <w:t>up</w:t>
-      </w:r>
-      <w:r>
-        <w:rPr>
-          <w:rFonts w:ascii="Calibri" w:hAnsi="Calibri" w:cs="Calibri"/>
-          <w:lang w:val="el-GR"/>
-        </w:rPr>
-        <w:t xml:space="preserve"> </w:t>
-      </w:r>
-      <w:r>
-        <w:rPr>
-          <w:rFonts w:ascii="Calibri" w:hAnsi="Calibri" w:cs="Calibri"/>
-        </w:rPr>
-        <w:t>screen</w:t>
-      </w:r>
-      <w:r>
-        <w:rPr>
-          <w:rFonts w:ascii="Calibri" w:hAnsi="Calibri" w:cs="Calibri"/>
-          <w:lang w:val="el-GR"/>
-        </w:rPr>
-        <w:t xml:space="preserve"> </w:t>
-      </w:r>
-      <w:r>
-        <w:rPr>
-          <w:rFonts w:ascii="Calibri" w:hAnsi="Calibri" w:cs="Calibri"/>
-          <w:lang w:val="el-GR"/>
-        </w:rPr>
-        <w:t>της</w:t>
-      </w:r>
-      <w:r>
-        <w:rPr>
-          <w:rFonts w:ascii="Calibri" w:hAnsi="Calibri" w:cs="Calibri"/>
-          <w:lang w:val="el-GR"/>
-        </w:rPr>
-        <w:t xml:space="preserve"> αρχική σελίδα εισόδου. Ο χρήστης εισάγει τα στοιχεία του για να αποκτήσει πρόσβαση στην εφαρμογή. Από εδώ μπορεί επίσης να μεταβεί στη σελίδα εγγραφής αν δεν έχει ακόμα λογαριασμό.</w:t>
-      </w:r>
-    </w:p>
-    <w:p>
-      <w:pPr>
-        <w:jc w:val="center"/>
-        <w:rPr>
-          <w:rFonts w:ascii="Calibri" w:hAnsi="Calibri" w:cs="Calibri"/>
-        </w:rPr>
-      </w:pPr>
-      <w:r>
-        <w:rPr>
-          <w:rFonts w:ascii="Calibri" w:hAnsi="Calibri" w:cs="Calibri"/>
-          <w:noProof/>
-        </w:rPr>
-        <w:lastRenderedPageBreak/>
         <w:drawing>
           <wp:inline distT="0" distB="0" distL="0" distR="0" wp14:anchorId="79174C71" wp14:editId="0DDC92C0">
             <wp:extent cx="4172532" cy="3896269"/>
@@ -6507,7 +6971,7 @@
                     <pic:cNvPicPr/>
                   </pic:nvPicPr>
                   <pic:blipFill>
-                    <a:blip r:embed="rId24"/>
+                    <a:blip r:embed="rId25"/>
                     <a:stretch>
                       <a:fillRect/>
                     </a:stretch>
@@ -6547,60 +7011,9 @@
       <w:r>
         <w:rPr>
           <w:rFonts w:ascii="Calibri" w:hAnsi="Calibri" w:cs="Calibri"/>
-        </w:rPr>
-        <w:fldChar w:fldCharType="begin"/>
-      </w:r>
-      <w:r>
-        <w:rPr>
-          <w:rFonts w:ascii="Calibri" w:hAnsi="Calibri" w:cs="Calibri"/>
-          <w:lang w:val="el-GR"/>
-        </w:rPr>
-        <w:instrText xml:space="preserve"> </w:instrText>
-      </w:r>
-      <w:r>
-        <w:rPr>
-          <w:rFonts w:ascii="Calibri" w:hAnsi="Calibri" w:cs="Calibri"/>
-        </w:rPr>
-        <w:instrText>SEQ</w:instrText>
-      </w:r>
-      <w:r>
-        <w:rPr>
-          <w:rFonts w:ascii="Calibri" w:hAnsi="Calibri" w:cs="Calibri"/>
-          <w:lang w:val="el-GR"/>
-        </w:rPr>
-        <w:instrText xml:space="preserve"> Εικόνα \* </w:instrText>
-      </w:r>
-      <w:r>
-        <w:rPr>
-          <w:rFonts w:ascii="Calibri" w:hAnsi="Calibri" w:cs="Calibri"/>
-        </w:rPr>
-        <w:instrText>ARABIC</w:instrText>
-      </w:r>
-      <w:r>
-        <w:rPr>
-          <w:rFonts w:ascii="Calibri" w:hAnsi="Calibri" w:cs="Calibri"/>
-          <w:lang w:val="el-GR"/>
-        </w:rPr>
-        <w:instrText xml:space="preserve"> </w:instrText>
-      </w:r>
-      <w:r>
-        <w:rPr>
-          <w:rFonts w:ascii="Calibri" w:hAnsi="Calibri" w:cs="Calibri"/>
-        </w:rPr>
-        <w:fldChar w:fldCharType="separate"/>
-      </w:r>
-      <w:r>
-        <w:rPr>
-          <w:rFonts w:ascii="Calibri" w:hAnsi="Calibri" w:cs="Calibri"/>
-          <w:noProof/>
-        </w:rPr>
-        <w:t>9</w:t>
-      </w:r>
-      <w:r>
-        <w:rPr>
-          <w:rFonts w:ascii="Calibri" w:hAnsi="Calibri" w:cs="Calibri"/>
-        </w:rPr>
-        <w:fldChar w:fldCharType="end"/>
+          <w:lang w:val="el-GR"/>
+        </w:rPr>
+        <w:t>9.1</w:t>
       </w:r>
       <w:r>
         <w:rPr>
@@ -6612,99 +7025,255 @@
       <w:r>
         <w:rPr>
           <w:rFonts w:ascii="Calibri" w:hAnsi="Calibri" w:cs="Calibri"/>
+          <w:lang w:val="el-GR"/>
+        </w:rPr>
+        <w:t>Αρχική Σχεδίαση</w:t>
+      </w:r>
+      <w:r>
+        <w:rPr>
+          <w:rFonts w:ascii="Calibri" w:hAnsi="Calibri" w:cs="Calibri"/>
+          <w:lang w:val="el-GR"/>
+        </w:rPr>
+        <w:t xml:space="preserve"> </w:t>
+      </w:r>
+      <w:r>
+        <w:rPr>
+          <w:rFonts w:ascii="Calibri" w:hAnsi="Calibri" w:cs="Calibri"/>
         </w:rPr>
         <w:t>Login</w:t>
       </w:r>
-      <w:r>
-        <w:rPr>
-          <w:rFonts w:ascii="Calibri" w:hAnsi="Calibri" w:cs="Calibri"/>
-          <w:lang w:val="el-GR"/>
-        </w:rPr>
-        <w:t xml:space="preserve"> </w:t>
-      </w:r>
-      <w:r>
-        <w:rPr>
-          <w:rFonts w:ascii="Calibri" w:hAnsi="Calibri" w:cs="Calibri"/>
-        </w:rPr>
-        <w:t>Page</w:t>
-      </w:r>
-    </w:p>
-    <w:p>
-      <w:pPr>
-        <w:jc w:val="both"/>
-        <w:rPr>
-          <w:rFonts w:ascii="Calibri" w:hAnsi="Calibri" w:cs="Calibri"/>
-          <w:lang w:val="el-GR"/>
-        </w:rPr>
-      </w:pPr>
-    </w:p>
-    <w:p>
-      <w:pPr>
-        <w:jc w:val="both"/>
-        <w:rPr>
-          <w:rFonts w:ascii="Calibri" w:hAnsi="Calibri" w:cs="Calibri"/>
-          <w:lang w:val="el-GR"/>
-        </w:rPr>
-      </w:pPr>
-      <w:r>
-        <w:rPr>
-          <w:rFonts w:ascii="Calibri" w:hAnsi="Calibri" w:cs="Calibri"/>
-          <w:lang w:val="el-GR"/>
-        </w:rPr>
-        <w:t xml:space="preserve">Στην εικόνα 10 παρουσιάζουμε το </w:t>
-      </w:r>
-      <w:r>
-        <w:rPr>
-          <w:rFonts w:ascii="Calibri" w:hAnsi="Calibri" w:cs="Calibri"/>
-        </w:rPr>
-        <w:t>mock</w:t>
-      </w:r>
-      <w:r>
-        <w:rPr>
-          <w:rFonts w:ascii="Calibri" w:hAnsi="Calibri" w:cs="Calibri"/>
-          <w:lang w:val="el-GR"/>
-        </w:rPr>
-        <w:t>-</w:t>
-      </w:r>
-      <w:r>
-        <w:rPr>
-          <w:rFonts w:ascii="Calibri" w:hAnsi="Calibri" w:cs="Calibri"/>
-        </w:rPr>
-        <w:t>up</w:t>
-      </w:r>
-      <w:r>
-        <w:rPr>
-          <w:rFonts w:ascii="Calibri" w:hAnsi="Calibri" w:cs="Calibri"/>
-          <w:lang w:val="el-GR"/>
-        </w:rPr>
-        <w:t xml:space="preserve"> </w:t>
-      </w:r>
-      <w:r>
-        <w:rPr>
-          <w:rFonts w:ascii="Calibri" w:hAnsi="Calibri" w:cs="Calibri"/>
-        </w:rPr>
-        <w:t>screen</w:t>
-      </w:r>
-      <w:r>
-        <w:rPr>
-          <w:rFonts w:ascii="Calibri" w:hAnsi="Calibri" w:cs="Calibri"/>
-          <w:lang w:val="el-GR"/>
-        </w:rPr>
-        <w:t xml:space="preserve"> </w:t>
-      </w:r>
-      <w:r>
-        <w:rPr>
-          <w:rFonts w:ascii="Calibri" w:hAnsi="Calibri" w:cs="Calibri"/>
-          <w:lang w:val="el-GR"/>
-        </w:rPr>
-        <w:t>για τη ο</w:t>
-      </w:r>
-      <w:r>
-        <w:rPr>
-          <w:rFonts w:ascii="Calibri" w:hAnsi="Calibri" w:cs="Calibri"/>
-          <w:lang w:val="el-GR"/>
-        </w:rPr>
-        <w:t>θόνη εγγραφής νέου χρήστη. Ο χρήστης ορίζει ένα μοναδικό όνομα χρήστη, email και κωδικό πρόσβασης. Κάθε νέος χρήστης λαμβάνει αυτόματα τον ρόλο του Developer. Η ανάθεση διαχειριστικών ρόλων γίνεται αποκλειστικά μέσω του Admin Panel.</w:t>
+    </w:p>
+    <w:p>
+      <w:pPr>
+        <w:jc w:val="both"/>
+        <w:rPr>
+          <w:rFonts w:ascii="Calibri" w:hAnsi="Calibri" w:cs="Calibri"/>
+        </w:rPr>
+      </w:pPr>
+    </w:p>
+    <w:p>
+      <w:pPr>
+        <w:jc w:val="both"/>
+        <w:rPr>
+          <w:rFonts w:ascii="Calibri" w:hAnsi="Calibri" w:cs="Calibri"/>
+        </w:rPr>
+      </w:pPr>
+    </w:p>
+    <w:p>
+      <w:pPr>
+        <w:jc w:val="both"/>
+        <w:rPr>
+          <w:rFonts w:ascii="Calibri" w:hAnsi="Calibri" w:cs="Calibri"/>
+        </w:rPr>
+      </w:pPr>
+    </w:p>
+    <w:p>
+      <w:pPr>
+        <w:jc w:val="both"/>
+        <w:rPr>
+          <w:rFonts w:ascii="Calibri" w:hAnsi="Calibri" w:cs="Calibri"/>
+        </w:rPr>
+      </w:pPr>
+    </w:p>
+    <w:p>
+      <w:pPr>
+        <w:jc w:val="both"/>
+        <w:rPr>
+          <w:rFonts w:ascii="Calibri" w:hAnsi="Calibri" w:cs="Calibri"/>
+        </w:rPr>
+      </w:pPr>
+    </w:p>
+    <w:p>
+      <w:pPr>
+        <w:jc w:val="both"/>
+        <w:rPr>
+          <w:rFonts w:ascii="Calibri" w:hAnsi="Calibri" w:cs="Calibri"/>
+        </w:rPr>
+      </w:pPr>
+    </w:p>
+    <w:p>
+      <w:pPr>
+        <w:jc w:val="both"/>
+        <w:rPr>
+          <w:rFonts w:ascii="Calibri" w:hAnsi="Calibri" w:cs="Calibri"/>
+        </w:rPr>
+      </w:pPr>
+    </w:p>
+    <w:p>
+      <w:pPr>
+        <w:jc w:val="both"/>
+        <w:rPr>
+          <w:rFonts w:ascii="Calibri" w:hAnsi="Calibri" w:cs="Calibri"/>
+        </w:rPr>
+      </w:pPr>
+    </w:p>
+    <w:p>
+      <w:pPr>
+        <w:jc w:val="both"/>
+        <w:rPr>
+          <w:rFonts w:ascii="Calibri" w:hAnsi="Calibri" w:cs="Calibri"/>
+        </w:rPr>
+      </w:pPr>
+    </w:p>
+    <w:p>
+      <w:pPr>
+        <w:pStyle w:val="Heading3"/>
+        <w:numPr>
+          <w:ilvl w:val="0"/>
+          <w:numId w:val="4"/>
+        </w:numPr>
+        <w:pBdr>
+          <w:bottom w:val="single" w:sz="4" w:space="1" w:color="auto"/>
+        </w:pBdr>
+        <w:rPr>
+          <w:b/>
+          <w:bCs/>
+          <w:lang w:val="el-GR"/>
+        </w:rPr>
+      </w:pPr>
+      <w:r>
+        <w:rPr>
+          <w:b/>
+          <w:bCs/>
+        </w:rPr>
+        <w:t>Register</w:t>
+      </w:r>
+    </w:p>
+    <w:p>
+      <w:pPr>
+        <w:jc w:val="both"/>
+        <w:rPr>
+          <w:rFonts w:ascii="Calibri" w:hAnsi="Calibri" w:cs="Calibri"/>
+          <w:lang w:val="el-GR"/>
+        </w:rPr>
+      </w:pPr>
+      <w:r>
+        <w:rPr>
+          <w:rFonts w:ascii="Calibri" w:hAnsi="Calibri" w:cs="Calibri"/>
+          <w:lang w:val="el-GR"/>
+        </w:rPr>
+        <w:t>Στ</w:t>
+      </w:r>
+      <w:r>
+        <w:rPr>
+          <w:rFonts w:ascii="Calibri" w:hAnsi="Calibri" w:cs="Calibri"/>
+          <w:lang w:val="el-GR"/>
+        </w:rPr>
+        <w:t>ις</w:t>
+      </w:r>
+      <w:r>
+        <w:rPr>
+          <w:rFonts w:ascii="Calibri" w:hAnsi="Calibri" w:cs="Calibri"/>
+          <w:lang w:val="el-GR"/>
+        </w:rPr>
+        <w:t xml:space="preserve"> εικόν</w:t>
+      </w:r>
+      <w:r>
+        <w:rPr>
+          <w:rFonts w:ascii="Calibri" w:hAnsi="Calibri" w:cs="Calibri"/>
+          <w:lang w:val="el-GR"/>
+        </w:rPr>
+        <w:t>ες</w:t>
+      </w:r>
+      <w:r>
+        <w:rPr>
+          <w:rFonts w:ascii="Calibri" w:hAnsi="Calibri" w:cs="Calibri"/>
+          <w:lang w:val="el-GR"/>
+        </w:rPr>
+        <w:t xml:space="preserve"> </w:t>
+      </w:r>
+      <w:r>
+        <w:rPr>
+          <w:rFonts w:ascii="Calibri" w:hAnsi="Calibri" w:cs="Calibri"/>
+          <w:lang w:val="el-GR"/>
+        </w:rPr>
+        <w:t>10</w:t>
+      </w:r>
+      <w:r>
+        <w:rPr>
+          <w:rFonts w:ascii="Calibri" w:hAnsi="Calibri" w:cs="Calibri"/>
+          <w:lang w:val="el-GR"/>
+        </w:rPr>
+        <w:t xml:space="preserve">.1 και </w:t>
+      </w:r>
+      <w:r>
+        <w:rPr>
+          <w:rFonts w:ascii="Calibri" w:hAnsi="Calibri" w:cs="Calibri"/>
+          <w:lang w:val="el-GR"/>
+        </w:rPr>
+        <w:t>10</w:t>
+      </w:r>
+      <w:r>
+        <w:rPr>
+          <w:rFonts w:ascii="Calibri" w:hAnsi="Calibri" w:cs="Calibri"/>
+          <w:lang w:val="el-GR"/>
+        </w:rPr>
+        <w:t>.2 παρουσιάζουμε την αρχική και την τελική σχεδίαση αντίστοιχα, της οθόνης</w:t>
+      </w:r>
+      <w:r>
+        <w:rPr>
+          <w:rFonts w:ascii="Calibri" w:hAnsi="Calibri" w:cs="Calibri"/>
+          <w:lang w:val="el-GR"/>
+        </w:rPr>
+        <w:t xml:space="preserve"> </w:t>
+      </w:r>
+      <w:r>
+        <w:rPr>
+          <w:rFonts w:ascii="Calibri" w:hAnsi="Calibri" w:cs="Calibri"/>
+        </w:rPr>
+        <w:t>Register</w:t>
+      </w:r>
+      <w:r>
+        <w:rPr>
+          <w:rFonts w:ascii="Calibri" w:hAnsi="Calibri" w:cs="Calibri"/>
+          <w:lang w:val="el-GR"/>
+        </w:rPr>
+        <w:t xml:space="preserve">. Ο χρήστης ορίζει ένα μοναδικό όνομα χρήστη, email και κωδικό πρόσβασης. Κάθε νέος χρήστης λαμβάνει αυτόματα τον ρόλο του Developer. Η ανάθεση διαχειριστικών ρόλων γίνεται αποκλειστικά μέσω του </w:t>
+      </w:r>
+      <w:hyperlink w:anchor="_User_Management" w:history="1">
+        <w:r>
+          <w:rPr>
+            <w:rStyle w:val="Hyperlink"/>
+            <w:rFonts w:ascii="Calibri" w:hAnsi="Calibri" w:cs="Calibri"/>
+          </w:rPr>
+          <w:t>User</w:t>
+        </w:r>
+        <w:r>
+          <w:rPr>
+            <w:rStyle w:val="Hyperlink"/>
+            <w:rFonts w:ascii="Calibri" w:hAnsi="Calibri" w:cs="Calibri"/>
+            <w:lang w:val="el-GR"/>
+          </w:rPr>
+          <w:t xml:space="preserve"> </w:t>
+        </w:r>
+        <w:r>
+          <w:rPr>
+            <w:rStyle w:val="Hyperlink"/>
+            <w:rFonts w:ascii="Calibri" w:hAnsi="Calibri" w:cs="Calibri"/>
+          </w:rPr>
+          <w:t>Managem</w:t>
+        </w:r>
+        <w:r>
+          <w:rPr>
+            <w:rStyle w:val="Hyperlink"/>
+            <w:rFonts w:ascii="Calibri" w:hAnsi="Calibri" w:cs="Calibri"/>
+          </w:rPr>
+          <w:t>e</w:t>
+        </w:r>
+        <w:r>
+          <w:rPr>
+            <w:rStyle w:val="Hyperlink"/>
+            <w:rFonts w:ascii="Calibri" w:hAnsi="Calibri" w:cs="Calibri"/>
+          </w:rPr>
+          <w:t>nt</w:t>
+        </w:r>
+      </w:hyperlink>
+      <w:r>
+        <w:rPr>
+          <w:rFonts w:ascii="Calibri" w:hAnsi="Calibri" w:cs="Calibri"/>
+          <w:lang w:val="el-GR"/>
+        </w:rPr>
+        <w:t>.</w:t>
       </w:r>
     </w:p>
     <w:p>
@@ -6729,7 +7298,6 @@
           <w:rFonts w:ascii="Calibri" w:hAnsi="Calibri" w:cs="Calibri"/>
           <w:noProof/>
         </w:rPr>
-        <w:lastRenderedPageBreak/>
         <w:drawing>
           <wp:inline distT="0" distB="0" distL="0" distR="0" wp14:anchorId="2D201FE4" wp14:editId="447447AB">
             <wp:extent cx="4401164" cy="4667901"/>
@@ -6746,7 +7314,7 @@
                     <pic:cNvPicPr/>
                   </pic:nvPicPr>
                   <pic:blipFill>
-                    <a:blip r:embed="rId25"/>
+                    <a:blip r:embed="rId26"/>
                     <a:stretch>
                       <a:fillRect/>
                     </a:stretch>
@@ -6832,8 +7400,24 @@
         <w:rPr>
           <w:rFonts w:ascii="Calibri" w:hAnsi="Calibri" w:cs="Calibri"/>
           <w:noProof/>
-        </w:rPr>
-        <w:t>10</w:t>
+          <w:lang w:val="el-GR"/>
+        </w:rPr>
+        <w:t>1</w:t>
+      </w:r>
+      <w:r>
+        <w:rPr>
+          <w:rFonts w:ascii="Calibri" w:hAnsi="Calibri" w:cs="Calibri"/>
+          <w:noProof/>
+        </w:rPr>
+        <w:t>0.</w:t>
+      </w:r>
+      <w:r>
+        <w:rPr>
+          <w:rFonts w:ascii="Calibri" w:hAnsi="Calibri" w:cs="Calibri"/>
+          <w:noProof/>
+          <w:lang w:val="el-GR"/>
+        </w:rPr>
+        <w:t>1</w:t>
       </w:r>
       <w:r>
         <w:rPr>
@@ -6851,21 +7435,22 @@
       <w:r>
         <w:rPr>
           <w:rFonts w:ascii="Calibri" w:hAnsi="Calibri" w:cs="Calibri"/>
+          <w:lang w:val="el-GR"/>
+        </w:rPr>
+        <w:t>Αρχική Σχεδίαση</w:t>
+      </w:r>
+      <w:r>
+        <w:rPr>
+          <w:rFonts w:ascii="Calibri" w:hAnsi="Calibri" w:cs="Calibri"/>
+          <w:lang w:val="el-GR"/>
+        </w:rPr>
+        <w:t xml:space="preserve"> </w:t>
+      </w:r>
+      <w:r>
+        <w:rPr>
+          <w:rFonts w:ascii="Calibri" w:hAnsi="Calibri" w:cs="Calibri"/>
         </w:rPr>
         <w:t>Register</w:t>
-      </w:r>
-      <w:r>
-        <w:rPr>
-          <w:rFonts w:ascii="Calibri" w:hAnsi="Calibri" w:cs="Calibri"/>
-          <w:lang w:val="el-GR"/>
-        </w:rPr>
-        <w:t xml:space="preserve"> </w:t>
-      </w:r>
-      <w:r>
-        <w:rPr>
-          <w:rFonts w:ascii="Calibri" w:hAnsi="Calibri" w:cs="Calibri"/>
-        </w:rPr>
-        <w:t>Page</w:t>
       </w:r>
     </w:p>
     <w:p>
@@ -6998,7 +7583,7 @@
         </w:rPr>
         <w:t xml:space="preserve"> της εφαρμογής δημιουργήθηκε μέσω του </w:t>
       </w:r>
-      <w:hyperlink r:id="rId26" w:history="1">
+      <w:hyperlink r:id="rId27" w:history="1">
         <w:r>
           <w:rPr>
             <w:rStyle w:val="Hyperlink"/>
@@ -7053,7 +7638,7 @@
         </w:rPr>
         <w:t xml:space="preserve"> υλοποιήθηκαν με τη χρήση του εργαλείου </w:t>
       </w:r>
-      <w:hyperlink r:id="rId27" w:history="1">
+      <w:hyperlink r:id="rId28" w:history="1">
         <w:r>
           <w:rPr>
             <w:rStyle w:val="Hyperlink"/>
@@ -7087,8 +7672,8 @@
       </w:pPr>
     </w:p>
     <w:sectPr>
-      <w:headerReference w:type="default" r:id="rId28"/>
-      <w:footerReference w:type="default" r:id="rId29"/>
+      <w:headerReference w:type="default" r:id="rId29"/>
+      <w:footerReference w:type="default" r:id="rId30"/>
       <w:pgSz w:w="12240" w:h="15840"/>
       <w:pgMar w:top="1440" w:right="1440" w:bottom="1440" w:left="1440" w:header="720" w:footer="720" w:gutter="0"/>
       <w:cols w:space="720"/>

</xml_diff>

<commit_message>
update project description file
</commit_message>
<xml_diff>
--- a/4th_phase/Project-description-v1.0.docx
+++ b/4th_phase/Project-description-v1.0.docx
@@ -6835,6 +6835,9 @@
         </w:rPr>
       </w:pPr>
       <w:r>
+        <w:rPr>
+          <w:noProof/>
+        </w:rPr>
         <w:lastRenderedPageBreak/>
         <w:drawing>
           <wp:inline distT="0" distB="0" distL="0" distR="0" wp14:anchorId="374AA4A1" wp14:editId="1F0B597E">
@@ -7419,6 +7422,9 @@
         <w:jc w:val="center"/>
       </w:pPr>
       <w:r>
+        <w:rPr>
+          <w:noProof/>
+        </w:rPr>
         <w:drawing>
           <wp:inline distT="0" distB="0" distL="0" distR="0" wp14:anchorId="2031C3FB" wp14:editId="29C25E26">
             <wp:extent cx="5943600" cy="3805555"/>
@@ -7580,6 +7586,13 @@
         </w:rPr>
         <w:t>Participants Screen</w:t>
       </w:r>
+      <w:r>
+        <w:rPr>
+          <w:b/>
+          <w:bCs/>
+        </w:rPr>
+        <w:t xml:space="preserve"> </w:t>
+      </w:r>
     </w:p>
     <w:p>
       <w:pPr>
@@ -7748,6 +7761,7 @@
       <w:r>
         <w:rPr>
           <w:rFonts w:ascii="Calibri" w:hAnsi="Calibri" w:cs="Calibri"/>
+          <w:noProof/>
         </w:rPr>
         <w:drawing>
           <wp:inline distT="0" distB="0" distL="0" distR="0" wp14:anchorId="194E3AD3" wp14:editId="7CDB45EA">
@@ -7904,6 +7918,7 @@
         <w:jc w:val="both"/>
         <w:rPr>
           <w:rFonts w:ascii="Calibri" w:hAnsi="Calibri" w:cs="Calibri"/>
+          <w:lang w:val="el-GR"/>
         </w:rPr>
       </w:pPr>
       <w:r>
@@ -7995,6 +8010,7 @@
         <w:jc w:val="both"/>
         <w:rPr>
           <w:rFonts w:ascii="Calibri" w:hAnsi="Calibri" w:cs="Calibri"/>
+          <w:lang w:val="el-GR"/>
         </w:rPr>
       </w:pPr>
     </w:p>
@@ -8177,6 +8193,7 @@
       <w:r>
         <w:rPr>
           <w:rFonts w:ascii="Calibri" w:hAnsi="Calibri" w:cs="Calibri"/>
+          <w:noProof/>
         </w:rPr>
         <w:drawing>
           <wp:inline distT="0" distB="0" distL="0" distR="0" wp14:anchorId="50EE16EF" wp14:editId="6B052EED">
@@ -8237,6 +8254,7 @@
         </w:rPr>
         <w:t xml:space="preserve">Τελική </w:t>
       </w:r>
+      <w:proofErr w:type="gramStart"/>
       <w:r>
         <w:rPr>
           <w:lang w:val="el-GR"/>
@@ -8258,6 +8276,7 @@
       <w:r>
         <w:t>Login</w:t>
       </w:r>
+      <w:proofErr w:type="gramEnd"/>
     </w:p>
     <w:p>
       <w:pPr>
@@ -8649,6 +8668,7 @@
       <w:r>
         <w:rPr>
           <w:rFonts w:ascii="Calibri" w:hAnsi="Calibri" w:cs="Calibri"/>
+          <w:noProof/>
         </w:rPr>
         <w:drawing>
           <wp:inline distT="0" distB="0" distL="0" distR="0" wp14:anchorId="29F851DC" wp14:editId="1AF9D052">
@@ -8693,15 +8713,14 @@
         <w:jc w:val="center"/>
         <w:rPr>
           <w:rFonts w:ascii="Calibri" w:hAnsi="Calibri" w:cs="Calibri"/>
-        </w:rPr>
-      </w:pPr>
-      <w:proofErr w:type="spellStart"/>
-      <w:r>
-        <w:t>Εικόν</w:t>
-      </w:r>
-      <w:proofErr w:type="spellEnd"/>
-      <w:r>
-        <w:t xml:space="preserve">α 11.2: </w:t>
+          <w:lang w:val="el-GR"/>
+        </w:rPr>
+      </w:pPr>
+      <w:r>
+        <w:rPr>
+          <w:lang w:val="el-GR"/>
+        </w:rPr>
+        <w:t xml:space="preserve">Εικόνα 11.2: </w:t>
       </w:r>
       <w:r>
         <w:rPr>
@@ -8741,55 +8760,775 @@
       <w:pPr>
         <w:rPr>
           <w:rFonts w:ascii="Calibri" w:hAnsi="Calibri" w:cs="Calibri"/>
-        </w:rPr>
-      </w:pPr>
-    </w:p>
-    <w:p>
-      <w:pPr>
-        <w:rPr>
-          <w:rFonts w:ascii="Calibri" w:hAnsi="Calibri" w:cs="Calibri"/>
-        </w:rPr>
-      </w:pPr>
-    </w:p>
-    <w:p>
-      <w:pPr>
-        <w:rPr>
-          <w:rFonts w:ascii="Calibri" w:hAnsi="Calibri" w:cs="Calibri"/>
-        </w:rPr>
-      </w:pPr>
-    </w:p>
-    <w:p>
-      <w:pPr>
-        <w:rPr>
-          <w:rFonts w:ascii="Calibri" w:hAnsi="Calibri" w:cs="Calibri"/>
-        </w:rPr>
-      </w:pPr>
-    </w:p>
-    <w:p>
-      <w:pPr>
-        <w:rPr>
-          <w:rFonts w:ascii="Calibri" w:hAnsi="Calibri" w:cs="Calibri"/>
-        </w:rPr>
-      </w:pPr>
-    </w:p>
-    <w:p>
-      <w:pPr>
-        <w:rPr>
-          <w:rFonts w:ascii="Calibri" w:hAnsi="Calibri" w:cs="Calibri"/>
-        </w:rPr>
-      </w:pPr>
-    </w:p>
-    <w:p>
-      <w:pPr>
-        <w:rPr>
-          <w:rFonts w:ascii="Calibri" w:hAnsi="Calibri" w:cs="Calibri"/>
-        </w:rPr>
-      </w:pPr>
-    </w:p>
-    <w:p>
-      <w:pPr>
-        <w:rPr>
-          <w:rFonts w:ascii="Calibri" w:hAnsi="Calibri" w:cs="Calibri"/>
+          <w:lang w:val="el-GR"/>
+        </w:rPr>
+      </w:pPr>
+    </w:p>
+    <w:p>
+      <w:pPr>
+        <w:rPr>
+          <w:rFonts w:ascii="Calibri" w:hAnsi="Calibri" w:cs="Calibri"/>
+          <w:lang w:val="el-GR"/>
+        </w:rPr>
+      </w:pPr>
+    </w:p>
+    <w:p>
+      <w:pPr>
+        <w:rPr>
+          <w:rFonts w:ascii="Calibri" w:hAnsi="Calibri" w:cs="Calibri"/>
+          <w:lang w:val="el-GR"/>
+        </w:rPr>
+      </w:pPr>
+    </w:p>
+    <w:p>
+      <w:pPr>
+        <w:rPr>
+          <w:rFonts w:ascii="Calibri" w:hAnsi="Calibri" w:cs="Calibri"/>
+          <w:lang w:val="el-GR"/>
+        </w:rPr>
+      </w:pPr>
+    </w:p>
+    <w:p>
+      <w:pPr>
+        <w:rPr>
+          <w:rFonts w:ascii="Calibri" w:hAnsi="Calibri" w:cs="Calibri"/>
+        </w:rPr>
+      </w:pPr>
+    </w:p>
+    <w:p>
+      <w:pPr>
+        <w:rPr>
+          <w:rFonts w:ascii="Calibri" w:hAnsi="Calibri" w:cs="Calibri"/>
+        </w:rPr>
+      </w:pPr>
+    </w:p>
+    <w:p>
+      <w:pPr>
+        <w:rPr>
+          <w:rFonts w:ascii="Calibri" w:hAnsi="Calibri" w:cs="Calibri"/>
+        </w:rPr>
+      </w:pPr>
+    </w:p>
+    <w:p>
+      <w:pPr>
+        <w:rPr>
+          <w:rFonts w:ascii="Calibri" w:hAnsi="Calibri" w:cs="Calibri"/>
+        </w:rPr>
+      </w:pPr>
+    </w:p>
+    <w:p>
+      <w:pPr>
+        <w:pStyle w:val="Heading3"/>
+        <w:numPr>
+          <w:ilvl w:val="0"/>
+          <w:numId w:val="4"/>
+        </w:numPr>
+        <w:pBdr>
+          <w:bottom w:val="single" w:sz="4" w:space="1" w:color="auto"/>
+        </w:pBdr>
+        <w:rPr>
+          <w:b/>
+          <w:bCs/>
+          <w:lang w:val="el-GR"/>
+        </w:rPr>
+      </w:pPr>
+      <w:r>
+        <w:rPr>
+          <w:b/>
+          <w:bCs/>
+        </w:rPr>
+        <w:t xml:space="preserve">Participants </w:t>
+      </w:r>
+      <w:r>
+        <w:rPr>
+          <w:b/>
+          <w:bCs/>
+        </w:rPr>
+        <w:t>Form</w:t>
+      </w:r>
+    </w:p>
+    <w:p>
+      <w:pPr>
+        <w:rPr>
+          <w:rFonts w:ascii="Calibri" w:hAnsi="Calibri" w:cs="Calibri"/>
+          <w:lang w:val="el-GR"/>
+        </w:rPr>
+      </w:pPr>
+      <w:r>
+        <w:rPr>
+          <w:rFonts w:ascii="Calibri" w:hAnsi="Calibri" w:cs="Calibri"/>
+          <w:lang w:val="el-GR"/>
+        </w:rPr>
+        <w:t>Στ</w:t>
+      </w:r>
+      <w:r>
+        <w:rPr>
+          <w:rFonts w:ascii="Calibri" w:hAnsi="Calibri" w:cs="Calibri"/>
+          <w:lang w:val="el-GR"/>
+        </w:rPr>
+        <w:t>ην</w:t>
+      </w:r>
+      <w:r>
+        <w:rPr>
+          <w:rFonts w:ascii="Calibri" w:hAnsi="Calibri" w:cs="Calibri"/>
+          <w:lang w:val="el-GR"/>
+        </w:rPr>
+        <w:t xml:space="preserve"> εικόν</w:t>
+      </w:r>
+      <w:r>
+        <w:rPr>
+          <w:rFonts w:ascii="Calibri" w:hAnsi="Calibri" w:cs="Calibri"/>
+          <w:lang w:val="el-GR"/>
+        </w:rPr>
+        <w:t>α</w:t>
+      </w:r>
+      <w:r>
+        <w:rPr>
+          <w:rFonts w:ascii="Calibri" w:hAnsi="Calibri" w:cs="Calibri"/>
+          <w:lang w:val="el-GR"/>
+        </w:rPr>
+        <w:t xml:space="preserve"> </w:t>
+      </w:r>
+      <w:r>
+        <w:rPr>
+          <w:rFonts w:ascii="Calibri" w:hAnsi="Calibri" w:cs="Calibri"/>
+          <w:lang w:val="el-GR"/>
+        </w:rPr>
+        <w:t>12</w:t>
+      </w:r>
+      <w:r>
+        <w:rPr>
+          <w:rFonts w:ascii="Calibri" w:hAnsi="Calibri" w:cs="Calibri"/>
+          <w:lang w:val="el-GR"/>
+        </w:rPr>
+        <w:t xml:space="preserve"> παρουσιάζουμε την οθόνη</w:t>
+      </w:r>
+      <w:r>
+        <w:rPr>
+          <w:rFonts w:ascii="Calibri" w:hAnsi="Calibri" w:cs="Calibri"/>
+          <w:lang w:val="el-GR"/>
+        </w:rPr>
+        <w:t xml:space="preserve"> </w:t>
+      </w:r>
+      <w:r>
+        <w:rPr>
+          <w:rFonts w:ascii="Calibri" w:hAnsi="Calibri" w:cs="Calibri"/>
+        </w:rPr>
+        <w:t>Participants</w:t>
+      </w:r>
+      <w:r>
+        <w:rPr>
+          <w:rFonts w:ascii="Calibri" w:hAnsi="Calibri" w:cs="Calibri"/>
+          <w:lang w:val="el-GR"/>
+        </w:rPr>
+        <w:t xml:space="preserve"> </w:t>
+      </w:r>
+      <w:r>
+        <w:rPr>
+          <w:rFonts w:ascii="Calibri" w:hAnsi="Calibri" w:cs="Calibri"/>
+        </w:rPr>
+        <w:t>Form</w:t>
+      </w:r>
+      <w:r>
+        <w:rPr>
+          <w:rFonts w:ascii="Calibri" w:hAnsi="Calibri" w:cs="Calibri"/>
+          <w:lang w:val="el-GR"/>
+        </w:rPr>
+        <w:t xml:space="preserve">. </w:t>
+      </w:r>
+      <w:r>
+        <w:rPr>
+          <w:rFonts w:ascii="Calibri" w:hAnsi="Calibri" w:cs="Calibri"/>
+          <w:lang w:val="el-GR"/>
+        </w:rPr>
+        <w:t>Η σελίδα αυτή είναι υπεύθυνη για</w:t>
+      </w:r>
+      <w:r>
+        <w:rPr>
+          <w:rFonts w:ascii="Calibri" w:hAnsi="Calibri" w:cs="Calibri"/>
+          <w:lang w:val="el-GR"/>
+        </w:rPr>
+        <w:t xml:space="preserve"> </w:t>
+      </w:r>
+      <w:r>
+        <w:rPr>
+          <w:rFonts w:ascii="Calibri" w:hAnsi="Calibri" w:cs="Calibri"/>
+          <w:lang w:val="el-GR"/>
+        </w:rPr>
+        <w:t xml:space="preserve">την προσθήκη χρηστών σε </w:t>
+      </w:r>
+      <w:r>
+        <w:rPr>
+          <w:rFonts w:ascii="Calibri" w:hAnsi="Calibri" w:cs="Calibri"/>
+        </w:rPr>
+        <w:t>project</w:t>
+      </w:r>
+      <w:r>
+        <w:rPr>
+          <w:rFonts w:ascii="Calibri" w:hAnsi="Calibri" w:cs="Calibri"/>
+          <w:lang w:val="el-GR"/>
+        </w:rPr>
+        <w:t xml:space="preserve"> </w:t>
+      </w:r>
+      <w:r>
+        <w:rPr>
+          <w:rFonts w:ascii="Calibri" w:hAnsi="Calibri" w:cs="Calibri"/>
+          <w:lang w:val="el-GR"/>
+        </w:rPr>
+        <w:t>από τον Ιδιοκτήτη Οργανισμού</w:t>
+      </w:r>
+      <w:r>
+        <w:rPr>
+          <w:rFonts w:ascii="Calibri" w:hAnsi="Calibri" w:cs="Calibri"/>
+          <w:lang w:val="el-GR"/>
+        </w:rPr>
+        <w:t>.</w:t>
+      </w:r>
+    </w:p>
+    <w:p>
+      <w:pPr>
+        <w:rPr>
+          <w:rFonts w:ascii="Calibri" w:hAnsi="Calibri" w:cs="Calibri"/>
+          <w:lang w:val="el-GR"/>
+        </w:rPr>
+      </w:pPr>
+    </w:p>
+    <w:p>
+      <w:pPr>
+        <w:keepNext/>
+        <w:jc w:val="center"/>
+      </w:pPr>
+      <w:r>
+        <w:rPr>
+          <w:rFonts w:ascii="Calibri" w:hAnsi="Calibri" w:cs="Calibri"/>
+        </w:rPr>
+        <w:drawing>
+          <wp:inline distT="0" distB="0" distL="0" distR="0" wp14:anchorId="45C083B5" wp14:editId="49B596FC">
+            <wp:extent cx="5943600" cy="3808730"/>
+            <wp:effectExtent l="0" t="0" r="0" b="1270"/>
+            <wp:docPr id="1328190465" name="Picture 1"/>
+            <wp:cNvGraphicFramePr>
+              <a:graphicFrameLocks xmlns:a="http://schemas.openxmlformats.org/drawingml/2006/main" noChangeAspect="1"/>
+            </wp:cNvGraphicFramePr>
+            <a:graphic xmlns:a="http://schemas.openxmlformats.org/drawingml/2006/main">
+              <a:graphicData uri="http://schemas.openxmlformats.org/drawingml/2006/picture">
+                <pic:pic xmlns:pic="http://schemas.openxmlformats.org/drawingml/2006/picture">
+                  <pic:nvPicPr>
+                    <pic:cNvPr id="1328190465" name=""/>
+                    <pic:cNvPicPr/>
+                  </pic:nvPicPr>
+                  <pic:blipFill>
+                    <a:blip r:embed="rId32"/>
+                    <a:stretch>
+                      <a:fillRect/>
+                    </a:stretch>
+                  </pic:blipFill>
+                  <pic:spPr>
+                    <a:xfrm>
+                      <a:off x="0" y="0"/>
+                      <a:ext cx="5943600" cy="3808730"/>
+                    </a:xfrm>
+                    <a:prstGeom prst="rect">
+                      <a:avLst/>
+                    </a:prstGeom>
+                  </pic:spPr>
+                </pic:pic>
+              </a:graphicData>
+            </a:graphic>
+          </wp:inline>
+        </w:drawing>
+      </w:r>
+    </w:p>
+    <w:p>
+      <w:pPr>
+        <w:pStyle w:val="Caption"/>
+        <w:jc w:val="center"/>
+        <w:rPr>
+          <w:rFonts w:ascii="Calibri" w:hAnsi="Calibri" w:cs="Calibri"/>
+        </w:rPr>
+      </w:pPr>
+      <w:r>
+        <w:rPr>
+          <w:lang w:val="el-GR"/>
+        </w:rPr>
+        <w:t>Εικόνα</w:t>
+      </w:r>
+      <w:r>
+        <w:t xml:space="preserve"> </w:t>
+      </w:r>
+      <w:fldSimple w:instr=" SEQ Figure \* ARABIC ">
+        <w:r>
+          <w:rPr>
+            <w:noProof/>
+          </w:rPr>
+          <w:t>1</w:t>
+        </w:r>
+      </w:fldSimple>
+      <w:r>
+        <w:t xml:space="preserve">2: </w:t>
+      </w:r>
+      <w:r>
+        <w:rPr>
+          <w:lang w:val="el-GR"/>
+        </w:rPr>
+        <w:t>Τελική</w:t>
+      </w:r>
+      <w:r>
+        <w:t xml:space="preserve"> </w:t>
+      </w:r>
+      <w:r>
+        <w:rPr>
+          <w:lang w:val="el-GR"/>
+        </w:rPr>
+        <w:t>οθόνη</w:t>
+      </w:r>
+      <w:r>
+        <w:t xml:space="preserve"> </w:t>
+      </w:r>
+      <w:r>
+        <w:t>Participants Form</w:t>
+      </w:r>
+    </w:p>
+    <w:p>
+      <w:pPr>
+        <w:rPr>
+          <w:rFonts w:ascii="Calibri" w:hAnsi="Calibri" w:cs="Calibri"/>
+        </w:rPr>
+      </w:pPr>
+      <w:r>
+        <w:rPr>
+          <w:rFonts w:ascii="Calibri" w:hAnsi="Calibri" w:cs="Calibri"/>
+        </w:rPr>
+        <w:t xml:space="preserve"> </w:t>
+      </w:r>
+      <w:r>
+        <w:rPr>
+          <w:rFonts w:ascii="Calibri" w:hAnsi="Calibri" w:cs="Calibri"/>
+        </w:rPr>
+        <w:t xml:space="preserve"> </w:t>
+      </w:r>
+    </w:p>
+    <w:p>
+      <w:pPr>
+        <w:rPr>
+          <w:rFonts w:ascii="Calibri" w:hAnsi="Calibri" w:cs="Calibri"/>
+        </w:rPr>
+      </w:pPr>
+    </w:p>
+    <w:p>
+      <w:pPr>
+        <w:rPr>
+          <w:rFonts w:ascii="Calibri" w:hAnsi="Calibri" w:cs="Calibri"/>
+        </w:rPr>
+      </w:pPr>
+    </w:p>
+    <w:p>
+      <w:pPr>
+        <w:rPr>
+          <w:rFonts w:ascii="Calibri" w:hAnsi="Calibri" w:cs="Calibri"/>
+        </w:rPr>
+      </w:pPr>
+    </w:p>
+    <w:p>
+      <w:pPr>
+        <w:rPr>
+          <w:rFonts w:ascii="Calibri" w:hAnsi="Calibri" w:cs="Calibri"/>
+          <w:lang w:val="el-GR"/>
+        </w:rPr>
+      </w:pPr>
+    </w:p>
+    <w:p>
+      <w:pPr>
+        <w:rPr>
+          <w:rFonts w:ascii="Calibri" w:hAnsi="Calibri" w:cs="Calibri"/>
+        </w:rPr>
+      </w:pPr>
+    </w:p>
+    <w:p>
+      <w:pPr>
+        <w:rPr>
+          <w:rFonts w:ascii="Calibri" w:hAnsi="Calibri" w:cs="Calibri"/>
+        </w:rPr>
+      </w:pPr>
+    </w:p>
+    <w:p>
+      <w:pPr>
+        <w:rPr>
+          <w:rFonts w:ascii="Calibri" w:hAnsi="Calibri" w:cs="Calibri"/>
+        </w:rPr>
+      </w:pPr>
+    </w:p>
+    <w:p>
+      <w:pPr>
+        <w:rPr>
+          <w:rFonts w:ascii="Calibri" w:hAnsi="Calibri" w:cs="Calibri"/>
+        </w:rPr>
+      </w:pPr>
+    </w:p>
+    <w:p>
+      <w:pPr>
+        <w:pStyle w:val="Heading3"/>
+        <w:numPr>
+          <w:ilvl w:val="0"/>
+          <w:numId w:val="4"/>
+        </w:numPr>
+        <w:pBdr>
+          <w:bottom w:val="single" w:sz="4" w:space="1" w:color="auto"/>
+        </w:pBdr>
+        <w:rPr>
+          <w:b/>
+          <w:bCs/>
+          <w:lang w:val="el-GR"/>
+        </w:rPr>
+      </w:pPr>
+      <w:r>
+        <w:rPr>
+          <w:b/>
+          <w:bCs/>
+        </w:rPr>
+        <w:t>Homepage</w:t>
+      </w:r>
+    </w:p>
+    <w:p>
+      <w:pPr>
+        <w:rPr>
+          <w:rFonts w:ascii="Calibri" w:hAnsi="Calibri" w:cs="Calibri"/>
+          <w:lang w:val="el-GR"/>
+        </w:rPr>
+      </w:pPr>
+      <w:r>
+        <w:rPr>
+          <w:rFonts w:ascii="Calibri" w:hAnsi="Calibri" w:cs="Calibri"/>
+          <w:lang w:val="el-GR"/>
+        </w:rPr>
+        <w:t>Στ</w:t>
+      </w:r>
+      <w:r>
+        <w:rPr>
+          <w:rFonts w:ascii="Calibri" w:hAnsi="Calibri" w:cs="Calibri"/>
+          <w:lang w:val="el-GR"/>
+        </w:rPr>
+        <w:t>ην</w:t>
+      </w:r>
+      <w:r>
+        <w:rPr>
+          <w:rFonts w:ascii="Calibri" w:hAnsi="Calibri" w:cs="Calibri"/>
+          <w:lang w:val="el-GR"/>
+        </w:rPr>
+        <w:t xml:space="preserve"> εικόν</w:t>
+      </w:r>
+      <w:r>
+        <w:rPr>
+          <w:rFonts w:ascii="Calibri" w:hAnsi="Calibri" w:cs="Calibri"/>
+          <w:lang w:val="el-GR"/>
+        </w:rPr>
+        <w:t>α</w:t>
+      </w:r>
+      <w:r>
+        <w:rPr>
+          <w:rFonts w:ascii="Calibri" w:hAnsi="Calibri" w:cs="Calibri"/>
+          <w:lang w:val="el-GR"/>
+        </w:rPr>
+        <w:t xml:space="preserve"> </w:t>
+      </w:r>
+      <w:r>
+        <w:rPr>
+          <w:rFonts w:ascii="Calibri" w:hAnsi="Calibri" w:cs="Calibri"/>
+          <w:lang w:val="el-GR"/>
+        </w:rPr>
+        <w:t>1</w:t>
+      </w:r>
+      <w:r>
+        <w:rPr>
+          <w:rFonts w:ascii="Calibri" w:hAnsi="Calibri" w:cs="Calibri"/>
+          <w:lang w:val="el-GR"/>
+        </w:rPr>
+        <w:t>3</w:t>
+      </w:r>
+      <w:r>
+        <w:rPr>
+          <w:rFonts w:ascii="Calibri" w:hAnsi="Calibri" w:cs="Calibri"/>
+          <w:lang w:val="el-GR"/>
+        </w:rPr>
+        <w:t xml:space="preserve"> παρουσιάζουμε την οθόνη</w:t>
+      </w:r>
+      <w:r>
+        <w:rPr>
+          <w:rFonts w:ascii="Calibri" w:hAnsi="Calibri" w:cs="Calibri"/>
+          <w:lang w:val="el-GR"/>
+        </w:rPr>
+        <w:t xml:space="preserve"> </w:t>
+      </w:r>
+      <w:r>
+        <w:rPr>
+          <w:rFonts w:ascii="Calibri" w:hAnsi="Calibri" w:cs="Calibri"/>
+        </w:rPr>
+        <w:t>Homepage</w:t>
+      </w:r>
+      <w:r>
+        <w:rPr>
+          <w:rFonts w:ascii="Calibri" w:hAnsi="Calibri" w:cs="Calibri"/>
+          <w:lang w:val="el-GR"/>
+        </w:rPr>
+        <w:t xml:space="preserve">. </w:t>
+      </w:r>
+      <w:r>
+        <w:rPr>
+          <w:rFonts w:ascii="Calibri" w:hAnsi="Calibri" w:cs="Calibri"/>
+          <w:lang w:val="el-GR"/>
+        </w:rPr>
+        <w:t xml:space="preserve">Η σελίδα αυτή είναι </w:t>
+      </w:r>
+      <w:r>
+        <w:rPr>
+          <w:rFonts w:ascii="Calibri" w:hAnsi="Calibri" w:cs="Calibri"/>
+          <w:lang w:val="el-GR"/>
+        </w:rPr>
+        <w:t>η κεντρική σελίδα που βλέπει ο χρήστης όταν συνδέεται με επιτυχία στην εφαρμογή</w:t>
+      </w:r>
+      <w:r>
+        <w:rPr>
+          <w:rFonts w:ascii="Calibri" w:hAnsi="Calibri" w:cs="Calibri"/>
+          <w:lang w:val="el-GR"/>
+        </w:rPr>
+        <w:t>.</w:t>
+      </w:r>
+      <w:r>
+        <w:rPr>
+          <w:rFonts w:ascii="Calibri" w:hAnsi="Calibri" w:cs="Calibri"/>
+          <w:lang w:val="el-GR"/>
+        </w:rPr>
+        <w:t xml:space="preserve"> Στην παρούσα εκτέλεση έχουμε συνδεθεί με ρόλο </w:t>
+      </w:r>
+      <w:r>
+        <w:rPr>
+          <w:rFonts w:ascii="Calibri" w:hAnsi="Calibri" w:cs="Calibri"/>
+          <w:lang w:val="el-GR"/>
+        </w:rPr>
+        <w:t>“</w:t>
+      </w:r>
+      <w:r>
+        <w:rPr>
+          <w:rFonts w:ascii="Calibri" w:hAnsi="Calibri" w:cs="Calibri"/>
+        </w:rPr>
+        <w:t>Admin</w:t>
+      </w:r>
+      <w:r>
+        <w:rPr>
+          <w:rFonts w:ascii="Calibri" w:hAnsi="Calibri" w:cs="Calibri"/>
+          <w:lang w:val="el-GR"/>
+        </w:rPr>
+        <w:t xml:space="preserve">” </w:t>
+      </w:r>
+      <w:r>
+        <w:rPr>
+          <w:rFonts w:ascii="Calibri" w:hAnsi="Calibri" w:cs="Calibri"/>
+          <w:lang w:val="el-GR"/>
+        </w:rPr>
+        <w:t xml:space="preserve">οπότε εμφανίζονται και τα κουμπιά </w:t>
+      </w:r>
+      <w:r>
+        <w:rPr>
+          <w:rFonts w:ascii="Calibri" w:hAnsi="Calibri" w:cs="Calibri"/>
+          <w:lang w:val="el-GR"/>
+        </w:rPr>
+        <w:t>“</w:t>
+      </w:r>
+      <w:r>
+        <w:rPr>
+          <w:rFonts w:ascii="Calibri" w:hAnsi="Calibri" w:cs="Calibri"/>
+        </w:rPr>
+        <w:t>Admin</w:t>
+      </w:r>
+      <w:r>
+        <w:rPr>
+          <w:rFonts w:ascii="Calibri" w:hAnsi="Calibri" w:cs="Calibri"/>
+          <w:lang w:val="el-GR"/>
+        </w:rPr>
+        <w:t xml:space="preserve"> </w:t>
+      </w:r>
+      <w:r>
+        <w:rPr>
+          <w:rFonts w:ascii="Calibri" w:hAnsi="Calibri" w:cs="Calibri"/>
+        </w:rPr>
+        <w:t>Panel</w:t>
+      </w:r>
+      <w:r>
+        <w:rPr>
+          <w:rFonts w:ascii="Calibri" w:hAnsi="Calibri" w:cs="Calibri"/>
+          <w:lang w:val="el-GR"/>
+        </w:rPr>
+        <w:t xml:space="preserve">” </w:t>
+      </w:r>
+      <w:r>
+        <w:rPr>
+          <w:rFonts w:ascii="Calibri" w:hAnsi="Calibri" w:cs="Calibri"/>
+          <w:lang w:val="el-GR"/>
+        </w:rPr>
+        <w:t xml:space="preserve">και </w:t>
+      </w:r>
+      <w:r>
+        <w:rPr>
+          <w:rFonts w:ascii="Calibri" w:hAnsi="Calibri" w:cs="Calibri"/>
+          <w:lang w:val="el-GR"/>
+        </w:rPr>
+        <w:t>“</w:t>
+      </w:r>
+      <w:r>
+        <w:rPr>
+          <w:rFonts w:ascii="Calibri" w:hAnsi="Calibri" w:cs="Calibri"/>
+        </w:rPr>
+        <w:t>Admin</w:t>
+      </w:r>
+      <w:r>
+        <w:rPr>
+          <w:rFonts w:ascii="Calibri" w:hAnsi="Calibri" w:cs="Calibri"/>
+          <w:lang w:val="el-GR"/>
+        </w:rPr>
+        <w:t>”.</w:t>
+      </w:r>
+      <w:r>
+        <w:rPr>
+          <w:rFonts w:ascii="Calibri" w:hAnsi="Calibri" w:cs="Calibri"/>
+          <w:lang w:val="el-GR"/>
+        </w:rPr>
+        <w:t xml:space="preserve">  </w:t>
+      </w:r>
+    </w:p>
+    <w:p>
+      <w:pPr>
+        <w:rPr>
+          <w:rFonts w:ascii="Calibri" w:hAnsi="Calibri" w:cs="Calibri"/>
+          <w:lang w:val="el-GR"/>
+        </w:rPr>
+      </w:pPr>
+    </w:p>
+    <w:p>
+      <w:pPr>
+        <w:keepNext/>
+        <w:jc w:val="center"/>
+      </w:pPr>
+      <w:r>
+        <w:rPr>
+          <w:rFonts w:ascii="Calibri" w:hAnsi="Calibri" w:cs="Calibri"/>
+        </w:rPr>
+        <w:drawing>
+          <wp:inline distT="0" distB="0" distL="0" distR="0" wp14:anchorId="34C6762E" wp14:editId="3F40C0E1">
+            <wp:extent cx="5943600" cy="3810635"/>
+            <wp:effectExtent l="0" t="0" r="0" b="0"/>
+            <wp:docPr id="2035291348" name="Picture 1"/>
+            <wp:cNvGraphicFramePr>
+              <a:graphicFrameLocks xmlns:a="http://schemas.openxmlformats.org/drawingml/2006/main" noChangeAspect="1"/>
+            </wp:cNvGraphicFramePr>
+            <a:graphic xmlns:a="http://schemas.openxmlformats.org/drawingml/2006/main">
+              <a:graphicData uri="http://schemas.openxmlformats.org/drawingml/2006/picture">
+                <pic:pic xmlns:pic="http://schemas.openxmlformats.org/drawingml/2006/picture">
+                  <pic:nvPicPr>
+                    <pic:cNvPr id="2035291348" name=""/>
+                    <pic:cNvPicPr/>
+                  </pic:nvPicPr>
+                  <pic:blipFill>
+                    <a:blip r:embed="rId33"/>
+                    <a:stretch>
+                      <a:fillRect/>
+                    </a:stretch>
+                  </pic:blipFill>
+                  <pic:spPr>
+                    <a:xfrm>
+                      <a:off x="0" y="0"/>
+                      <a:ext cx="5943600" cy="3810635"/>
+                    </a:xfrm>
+                    <a:prstGeom prst="rect">
+                      <a:avLst/>
+                    </a:prstGeom>
+                  </pic:spPr>
+                </pic:pic>
+              </a:graphicData>
+            </a:graphic>
+          </wp:inline>
+        </w:drawing>
+      </w:r>
+    </w:p>
+    <w:p>
+      <w:pPr>
+        <w:pStyle w:val="Caption"/>
+        <w:jc w:val="center"/>
+        <w:rPr>
+          <w:rFonts w:ascii="Calibri" w:hAnsi="Calibri" w:cs="Calibri"/>
+        </w:rPr>
+      </w:pPr>
+      <w:r>
+        <w:rPr>
+          <w:lang w:val="el-GR"/>
+        </w:rPr>
+        <w:t>Εικόνα</w:t>
+      </w:r>
+      <w:r>
+        <w:t xml:space="preserve"> 13: </w:t>
+      </w:r>
+      <w:r>
+        <w:rPr>
+          <w:lang w:val="el-GR"/>
+        </w:rPr>
+        <w:t xml:space="preserve">Τελική οθόνη </w:t>
+      </w:r>
+      <w:r>
+        <w:t>Homepage</w:t>
+      </w:r>
+    </w:p>
+    <w:p>
+      <w:pPr>
+        <w:rPr>
+          <w:rFonts w:ascii="Calibri" w:hAnsi="Calibri" w:cs="Calibri"/>
+          <w:lang w:val="el-GR"/>
+        </w:rPr>
+      </w:pPr>
+    </w:p>
+    <w:p>
+      <w:pPr>
+        <w:rPr>
+          <w:rFonts w:ascii="Calibri" w:hAnsi="Calibri" w:cs="Calibri"/>
+          <w:lang w:val="el-GR"/>
+        </w:rPr>
+      </w:pPr>
+    </w:p>
+    <w:p>
+      <w:pPr>
+        <w:rPr>
+          <w:rFonts w:ascii="Calibri" w:hAnsi="Calibri" w:cs="Calibri"/>
+          <w:lang w:val="el-GR"/>
+        </w:rPr>
+      </w:pPr>
+    </w:p>
+    <w:p>
+      <w:pPr>
+        <w:rPr>
+          <w:rFonts w:ascii="Calibri" w:hAnsi="Calibri" w:cs="Calibri"/>
+          <w:lang w:val="el-GR"/>
+        </w:rPr>
+      </w:pPr>
+    </w:p>
+    <w:p>
+      <w:pPr>
+        <w:rPr>
+          <w:rFonts w:ascii="Calibri" w:hAnsi="Calibri" w:cs="Calibri"/>
+          <w:lang w:val="el-GR"/>
+        </w:rPr>
+      </w:pPr>
+    </w:p>
+    <w:p>
+      <w:pPr>
+        <w:rPr>
+          <w:rFonts w:ascii="Calibri" w:hAnsi="Calibri" w:cs="Calibri"/>
+          <w:lang w:val="el-GR"/>
+        </w:rPr>
+      </w:pPr>
+    </w:p>
+    <w:p>
+      <w:pPr>
+        <w:rPr>
+          <w:rFonts w:ascii="Calibri" w:hAnsi="Calibri" w:cs="Calibri"/>
+          <w:lang w:val="el-GR"/>
         </w:rPr>
       </w:pPr>
     </w:p>
@@ -8882,7 +9621,7 @@
         </w:rPr>
         <w:t xml:space="preserve"> της εφαρμογής δημιουργήθηκε μέσω του </w:t>
       </w:r>
-      <w:hyperlink r:id="rId32" w:history="1">
+      <w:hyperlink r:id="rId34" w:history="1">
         <w:proofErr w:type="spellStart"/>
         <w:r>
           <w:rPr>
@@ -8939,7 +9678,7 @@
         </w:rPr>
         <w:t xml:space="preserve"> υλοποιήθηκαν με τη χρήση του εργαλείου </w:t>
       </w:r>
-      <w:hyperlink r:id="rId33" w:history="1">
+      <w:hyperlink r:id="rId35" w:history="1">
         <w:proofErr w:type="spellStart"/>
         <w:r>
           <w:rPr>
@@ -9016,8 +9755,8 @@
       </w:pPr>
     </w:p>
     <w:sectPr>
-      <w:headerReference w:type="default" r:id="rId34"/>
-      <w:footerReference w:type="default" r:id="rId35"/>
+      <w:headerReference w:type="default" r:id="rId36"/>
+      <w:footerReference w:type="default" r:id="rId37"/>
       <w:pgSz w:w="12240" w:h="15840"/>
       <w:pgMar w:top="1440" w:right="1440" w:bottom="1440" w:left="1440" w:header="720" w:footer="720" w:gutter="0"/>
       <w:cols w:space="720"/>

</xml_diff>